<commit_message>
Squashed commit of the following:
commit f2943a6bc33a96f4b66774e600ca332be452f052
Author: kmj710100-lang <kmj710100@gmail.com>
Date:   Fri Oct 23 15:18:44 2026 +0900

    10/23 기획서 수정

    Zomso_Parrying_기획서.docx
    1.1 기획 의도 내용 수정 (적 오브젝트의 패링 범주 설명)

    SBSAcademy_Team01_기획서.docx
    1 기획의도 내용 전면 수정.
    3.5 스테이지 전개 시스템 목차 제거.

commit b3e2969d8b5b59026a7daef9c29ef3559179c3c8
Author: kmj710100-lang <kmj710100@gmail.com>
Date:   Fri Oct 23 01:57:52 2026 +0900

    10/23_0 기획서 및 UI 배치 수정 및 작성

    SBSAcademy_Team01_기획서.docx
    3.3.2 약공격 스킬 내용 수정 .(쿨타임 시스템 제거)
    4.2 몬스터 HPbar 협의 필요로 내용 전환.
    4.3 보스 그로기 타임 관련 내용 추가.

    씬 별 UI.pptx
    플레이 씬 UI 배치 수정 (좌측 4버튼 / 우측 레버 및 1버튼)

    Zomso_Parrying_기획서.docx
    패링 관련 세부 기획서 작성
</commit_message>
<xml_diff>
--- a/SBSAcademy_Team01_기획서.docx
+++ b/SBSAcademy_Team01_기획서.docx
@@ -1,6 +1,6 @@
 
 <file path=word/document.xml><?xml version="1.0" encoding="utf-8"?>
-<w:document xmlns:wpc="http://schemas.microsoft.com/office/word/2010/wordprocessingCanvas" xmlns:cx="http://schemas.microsoft.com/office/drawing/2014/chartex" xmlns:cx1="http://schemas.microsoft.com/office/drawing/2015/9/8/chartex" xmlns:cx2="http://schemas.microsoft.com/office/drawing/2015/10/21/chartex" xmlns:cx3="http://schemas.microsoft.com/office/drawing/2016/5/9/chartex" xmlns:cx4="http://schemas.microsoft.com/office/drawing/2016/5/10/chartex" xmlns:cx5="http://schemas.microsoft.com/office/drawing/2016/5/11/chartex" xmlns:cx6="http://schemas.microsoft.com/office/drawing/2016/5/12/chartex" xmlns:cx7="http://schemas.microsoft.com/office/drawing/2016/5/13/chartex" xmlns:cx8="http://schemas.microsoft.com/office/drawing/2016/5/14/chartex" xmlns:mc="http://schemas.openxmlformats.org/markup-compatibility/2006" xmlns:aink="http://schemas.microsoft.com/office/drawing/2016/ink" xmlns:am3d="http://schemas.microsoft.com/office/drawing/2017/model3d" xmlns:o="urn:schemas-microsoft-com:office:office" xmlns:oel="http://schemas.microsoft.com/office/2019/extlst" xmlns:r="http://schemas.openxmlformats.org/officeDocument/2006/relationships" xmlns:m="http://schemas.openxmlformats.org/officeDocument/2006/math" xmlns:v="urn:schemas-microsoft-com:vml" xmlns:wp14="http://schemas.microsoft.com/office/word/2010/wordprocessingDrawing" xmlns:wp="http://schemas.openxmlformats.org/drawingml/2006/wordprocessingDrawing" xmlns:w10="urn:schemas-microsoft-com:office:word" xmlns:w="http://schemas.openxmlformats.org/wordprocessingml/2006/main" xmlns:w14="http://schemas.microsoft.com/office/word/2010/wordml" xmlns:w15="http://schemas.microsoft.com/office/word/2012/wordml" xmlns:w16cei="http://schemas.microsoft.com/office/word/2026/wordml/cei" xmlns:w16cex="http://schemas.microsoft.com/office/word/2018/wordml/cex" xmlns:w16cid="http://schemas.microsoft.com/office/word/2016/wordml/cid" xmlns:w16="http://schemas.microsoft.com/office/word/2018/wordml" xmlns:w16du="http://schemas.microsoft.com/office/word/2023/wordml/word16du" xmlns:w16sdtdh="http://schemas.microsoft.com/office/word/2020/wordml/sdtdatahash" xmlns:w16sdtfl="http://schemas.microsoft.com/office/word/2024/wordml/sdtformatlock" xmlns:w16se="http://schemas.microsoft.com/office/word/2015/wordml/symex" xmlns:wpg="http://schemas.microsoft.com/office/word/2010/wordprocessingGroup" xmlns:wpi="http://schemas.microsoft.com/office/word/2010/wordprocessingInk" xmlns:wne="http://schemas.microsoft.com/office/word/2006/wordml" xmlns:wps="http://schemas.microsoft.com/office/word/2010/wordprocessingShape" mc:Ignorable="w14 w15 w16se w16cid w16 w16cex w16sdtdh w16sdtfl w16du wp14">
+<w:document xmlns:wpc="http://schemas.microsoft.com/office/word/2010/wordprocessingCanvas" xmlns:cx="http://schemas.microsoft.com/office/drawing/2014/chartex" xmlns:cx1="http://schemas.microsoft.com/office/drawing/2015/9/8/chartex" xmlns:cx2="http://schemas.microsoft.com/office/drawing/2015/10/21/chartex" xmlns:cx3="http://schemas.microsoft.com/office/drawing/2016/5/9/chartex" xmlns:cx4="http://schemas.microsoft.com/office/drawing/2016/5/10/chartex" xmlns:cx5="http://schemas.microsoft.com/office/drawing/2016/5/11/chartex" xmlns:cx6="http://schemas.microsoft.com/office/drawing/2016/5/12/chartex" xmlns:cx7="http://schemas.microsoft.com/office/drawing/2016/5/13/chartex" xmlns:cx8="http://schemas.microsoft.com/office/drawing/2016/5/14/chartex" xmlns:mc="http://schemas.openxmlformats.org/markup-compatibility/2006" xmlns:aink="http://schemas.microsoft.com/office/drawing/2016/ink" xmlns:am3d="http://schemas.microsoft.com/office/drawing/2017/model3d" xmlns:o="urn:schemas-microsoft-com:office:office" xmlns:oel="http://schemas.microsoft.com/office/2019/extlst" xmlns:r="http://schemas.openxmlformats.org/officeDocument/2006/relationships" xmlns:m="http://schemas.openxmlformats.org/officeDocument/2006/math" xmlns:v="urn:schemas-microsoft-com:vml" xmlns:wp14="http://schemas.microsoft.com/office/word/2010/wordprocessingDrawing" xmlns:wp="http://schemas.openxmlformats.org/drawingml/2006/wordprocessingDrawing" xmlns:w10="urn:schemas-microsoft-com:office:word" xmlns:w="http://schemas.openxmlformats.org/wordprocessingml/2006/main" xmlns:w14="http://schemas.microsoft.com/office/word/2010/wordml" xmlns:w15="http://schemas.microsoft.com/office/word/2012/wordml" xmlns:w16cex="http://schemas.microsoft.com/office/word/2018/wordml/cex" xmlns:w16cid="http://schemas.microsoft.com/office/word/2016/wordml/cid" xmlns:w16="http://schemas.microsoft.com/office/word/2018/wordml" xmlns:w16du="http://schemas.microsoft.com/office/word/2023/wordml/word16du" xmlns:w16sdtdh="http://schemas.microsoft.com/office/word/2020/wordml/sdtdatahash" xmlns:w16sdtfl="http://schemas.microsoft.com/office/word/2024/wordml/sdtformatlock" xmlns:w16se="http://schemas.microsoft.com/office/word/2015/wordml/symex" xmlns:wpg="http://schemas.microsoft.com/office/word/2010/wordprocessingGroup" xmlns:wpi="http://schemas.microsoft.com/office/word/2010/wordprocessingInk" xmlns:wne="http://schemas.microsoft.com/office/word/2006/wordml" xmlns:wps="http://schemas.microsoft.com/office/word/2010/wordprocessingShape" mc:Ignorable="w14 w15 w16se w16cid w16 w16cex w16sdtdh w16sdtfl w16du wp14">
   <w:body>
     <w:p>
       <w:pPr>
@@ -920,7 +920,16 @@
           <w:p>
             <w:pPr>
               <w:jc w:val="center"/>
+              <w:rPr>
+                <w:rFonts w:eastAsiaTheme="minorEastAsia"/>
+              </w:rPr>
             </w:pPr>
+            <w:r>
+              <w:rPr>
+                <w:rFonts w:eastAsiaTheme="minorEastAsia" w:hint="eastAsia"/>
+              </w:rPr>
+              <w:t>26.10.22</w:t>
+            </w:r>
           </w:p>
         </w:tc>
         <w:tc>
@@ -936,6 +945,13 @@
                 <w:color w:val="000000"/>
               </w:rPr>
             </w:pPr>
+            <w:r>
+              <w:rPr>
+                <w:rFonts w:ascii="맑은 고딕" w:eastAsia="맑은 고딕" w:hAnsi="맑은 고딕" w:cs="맑은 고딕" w:hint="eastAsia"/>
+                <w:color w:val="000000"/>
+              </w:rPr>
+              <w:t>구동현</w:t>
+            </w:r>
           </w:p>
         </w:tc>
         <w:tc>
@@ -948,6 +964,526 @@
               <w:jc w:val="left"/>
               <w:rPr>
                 <w:rFonts w:ascii="맑은 고딕" w:eastAsia="맑은 고딕" w:hAnsi="맑은 고딕" w:cs="맑은 고딕"/>
+                <w:color w:val="000000"/>
+              </w:rPr>
+            </w:pPr>
+            <w:r>
+              <w:rPr>
+                <w:rFonts w:ascii="맑은 고딕" w:eastAsia="맑은 고딕" w:hAnsi="맑은 고딕" w:cs="맑은 고딕" w:hint="eastAsia"/>
+                <w:color w:val="000000"/>
+              </w:rPr>
+              <w:t xml:space="preserve">3.3.2 </w:t>
+            </w:r>
+            <w:r>
+              <w:rPr>
+                <w:rFonts w:ascii="맑은 고딕" w:eastAsia="맑은 고딕" w:hAnsi="맑은 고딕" w:cs="맑은 고딕"/>
+                <w:color w:val="000000"/>
+              </w:rPr>
+              <w:fldChar w:fldCharType="begin"/>
+            </w:r>
+            <w:r>
+              <w:rPr>
+                <w:rFonts w:ascii="맑은 고딕" w:eastAsia="맑은 고딕" w:hAnsi="맑은 고딕" w:cs="맑은 고딕"/>
+                <w:color w:val="000000"/>
+              </w:rPr>
+              <w:instrText xml:space="preserve"> </w:instrText>
+            </w:r>
+            <w:r>
+              <w:rPr>
+                <w:rFonts w:ascii="맑은 고딕" w:eastAsia="맑은 고딕" w:hAnsi="맑은 고딕" w:cs="맑은 고딕" w:hint="eastAsia"/>
+                <w:color w:val="000000"/>
+              </w:rPr>
+              <w:instrText>REF _Ref243612709 \r \h</w:instrText>
+            </w:r>
+            <w:r>
+              <w:rPr>
+                <w:rFonts w:ascii="맑은 고딕" w:eastAsia="맑은 고딕" w:hAnsi="맑은 고딕" w:cs="맑은 고딕"/>
+                <w:color w:val="000000"/>
+              </w:rPr>
+              <w:instrText xml:space="preserve"> </w:instrText>
+            </w:r>
+            <w:r>
+              <w:rPr>
+                <w:rFonts w:ascii="맑은 고딕" w:eastAsia="맑은 고딕" w:hAnsi="맑은 고딕" w:cs="맑은 고딕"/>
+                <w:color w:val="000000"/>
+              </w:rPr>
+            </w:r>
+            <w:r>
+              <w:rPr>
+                <w:rFonts w:ascii="맑은 고딕" w:eastAsia="맑은 고딕" w:hAnsi="맑은 고딕" w:cs="맑은 고딕"/>
+                <w:color w:val="000000"/>
+              </w:rPr>
+              <w:fldChar w:fldCharType="separate"/>
+            </w:r>
+            <w:r>
+              <w:rPr>
+                <w:rFonts w:ascii="맑은 고딕" w:eastAsia="맑은 고딕" w:hAnsi="맑은 고딕" w:cs="맑은 고딕"/>
+                <w:color w:val="000000"/>
+              </w:rPr>
+              <w:fldChar w:fldCharType="end"/>
+            </w:r>
+            <w:r>
+              <w:rPr>
+                <w:rFonts w:ascii="맑은 고딕" w:eastAsia="맑은 고딕" w:hAnsi="맑은 고딕" w:cs="맑은 고딕"/>
+                <w:color w:val="000000"/>
+              </w:rPr>
+              <w:fldChar w:fldCharType="begin"/>
+            </w:r>
+            <w:r>
+              <w:rPr>
+                <w:rFonts w:ascii="맑은 고딕" w:eastAsia="맑은 고딕" w:hAnsi="맑은 고딕" w:cs="맑은 고딕"/>
+                <w:color w:val="000000"/>
+              </w:rPr>
+              <w:instrText xml:space="preserve"> REF _Ref243612712 \h </w:instrText>
+            </w:r>
+            <w:r>
+              <w:rPr>
+                <w:rFonts w:ascii="맑은 고딕" w:eastAsia="맑은 고딕" w:hAnsi="맑은 고딕" w:cs="맑은 고딕"/>
+                <w:color w:val="000000"/>
+              </w:rPr>
+            </w:r>
+            <w:r>
+              <w:rPr>
+                <w:rFonts w:ascii="맑은 고딕" w:eastAsia="맑은 고딕" w:hAnsi="맑은 고딕" w:cs="맑은 고딕"/>
+                <w:color w:val="000000"/>
+              </w:rPr>
+              <w:fldChar w:fldCharType="separate"/>
+            </w:r>
+            <w:proofErr w:type="spellStart"/>
+            <w:r>
+              <w:rPr>
+                <w:rFonts w:ascii="맑은 고딕" w:eastAsia="맑은 고딕" w:hAnsi="맑은 고딕" w:cs="맑은 고딕" w:hint="eastAsia"/>
+              </w:rPr>
+              <w:t>약공격</w:t>
+            </w:r>
+            <w:proofErr w:type="spellEnd"/>
+            <w:r>
+              <w:rPr>
+                <w:rFonts w:hint="eastAsia"/>
+              </w:rPr>
+              <w:t xml:space="preserve"> </w:t>
+            </w:r>
+            <w:r>
+              <w:rPr>
+                <w:rFonts w:ascii="맑은 고딕" w:eastAsia="맑은 고딕" w:hAnsi="맑은 고딕" w:cs="맑은 고딕" w:hint="eastAsia"/>
+              </w:rPr>
+              <w:t>스킬</w:t>
+            </w:r>
+            <w:r>
+              <w:rPr>
+                <w:rFonts w:ascii="맑은 고딕" w:eastAsia="맑은 고딕" w:hAnsi="맑은 고딕" w:cs="맑은 고딕"/>
+                <w:color w:val="000000"/>
+              </w:rPr>
+              <w:fldChar w:fldCharType="end"/>
+            </w:r>
+            <w:r>
+              <w:rPr>
+                <w:rFonts w:ascii="맑은 고딕" w:eastAsia="맑은 고딕" w:hAnsi="맑은 고딕" w:cs="맑은 고딕" w:hint="eastAsia"/>
+                <w:color w:val="000000"/>
+              </w:rPr>
+              <w:t xml:space="preserve"> 내용 수정.</w:t>
+            </w:r>
+            <w:r>
+              <w:rPr>
+                <w:rFonts w:ascii="맑은 고딕" w:eastAsia="맑은 고딕" w:hAnsi="맑은 고딕" w:cs="맑은 고딕" w:hint="eastAsia"/>
+                <w:color w:val="000000"/>
+              </w:rPr>
+              <w:t xml:space="preserve"> </w:t>
+            </w:r>
+            <w:r>
+              <w:rPr>
+                <w:rFonts w:ascii="맑은 고딕" w:eastAsia="맑은 고딕" w:hAnsi="맑은 고딕" w:cs="맑은 고딕" w:hint="eastAsia"/>
+                <w:color w:val="000000"/>
+              </w:rPr>
+              <w:t>(</w:t>
+            </w:r>
+            <w:proofErr w:type="spellStart"/>
+            <w:r>
+              <w:rPr>
+                <w:rFonts w:ascii="맑은 고딕" w:eastAsia="맑은 고딕" w:hAnsi="맑은 고딕" w:cs="맑은 고딕" w:hint="eastAsia"/>
+                <w:color w:val="000000"/>
+              </w:rPr>
+              <w:t>쿨타임</w:t>
+            </w:r>
+            <w:proofErr w:type="spellEnd"/>
+            <w:r>
+              <w:rPr>
+                <w:rFonts w:ascii="맑은 고딕" w:eastAsia="맑은 고딕" w:hAnsi="맑은 고딕" w:cs="맑은 고딕" w:hint="eastAsia"/>
+                <w:color w:val="000000"/>
+              </w:rPr>
+              <w:t xml:space="preserve"> 시스템 제거)</w:t>
+            </w:r>
+          </w:p>
+          <w:p>
+            <w:pPr>
+              <w:jc w:val="left"/>
+              <w:rPr>
+                <w:rFonts w:ascii="맑은 고딕" w:eastAsia="맑은 고딕" w:hAnsi="맑은 고딕" w:cs="맑은 고딕"/>
+                <w:color w:val="000000"/>
+              </w:rPr>
+            </w:pPr>
+            <w:r>
+              <w:rPr>
+                <w:rFonts w:ascii="맑은 고딕" w:eastAsia="맑은 고딕" w:hAnsi="맑은 고딕" w:cs="맑은 고딕" w:hint="eastAsia"/>
+                <w:color w:val="000000"/>
+              </w:rPr>
+              <w:t xml:space="preserve">4.2 </w:t>
+            </w:r>
+            <w:r>
+              <w:rPr>
+                <w:rFonts w:ascii="맑은 고딕" w:eastAsia="맑은 고딕" w:hAnsi="맑은 고딕" w:cs="맑은 고딕"/>
+                <w:color w:val="000000"/>
+              </w:rPr>
+              <w:fldChar w:fldCharType="begin"/>
+            </w:r>
+            <w:r>
+              <w:rPr>
+                <w:rFonts w:ascii="맑은 고딕" w:eastAsia="맑은 고딕" w:hAnsi="맑은 고딕" w:cs="맑은 고딕"/>
+                <w:color w:val="000000"/>
+              </w:rPr>
+              <w:instrText xml:space="preserve"> </w:instrText>
+            </w:r>
+            <w:r>
+              <w:rPr>
+                <w:rFonts w:ascii="맑은 고딕" w:eastAsia="맑은 고딕" w:hAnsi="맑은 고딕" w:cs="맑은 고딕" w:hint="eastAsia"/>
+                <w:color w:val="000000"/>
+              </w:rPr>
+              <w:instrText>REF _Ref243612752 \h</w:instrText>
+            </w:r>
+            <w:r>
+              <w:rPr>
+                <w:rFonts w:ascii="맑은 고딕" w:eastAsia="맑은 고딕" w:hAnsi="맑은 고딕" w:cs="맑은 고딕"/>
+                <w:color w:val="000000"/>
+              </w:rPr>
+              <w:instrText xml:space="preserve"> </w:instrText>
+            </w:r>
+            <w:r>
+              <w:rPr>
+                <w:rFonts w:ascii="맑은 고딕" w:eastAsia="맑은 고딕" w:hAnsi="맑은 고딕" w:cs="맑은 고딕"/>
+                <w:color w:val="000000"/>
+              </w:rPr>
+            </w:r>
+            <w:r>
+              <w:rPr>
+                <w:rFonts w:ascii="맑은 고딕" w:eastAsia="맑은 고딕" w:hAnsi="맑은 고딕" w:cs="맑은 고딕"/>
+                <w:color w:val="000000"/>
+              </w:rPr>
+              <w:fldChar w:fldCharType="separate"/>
+            </w:r>
+            <w:r>
+              <w:rPr>
+                <w:rFonts w:ascii="맑은 고딕" w:eastAsia="맑은 고딕" w:hAnsi="맑은 고딕" w:cs="맑은 고딕" w:hint="eastAsia"/>
+              </w:rPr>
+              <w:t>몬스터</w:t>
+            </w:r>
+            <w:r>
+              <w:rPr>
+                <w:rFonts w:ascii="맑은 고딕" w:eastAsia="맑은 고딕" w:hAnsi="맑은 고딕" w:cs="맑은 고딕"/>
+                <w:color w:val="000000"/>
+              </w:rPr>
+              <w:fldChar w:fldCharType="end"/>
+            </w:r>
+            <w:r>
+              <w:rPr>
+                <w:rFonts w:ascii="맑은 고딕" w:eastAsia="맑은 고딕" w:hAnsi="맑은 고딕" w:cs="맑은 고딕" w:hint="eastAsia"/>
+                <w:color w:val="000000"/>
+              </w:rPr>
+              <w:t xml:space="preserve"> </w:t>
+            </w:r>
+            <w:proofErr w:type="spellStart"/>
+            <w:r>
+              <w:rPr>
+                <w:rFonts w:ascii="맑은 고딕" w:eastAsia="맑은 고딕" w:hAnsi="맑은 고딕" w:cs="맑은 고딕" w:hint="eastAsia"/>
+                <w:color w:val="000000"/>
+              </w:rPr>
+              <w:t>HPbar</w:t>
+            </w:r>
+            <w:proofErr w:type="spellEnd"/>
+            <w:r>
+              <w:rPr>
+                <w:rFonts w:ascii="맑은 고딕" w:eastAsia="맑은 고딕" w:hAnsi="맑은 고딕" w:cs="맑은 고딕" w:hint="eastAsia"/>
+                <w:color w:val="000000"/>
+              </w:rPr>
+              <w:t xml:space="preserve"> 협의 필요로 내용 전환.</w:t>
+            </w:r>
+          </w:p>
+          <w:p>
+            <w:pPr>
+              <w:jc w:val="left"/>
+              <w:rPr>
+                <w:rFonts w:ascii="맑은 고딕" w:eastAsia="맑은 고딕" w:hAnsi="맑은 고딕" w:cs="맑은 고딕"/>
+                <w:color w:val="000000"/>
+              </w:rPr>
+            </w:pPr>
+            <w:r>
+              <w:rPr>
+                <w:rFonts w:ascii="맑은 고딕" w:eastAsia="맑은 고딕" w:hAnsi="맑은 고딕" w:cs="맑은 고딕" w:hint="eastAsia"/>
+                <w:color w:val="000000"/>
+              </w:rPr>
+              <w:t xml:space="preserve">4.3 </w:t>
+            </w:r>
+            <w:r>
+              <w:rPr>
+                <w:rFonts w:ascii="맑은 고딕" w:eastAsia="맑은 고딕" w:hAnsi="맑은 고딕" w:cs="맑은 고딕"/>
+                <w:color w:val="000000"/>
+              </w:rPr>
+              <w:fldChar w:fldCharType="begin"/>
+            </w:r>
+            <w:r>
+              <w:rPr>
+                <w:rFonts w:ascii="맑은 고딕" w:eastAsia="맑은 고딕" w:hAnsi="맑은 고딕" w:cs="맑은 고딕"/>
+                <w:color w:val="000000"/>
+              </w:rPr>
+              <w:instrText xml:space="preserve"> </w:instrText>
+            </w:r>
+            <w:r>
+              <w:rPr>
+                <w:rFonts w:ascii="맑은 고딕" w:eastAsia="맑은 고딕" w:hAnsi="맑은 고딕" w:cs="맑은 고딕" w:hint="eastAsia"/>
+                <w:color w:val="000000"/>
+              </w:rPr>
+              <w:instrText>REF _Ref243612776 \h</w:instrText>
+            </w:r>
+            <w:r>
+              <w:rPr>
+                <w:rFonts w:ascii="맑은 고딕" w:eastAsia="맑은 고딕" w:hAnsi="맑은 고딕" w:cs="맑은 고딕"/>
+                <w:color w:val="000000"/>
+              </w:rPr>
+              <w:instrText xml:space="preserve"> </w:instrText>
+            </w:r>
+            <w:r>
+              <w:rPr>
+                <w:rFonts w:ascii="맑은 고딕" w:eastAsia="맑은 고딕" w:hAnsi="맑은 고딕" w:cs="맑은 고딕"/>
+                <w:color w:val="000000"/>
+              </w:rPr>
+            </w:r>
+            <w:r>
+              <w:rPr>
+                <w:rFonts w:ascii="맑은 고딕" w:eastAsia="맑은 고딕" w:hAnsi="맑은 고딕" w:cs="맑은 고딕"/>
+                <w:color w:val="000000"/>
+              </w:rPr>
+              <w:fldChar w:fldCharType="separate"/>
+            </w:r>
+            <w:r>
+              <w:rPr>
+                <w:rFonts w:ascii="맑은 고딕" w:eastAsia="맑은 고딕" w:hAnsi="맑은 고딕" w:cs="맑은 고딕" w:hint="eastAsia"/>
+              </w:rPr>
+              <w:t>보스</w:t>
+            </w:r>
+            <w:r>
+              <w:rPr>
+                <w:rFonts w:ascii="맑은 고딕" w:eastAsia="맑은 고딕" w:hAnsi="맑은 고딕" w:cs="맑은 고딕"/>
+                <w:color w:val="000000"/>
+              </w:rPr>
+              <w:fldChar w:fldCharType="end"/>
+            </w:r>
+            <w:r>
+              <w:rPr>
+                <w:rFonts w:ascii="맑은 고딕" w:eastAsia="맑은 고딕" w:hAnsi="맑은 고딕" w:cs="맑은 고딕" w:hint="eastAsia"/>
+                <w:color w:val="000000"/>
+              </w:rPr>
+              <w:t xml:space="preserve"> 그로기 타임 관련 내용 추가.</w:t>
+            </w:r>
+          </w:p>
+        </w:tc>
+      </w:tr>
+      <w:tr>
+        <w:trPr>
+          <w:trHeight w:val="277"/>
+          <w:jc w:val="center"/>
+        </w:trPr>
+        <w:tc>
+          <w:tcPr>
+            <w:tcW w:w="1271" w:type="dxa"/>
+            <w:vAlign w:val="center"/>
+          </w:tcPr>
+          <w:p>
+            <w:pPr>
+              <w:jc w:val="center"/>
+              <w:rPr>
+                <w:rFonts w:eastAsiaTheme="minorEastAsia"/>
+              </w:rPr>
+            </w:pPr>
+            <w:r>
+              <w:rPr>
+                <w:rFonts w:eastAsiaTheme="minorEastAsia" w:hint="eastAsia"/>
+              </w:rPr>
+              <w:t>26.10.23.</w:t>
+            </w:r>
+          </w:p>
+        </w:tc>
+        <w:tc>
+          <w:tcPr>
+            <w:tcW w:w="880" w:type="dxa"/>
+            <w:vAlign w:val="center"/>
+          </w:tcPr>
+          <w:p>
+            <w:pPr>
+              <w:jc w:val="center"/>
+              <w:rPr>
+                <w:rFonts w:ascii="맑은 고딕" w:eastAsia="맑은 고딕" w:hAnsi="맑은 고딕" w:cs="맑은 고딕"/>
+                <w:color w:val="000000"/>
+              </w:rPr>
+            </w:pPr>
+            <w:r>
+              <w:rPr>
+                <w:rFonts w:ascii="맑은 고딕" w:eastAsia="맑은 고딕" w:hAnsi="맑은 고딕" w:cs="맑은 고딕" w:hint="eastAsia"/>
+                <w:color w:val="000000"/>
+              </w:rPr>
+              <w:t>구동현</w:t>
+            </w:r>
+          </w:p>
+        </w:tc>
+        <w:tc>
+          <w:tcPr>
+            <w:tcW w:w="7229" w:type="dxa"/>
+            <w:vAlign w:val="center"/>
+          </w:tcPr>
+          <w:p>
+            <w:pPr>
+              <w:jc w:val="left"/>
+              <w:rPr>
+                <w:rFonts w:ascii="맑은 고딕" w:eastAsia="맑은 고딕" w:hAnsi="맑은 고딕" w:cs="맑은 고딕"/>
+                <w:color w:val="000000"/>
+              </w:rPr>
+            </w:pPr>
+            <w:r>
+              <w:rPr>
+                <w:rFonts w:ascii="맑은 고딕" w:eastAsia="맑은 고딕" w:hAnsi="맑은 고딕" w:cs="맑은 고딕"/>
+                <w:color w:val="000000"/>
+              </w:rPr>
+              <w:fldChar w:fldCharType="begin"/>
+            </w:r>
+            <w:r>
+              <w:rPr>
+                <w:rFonts w:ascii="맑은 고딕" w:eastAsia="맑은 고딕" w:hAnsi="맑은 고딕" w:cs="맑은 고딕"/>
+                <w:color w:val="000000"/>
+              </w:rPr>
+              <w:instrText xml:space="preserve"> REF _Ref243642924 \w \h </w:instrText>
+            </w:r>
+            <w:r>
+              <w:rPr>
+                <w:rFonts w:ascii="맑은 고딕" w:eastAsia="맑은 고딕" w:hAnsi="맑은 고딕" w:cs="맑은 고딕"/>
+                <w:color w:val="000000"/>
+              </w:rPr>
+            </w:r>
+            <w:r>
+              <w:rPr>
+                <w:rFonts w:ascii="맑은 고딕" w:eastAsia="맑은 고딕" w:hAnsi="맑은 고딕" w:cs="맑은 고딕"/>
+                <w:color w:val="000000"/>
+              </w:rPr>
+              <w:fldChar w:fldCharType="separate"/>
+            </w:r>
+            <w:r>
+              <w:rPr>
+                <w:rFonts w:ascii="맑은 고딕" w:eastAsia="맑은 고딕" w:hAnsi="맑은 고딕" w:cs="맑은 고딕"/>
+                <w:color w:val="000000"/>
+              </w:rPr>
+              <w:t>1</w:t>
+            </w:r>
+            <w:r>
+              <w:rPr>
+                <w:rFonts w:ascii="맑은 고딕" w:eastAsia="맑은 고딕" w:hAnsi="맑은 고딕" w:cs="맑은 고딕"/>
+                <w:color w:val="000000"/>
+              </w:rPr>
+              <w:fldChar w:fldCharType="end"/>
+            </w:r>
+            <w:r>
+              <w:rPr>
+                <w:rFonts w:ascii="맑은 고딕" w:eastAsia="맑은 고딕" w:hAnsi="맑은 고딕" w:cs="맑은 고딕" w:hint="eastAsia"/>
+                <w:color w:val="000000"/>
+              </w:rPr>
+              <w:t xml:space="preserve"> </w:t>
+            </w:r>
+            <w:r>
+              <w:rPr>
+                <w:rFonts w:ascii="맑은 고딕" w:eastAsia="맑은 고딕" w:hAnsi="맑은 고딕" w:cs="맑은 고딕"/>
+                <w:color w:val="000000"/>
+              </w:rPr>
+              <w:fldChar w:fldCharType="begin"/>
+            </w:r>
+            <w:r>
+              <w:rPr>
+                <w:rFonts w:ascii="맑은 고딕" w:eastAsia="맑은 고딕" w:hAnsi="맑은 고딕" w:cs="맑은 고딕"/>
+                <w:color w:val="000000"/>
+              </w:rPr>
+              <w:instrText xml:space="preserve"> REF _Ref243642929 \h </w:instrText>
+            </w:r>
+            <w:r>
+              <w:rPr>
+                <w:rFonts w:ascii="맑은 고딕" w:eastAsia="맑은 고딕" w:hAnsi="맑은 고딕" w:cs="맑은 고딕"/>
+                <w:color w:val="000000"/>
+              </w:rPr>
+            </w:r>
+            <w:r>
+              <w:rPr>
+                <w:rFonts w:ascii="맑은 고딕" w:eastAsia="맑은 고딕" w:hAnsi="맑은 고딕" w:cs="맑은 고딕"/>
+                <w:color w:val="000000"/>
+              </w:rPr>
+              <w:fldChar w:fldCharType="separate"/>
+            </w:r>
+            <w:r>
+              <w:rPr>
+                <w:rFonts w:ascii="맑은 고딕" w:eastAsia="맑은 고딕" w:hAnsi="맑은 고딕" w:cs="맑은 고딕" w:hint="eastAsia"/>
+              </w:rPr>
+              <w:t>기획의도</w:t>
+            </w:r>
+            <w:r>
+              <w:rPr>
+                <w:rFonts w:ascii="맑은 고딕" w:eastAsia="맑은 고딕" w:hAnsi="맑은 고딕" w:cs="맑은 고딕"/>
+                <w:color w:val="000000"/>
+              </w:rPr>
+              <w:fldChar w:fldCharType="end"/>
+            </w:r>
+            <w:r>
+              <w:rPr>
+                <w:rFonts w:ascii="맑은 고딕" w:eastAsia="맑은 고딕" w:hAnsi="맑은 고딕" w:cs="맑은 고딕" w:hint="eastAsia"/>
+                <w:color w:val="000000"/>
+              </w:rPr>
+              <w:t xml:space="preserve"> 내용 전면 수정.</w:t>
+            </w:r>
+          </w:p>
+          <w:p>
+            <w:pPr>
+              <w:jc w:val="left"/>
+              <w:rPr>
+                <w:rFonts w:ascii="맑은 고딕" w:eastAsia="맑은 고딕" w:hAnsi="맑은 고딕" w:cs="맑은 고딕"/>
+                <w:color w:val="000000"/>
+              </w:rPr>
+            </w:pPr>
+            <w:r>
+              <w:rPr>
+                <w:rFonts w:ascii="맑은 고딕" w:eastAsia="맑은 고딕" w:hAnsi="맑은 고딕" w:cs="맑은 고딕" w:hint="eastAsia"/>
+                <w:color w:val="000000"/>
+              </w:rPr>
+              <w:t xml:space="preserve">3.5 </w:t>
+            </w:r>
+            <w:r>
+              <w:rPr>
+                <w:rFonts w:ascii="맑은 고딕" w:eastAsia="맑은 고딕" w:hAnsi="맑은 고딕" w:cs="맑은 고딕"/>
+                <w:color w:val="000000"/>
+              </w:rPr>
+              <w:t>스테이지 전개 시스템</w:t>
+            </w:r>
+            <w:r>
+              <w:rPr>
+                <w:rFonts w:ascii="맑은 고딕" w:eastAsia="맑은 고딕" w:hAnsi="맑은 고딕" w:cs="맑은 고딕" w:hint="eastAsia"/>
+                <w:color w:val="000000"/>
+              </w:rPr>
+              <w:t xml:space="preserve"> 목차 제거</w:t>
+            </w:r>
+            <w:r>
+              <w:rPr>
+                <w:rFonts w:ascii="맑은 고딕" w:eastAsia="맑은 고딕" w:hAnsi="맑은 고딕" w:cs="맑은 고딕" w:hint="eastAsia"/>
+                <w:color w:val="000000"/>
+              </w:rPr>
+              <w:t>.</w:t>
+            </w:r>
+          </w:p>
+          <w:p>
+            <w:pPr>
+              <w:jc w:val="left"/>
+              <w:rPr>
+                <w:rFonts w:ascii="맑은 고딕" w:eastAsia="맑은 고딕" w:hAnsi="맑은 고딕" w:cs="맑은 고딕" w:hint="eastAsia"/>
                 <w:color w:val="000000"/>
               </w:rPr>
             </w:pPr>
@@ -992,53 +1528,6 @@
           </w:tcPr>
           <w:p>
             <w:pPr>
-              <w:jc w:val="left"/>
-              <w:rPr>
-                <w:rFonts w:ascii="맑은 고딕" w:eastAsia="맑은 고딕" w:hAnsi="맑은 고딕" w:cs="맑은 고딕"/>
-                <w:color w:val="000000"/>
-              </w:rPr>
-            </w:pPr>
-          </w:p>
-        </w:tc>
-      </w:tr>
-      <w:tr>
-        <w:trPr>
-          <w:trHeight w:val="277"/>
-          <w:jc w:val="center"/>
-        </w:trPr>
-        <w:tc>
-          <w:tcPr>
-            <w:tcW w:w="1271" w:type="dxa"/>
-            <w:vAlign w:val="center"/>
-          </w:tcPr>
-          <w:p>
-            <w:pPr>
-              <w:jc w:val="center"/>
-            </w:pPr>
-          </w:p>
-        </w:tc>
-        <w:tc>
-          <w:tcPr>
-            <w:tcW w:w="880" w:type="dxa"/>
-            <w:vAlign w:val="center"/>
-          </w:tcPr>
-          <w:p>
-            <w:pPr>
-              <w:jc w:val="center"/>
-              <w:rPr>
-                <w:rFonts w:ascii="맑은 고딕" w:eastAsia="맑은 고딕" w:hAnsi="맑은 고딕" w:cs="맑은 고딕"/>
-                <w:color w:val="000000"/>
-              </w:rPr>
-            </w:pPr>
-          </w:p>
-        </w:tc>
-        <w:tc>
-          <w:tcPr>
-            <w:tcW w:w="7229" w:type="dxa"/>
-            <w:vAlign w:val="center"/>
-          </w:tcPr>
-          <w:p>
-            <w:pPr>
               <w:rPr>
                 <w:rFonts w:ascii="맑은 고딕" w:eastAsia="맑은 고딕" w:hAnsi="맑은 고딕" w:cs="맑은 고딕"/>
                 <w:color w:val="000000"/>
@@ -1095,7 +1584,7 @@
       <w:r>
         <w:fldChar w:fldCharType="separate"/>
       </w:r>
-      <w:hyperlink w:anchor="_Toc243523908" w:history="1">
+      <w:hyperlink w:anchor="_Toc243645632" w:history="1">
         <w:r>
           <w:rPr>
             <w:rStyle w:val="af"/>
@@ -1140,7 +1629,7 @@
             <w:noProof/>
             <w:webHidden/>
           </w:rPr>
-          <w:instrText xml:space="preserve"> PAGEREF _Toc243523908 \h </w:instrText>
+          <w:instrText xml:space="preserve"> PAGEREF _Toc243645632 \h </w:instrText>
         </w:r>
         <w:r>
           <w:rPr>
@@ -1188,7 +1677,7 @@
           <w14:ligatures w14:val="standardContextual"/>
         </w:rPr>
       </w:pPr>
-      <w:hyperlink w:anchor="_Toc243523909" w:history="1">
+      <w:hyperlink w:anchor="_Toc243645633" w:history="1">
         <w:r>
           <w:rPr>
             <w:rStyle w:val="af"/>
@@ -1233,7 +1722,7 @@
             <w:noProof/>
             <w:webHidden/>
           </w:rPr>
-          <w:instrText xml:space="preserve"> PAGEREF _Toc243523909 \h </w:instrText>
+          <w:instrText xml:space="preserve"> PAGEREF _Toc243645633 \h </w:instrText>
         </w:r>
         <w:r>
           <w:rPr>
@@ -1281,7 +1770,7 @@
           <w14:ligatures w14:val="standardContextual"/>
         </w:rPr>
       </w:pPr>
-      <w:hyperlink w:anchor="_Toc243523910" w:history="1">
+      <w:hyperlink w:anchor="_Toc243645634" w:history="1">
         <w:r>
           <w:rPr>
             <w:rStyle w:val="af"/>
@@ -1326,7 +1815,7 @@
             <w:noProof/>
             <w:webHidden/>
           </w:rPr>
-          <w:instrText xml:space="preserve"> PAGEREF _Toc243523910 \h </w:instrText>
+          <w:instrText xml:space="preserve"> PAGEREF _Toc243645634 \h </w:instrText>
         </w:r>
         <w:r>
           <w:rPr>
@@ -1374,7 +1863,7 @@
           <w14:ligatures w14:val="standardContextual"/>
         </w:rPr>
       </w:pPr>
-      <w:hyperlink w:anchor="_Toc243523911" w:history="1">
+      <w:hyperlink w:anchor="_Toc243645635" w:history="1">
         <w:r>
           <w:rPr>
             <w:rStyle w:val="af"/>
@@ -1419,7 +1908,7 @@
             <w:noProof/>
             <w:webHidden/>
           </w:rPr>
-          <w:instrText xml:space="preserve"> PAGEREF _Toc243523911 \h </w:instrText>
+          <w:instrText xml:space="preserve"> PAGEREF _Toc243645635 \h </w:instrText>
         </w:r>
         <w:r>
           <w:rPr>
@@ -1467,7 +1956,7 @@
           <w14:ligatures w14:val="standardContextual"/>
         </w:rPr>
       </w:pPr>
-      <w:hyperlink w:anchor="_Toc243523912" w:history="1">
+      <w:hyperlink w:anchor="_Toc243645636" w:history="1">
         <w:r>
           <w:rPr>
             <w:rStyle w:val="af"/>
@@ -1512,7 +2001,7 @@
             <w:noProof/>
             <w:webHidden/>
           </w:rPr>
-          <w:instrText xml:space="preserve"> PAGEREF _Toc243523912 \h </w:instrText>
+          <w:instrText xml:space="preserve"> PAGEREF _Toc243645636 \h </w:instrText>
         </w:r>
         <w:r>
           <w:rPr>
@@ -1545,11 +2034,12 @@
     </w:p>
     <w:p>
       <w:pPr>
-        <w:pStyle w:val="10"/>
+        <w:pStyle w:val="30"/>
         <w:tabs>
-          <w:tab w:val="left" w:pos="425"/>
+          <w:tab w:val="left" w:pos="1760"/>
           <w:tab w:val="right" w:leader="underscore" w:pos="9019"/>
         </w:tabs>
+        <w:ind w:left="880"/>
         <w:rPr>
           <w:rFonts w:asciiTheme="minorHAnsi" w:hAnsiTheme="minorHAnsi" w:cstheme="minorBidi"/>
           <w:noProof/>
@@ -1559,13 +2049,13 @@
           <w14:ligatures w14:val="standardContextual"/>
         </w:rPr>
       </w:pPr>
-      <w:hyperlink w:anchor="_Toc243523913" w:history="1">
+      <w:hyperlink w:anchor="_Toc243645637" w:history="1">
         <w:r>
           <w:rPr>
             <w:rStyle w:val="af"/>
             <w:noProof/>
           </w:rPr>
-          <w:t>2</w:t>
+          <w:t>1.2.1</w:t>
         </w:r>
         <w:r>
           <w:rPr>
@@ -1583,6 +2073,98 @@
             <w:rStyle w:val="af"/>
             <w:noProof/>
           </w:rPr>
+          <w:t>최종 점수 산정 방식</w:t>
+        </w:r>
+        <w:r>
+          <w:rPr>
+            <w:noProof/>
+            <w:webHidden/>
+          </w:rPr>
+          <w:tab/>
+        </w:r>
+        <w:r>
+          <w:rPr>
+            <w:noProof/>
+            <w:webHidden/>
+          </w:rPr>
+          <w:fldChar w:fldCharType="begin"/>
+        </w:r>
+        <w:r>
+          <w:rPr>
+            <w:noProof/>
+            <w:webHidden/>
+          </w:rPr>
+          <w:instrText xml:space="preserve"> PAGEREF _Toc243645637 \h </w:instrText>
+        </w:r>
+        <w:r>
+          <w:rPr>
+            <w:noProof/>
+            <w:webHidden/>
+          </w:rPr>
+        </w:r>
+        <w:r>
+          <w:rPr>
+            <w:noProof/>
+            <w:webHidden/>
+          </w:rPr>
+          <w:fldChar w:fldCharType="separate"/>
+        </w:r>
+        <w:r>
+          <w:rPr>
+            <w:noProof/>
+            <w:webHidden/>
+          </w:rPr>
+          <w:t>4</w:t>
+        </w:r>
+        <w:r>
+          <w:rPr>
+            <w:noProof/>
+            <w:webHidden/>
+          </w:rPr>
+          <w:fldChar w:fldCharType="end"/>
+        </w:r>
+      </w:hyperlink>
+    </w:p>
+    <w:p>
+      <w:pPr>
+        <w:pStyle w:val="10"/>
+        <w:tabs>
+          <w:tab w:val="left" w:pos="425"/>
+          <w:tab w:val="right" w:leader="underscore" w:pos="9019"/>
+        </w:tabs>
+        <w:rPr>
+          <w:rFonts w:asciiTheme="minorHAnsi" w:hAnsiTheme="minorHAnsi" w:cstheme="minorBidi"/>
+          <w:noProof/>
+          <w:kern w:val="2"/>
+          <w:szCs w:val="24"/>
+          <w:lang w:val="en-US"/>
+          <w14:ligatures w14:val="standardContextual"/>
+        </w:rPr>
+      </w:pPr>
+      <w:hyperlink w:anchor="_Toc243645638" w:history="1">
+        <w:r>
+          <w:rPr>
+            <w:rStyle w:val="af"/>
+            <w:noProof/>
+          </w:rPr>
+          <w:t>2</w:t>
+        </w:r>
+        <w:r>
+          <w:rPr>
+            <w:rFonts w:asciiTheme="minorHAnsi" w:hAnsiTheme="minorHAnsi" w:cstheme="minorBidi"/>
+            <w:noProof/>
+            <w:kern w:val="2"/>
+            <w:szCs w:val="24"/>
+            <w:lang w:val="en-US"/>
+            <w14:ligatures w14:val="standardContextual"/>
+          </w:rPr>
+          <w:tab/>
+        </w:r>
+        <w:r>
+          <w:rPr>
+            <w:rStyle w:val="af"/>
+            <w:noProof/>
+          </w:rPr>
           <w:t>게임 플로우</w:t>
         </w:r>
         <w:r>
@@ -1604,7 +2186,7 @@
             <w:noProof/>
             <w:webHidden/>
           </w:rPr>
-          <w:instrText xml:space="preserve"> PAGEREF _Toc243523913 \h </w:instrText>
+          <w:instrText xml:space="preserve"> PAGEREF _Toc243645638 \h </w:instrText>
         </w:r>
         <w:r>
           <w:rPr>
@@ -1624,7 +2206,7 @@
             <w:noProof/>
             <w:webHidden/>
           </w:rPr>
-          <w:t>5</w:t>
+          <w:t>6</w:t>
         </w:r>
         <w:r>
           <w:rPr>
@@ -1652,7 +2234,7 @@
           <w14:ligatures w14:val="standardContextual"/>
         </w:rPr>
       </w:pPr>
-      <w:hyperlink w:anchor="_Toc243523914" w:history="1">
+      <w:hyperlink w:anchor="_Toc243645639" w:history="1">
         <w:r>
           <w:rPr>
             <w:rStyle w:val="af"/>
@@ -1697,7 +2279,7 @@
             <w:noProof/>
             <w:webHidden/>
           </w:rPr>
-          <w:instrText xml:space="preserve"> PAGEREF _Toc243523914 \h </w:instrText>
+          <w:instrText xml:space="preserve"> PAGEREF _Toc243645639 \h </w:instrText>
         </w:r>
         <w:r>
           <w:rPr>
@@ -1717,7 +2299,7 @@
             <w:noProof/>
             <w:webHidden/>
           </w:rPr>
-          <w:t>5</w:t>
+          <w:t>6</w:t>
         </w:r>
         <w:r>
           <w:rPr>
@@ -1745,7 +2327,7 @@
           <w14:ligatures w14:val="standardContextual"/>
         </w:rPr>
       </w:pPr>
-      <w:hyperlink w:anchor="_Toc243523915" w:history="1">
+      <w:hyperlink w:anchor="_Toc243645640" w:history="1">
         <w:r>
           <w:rPr>
             <w:rStyle w:val="af"/>
@@ -1790,7 +2372,7 @@
             <w:noProof/>
             <w:webHidden/>
           </w:rPr>
-          <w:instrText xml:space="preserve"> PAGEREF _Toc243523915 \h </w:instrText>
+          <w:instrText xml:space="preserve"> PAGEREF _Toc243645640 \h </w:instrText>
         </w:r>
         <w:r>
           <w:rPr>
@@ -1810,7 +2392,7 @@
             <w:noProof/>
             <w:webHidden/>
           </w:rPr>
-          <w:t>5</w:t>
+          <w:t>6</w:t>
         </w:r>
         <w:r>
           <w:rPr>
@@ -1837,7 +2419,7 @@
           <w14:ligatures w14:val="standardContextual"/>
         </w:rPr>
       </w:pPr>
-      <w:hyperlink w:anchor="_Toc243523916" w:history="1">
+      <w:hyperlink w:anchor="_Toc243645641" w:history="1">
         <w:r>
           <w:rPr>
             <w:rStyle w:val="af"/>
@@ -1882,7 +2464,7 @@
             <w:noProof/>
             <w:webHidden/>
           </w:rPr>
-          <w:instrText xml:space="preserve"> PAGEREF _Toc243523916 \h </w:instrText>
+          <w:instrText xml:space="preserve"> PAGEREF _Toc243645641 \h </w:instrText>
         </w:r>
         <w:r>
           <w:rPr>
@@ -1902,7 +2484,7 @@
             <w:noProof/>
             <w:webHidden/>
           </w:rPr>
-          <w:t>6</w:t>
+          <w:t>7</w:t>
         </w:r>
         <w:r>
           <w:rPr>
@@ -1930,7 +2512,7 @@
           <w14:ligatures w14:val="standardContextual"/>
         </w:rPr>
       </w:pPr>
-      <w:hyperlink w:anchor="_Toc243523917" w:history="1">
+      <w:hyperlink w:anchor="_Toc243645642" w:history="1">
         <w:r>
           <w:rPr>
             <w:rStyle w:val="af"/>
@@ -1975,7 +2557,7 @@
             <w:noProof/>
             <w:webHidden/>
           </w:rPr>
-          <w:instrText xml:space="preserve"> PAGEREF _Toc243523917 \h </w:instrText>
+          <w:instrText xml:space="preserve"> PAGEREF _Toc243645642 \h </w:instrText>
         </w:r>
         <w:r>
           <w:rPr>
@@ -1995,7 +2577,7 @@
             <w:noProof/>
             <w:webHidden/>
           </w:rPr>
-          <w:t>6</w:t>
+          <w:t>7</w:t>
         </w:r>
         <w:r>
           <w:rPr>
@@ -2023,7 +2605,7 @@
           <w14:ligatures w14:val="standardContextual"/>
         </w:rPr>
       </w:pPr>
-      <w:hyperlink w:anchor="_Toc243523918" w:history="1">
+      <w:hyperlink w:anchor="_Toc243645643" w:history="1">
         <w:r>
           <w:rPr>
             <w:rStyle w:val="af"/>
@@ -2068,7 +2650,7 @@
             <w:noProof/>
             <w:webHidden/>
           </w:rPr>
-          <w:instrText xml:space="preserve"> PAGEREF _Toc243523918 \h </w:instrText>
+          <w:instrText xml:space="preserve"> PAGEREF _Toc243645643 \h </w:instrText>
         </w:r>
         <w:r>
           <w:rPr>
@@ -2088,7 +2670,7 @@
             <w:noProof/>
             <w:webHidden/>
           </w:rPr>
-          <w:t>6</w:t>
+          <w:t>7</w:t>
         </w:r>
         <w:r>
           <w:rPr>
@@ -2116,7 +2698,7 @@
           <w14:ligatures w14:val="standardContextual"/>
         </w:rPr>
       </w:pPr>
-      <w:hyperlink w:anchor="_Toc243523919" w:history="1">
+      <w:hyperlink w:anchor="_Toc243645644" w:history="1">
         <w:r>
           <w:rPr>
             <w:rStyle w:val="af"/>
@@ -2161,7 +2743,7 @@
             <w:noProof/>
             <w:webHidden/>
           </w:rPr>
-          <w:instrText xml:space="preserve"> PAGEREF _Toc243523919 \h </w:instrText>
+          <w:instrText xml:space="preserve"> PAGEREF _Toc243645644 \h </w:instrText>
         </w:r>
         <w:r>
           <w:rPr>
@@ -2181,7 +2763,7 @@
             <w:noProof/>
             <w:webHidden/>
           </w:rPr>
-          <w:t>6</w:t>
+          <w:t>7</w:t>
         </w:r>
         <w:r>
           <w:rPr>
@@ -2209,7 +2791,7 @@
           <w14:ligatures w14:val="standardContextual"/>
         </w:rPr>
       </w:pPr>
-      <w:hyperlink w:anchor="_Toc243523920" w:history="1">
+      <w:hyperlink w:anchor="_Toc243645645" w:history="1">
         <w:r>
           <w:rPr>
             <w:rStyle w:val="af"/>
@@ -2254,7 +2836,7 @@
             <w:noProof/>
             <w:webHidden/>
           </w:rPr>
-          <w:instrText xml:space="preserve"> PAGEREF _Toc243523920 \h </w:instrText>
+          <w:instrText xml:space="preserve"> PAGEREF _Toc243645645 \h </w:instrText>
         </w:r>
         <w:r>
           <w:rPr>
@@ -2274,7 +2856,7 @@
             <w:noProof/>
             <w:webHidden/>
           </w:rPr>
-          <w:t>6</w:t>
+          <w:t>7</w:t>
         </w:r>
         <w:r>
           <w:rPr>
@@ -2302,7 +2884,7 @@
           <w14:ligatures w14:val="standardContextual"/>
         </w:rPr>
       </w:pPr>
-      <w:hyperlink w:anchor="_Toc243523921" w:history="1">
+      <w:hyperlink w:anchor="_Toc243645646" w:history="1">
         <w:r>
           <w:rPr>
             <w:rStyle w:val="af"/>
@@ -2347,7 +2929,7 @@
             <w:noProof/>
             <w:webHidden/>
           </w:rPr>
-          <w:instrText xml:space="preserve"> PAGEREF _Toc243523921 \h </w:instrText>
+          <w:instrText xml:space="preserve"> PAGEREF _Toc243645646 \h </w:instrText>
         </w:r>
         <w:r>
           <w:rPr>
@@ -2367,7 +2949,7 @@
             <w:noProof/>
             <w:webHidden/>
           </w:rPr>
-          <w:t>6</w:t>
+          <w:t>7</w:t>
         </w:r>
         <w:r>
           <w:rPr>
@@ -2395,7 +2977,7 @@
           <w14:ligatures w14:val="standardContextual"/>
         </w:rPr>
       </w:pPr>
-      <w:hyperlink w:anchor="_Toc243523922" w:history="1">
+      <w:hyperlink w:anchor="_Toc243645647" w:history="1">
         <w:r>
           <w:rPr>
             <w:rStyle w:val="af"/>
@@ -2440,7 +3022,7 @@
             <w:noProof/>
             <w:webHidden/>
           </w:rPr>
-          <w:instrText xml:space="preserve"> PAGEREF _Toc243523922 \h </w:instrText>
+          <w:instrText xml:space="preserve"> PAGEREF _Toc243645647 \h </w:instrText>
         </w:r>
         <w:r>
           <w:rPr>
@@ -2460,7 +3042,7 @@
             <w:noProof/>
             <w:webHidden/>
           </w:rPr>
-          <w:t>6</w:t>
+          <w:t>7</w:t>
         </w:r>
         <w:r>
           <w:rPr>
@@ -2488,7 +3070,7 @@
           <w14:ligatures w14:val="standardContextual"/>
         </w:rPr>
       </w:pPr>
-      <w:hyperlink w:anchor="_Toc243523923" w:history="1">
+      <w:hyperlink w:anchor="_Toc243645648" w:history="1">
         <w:r>
           <w:rPr>
             <w:rStyle w:val="af"/>
@@ -2533,7 +3115,7 @@
             <w:noProof/>
             <w:webHidden/>
           </w:rPr>
-          <w:instrText xml:space="preserve"> PAGEREF _Toc243523923 \h </w:instrText>
+          <w:instrText xml:space="preserve"> PAGEREF _Toc243645648 \h </w:instrText>
         </w:r>
         <w:r>
           <w:rPr>
@@ -2553,7 +3135,7 @@
             <w:noProof/>
             <w:webHidden/>
           </w:rPr>
-          <w:t>7</w:t>
+          <w:t>8</w:t>
         </w:r>
         <w:r>
           <w:rPr>
@@ -2581,7 +3163,7 @@
           <w14:ligatures w14:val="standardContextual"/>
         </w:rPr>
       </w:pPr>
-      <w:hyperlink w:anchor="_Toc243523924" w:history="1">
+      <w:hyperlink w:anchor="_Toc243645649" w:history="1">
         <w:r>
           <w:rPr>
             <w:rStyle w:val="af"/>
@@ -2626,7 +3208,7 @@
             <w:noProof/>
             <w:webHidden/>
           </w:rPr>
-          <w:instrText xml:space="preserve"> PAGEREF _Toc243523924 \h </w:instrText>
+          <w:instrText xml:space="preserve"> PAGEREF _Toc243645649 \h </w:instrText>
         </w:r>
         <w:r>
           <w:rPr>
@@ -2646,7 +3228,7 @@
             <w:noProof/>
             <w:webHidden/>
           </w:rPr>
-          <w:t>7</w:t>
+          <w:t>8</w:t>
         </w:r>
         <w:r>
           <w:rPr>
@@ -2674,7 +3256,7 @@
           <w14:ligatures w14:val="standardContextual"/>
         </w:rPr>
       </w:pPr>
-      <w:hyperlink w:anchor="_Toc243523925" w:history="1">
+      <w:hyperlink w:anchor="_Toc243645650" w:history="1">
         <w:r>
           <w:rPr>
             <w:rStyle w:val="af"/>
@@ -2719,7 +3301,7 @@
             <w:noProof/>
             <w:webHidden/>
           </w:rPr>
-          <w:instrText xml:space="preserve"> PAGEREF _Toc243523925 \h </w:instrText>
+          <w:instrText xml:space="preserve"> PAGEREF _Toc243645650 \h </w:instrText>
         </w:r>
         <w:r>
           <w:rPr>
@@ -2739,7 +3321,7 @@
             <w:noProof/>
             <w:webHidden/>
           </w:rPr>
-          <w:t>8</w:t>
+          <w:t>10</w:t>
         </w:r>
         <w:r>
           <w:rPr>
@@ -2767,7 +3349,7 @@
           <w14:ligatures w14:val="standardContextual"/>
         </w:rPr>
       </w:pPr>
-      <w:hyperlink w:anchor="_Toc243523926" w:history="1">
+      <w:hyperlink w:anchor="_Toc243645651" w:history="1">
         <w:r>
           <w:rPr>
             <w:rStyle w:val="af"/>
@@ -2812,7 +3394,7 @@
             <w:noProof/>
             <w:webHidden/>
           </w:rPr>
-          <w:instrText xml:space="preserve"> PAGEREF _Toc243523926 \h </w:instrText>
+          <w:instrText xml:space="preserve"> PAGEREF _Toc243645651 \h </w:instrText>
         </w:r>
         <w:r>
           <w:rPr>
@@ -2832,7 +3414,7 @@
             <w:noProof/>
             <w:webHidden/>
           </w:rPr>
-          <w:t>9</w:t>
+          <w:t>11</w:t>
         </w:r>
         <w:r>
           <w:rPr>
@@ -2860,7 +3442,7 @@
           <w14:ligatures w14:val="standardContextual"/>
         </w:rPr>
       </w:pPr>
-      <w:hyperlink w:anchor="_Toc243523927" w:history="1">
+      <w:hyperlink w:anchor="_Toc243645652" w:history="1">
         <w:r>
           <w:rPr>
             <w:rStyle w:val="af"/>
@@ -2905,7 +3487,7 @@
             <w:noProof/>
             <w:webHidden/>
           </w:rPr>
-          <w:instrText xml:space="preserve"> PAGEREF _Toc243523927 \h </w:instrText>
+          <w:instrText xml:space="preserve"> PAGEREF _Toc243645652 \h </w:instrText>
         </w:r>
         <w:r>
           <w:rPr>
@@ -2925,7 +3507,7 @@
             <w:noProof/>
             <w:webHidden/>
           </w:rPr>
-          <w:t>10</w:t>
+          <w:t>12</w:t>
         </w:r>
         <w:r>
           <w:rPr>
@@ -2953,7 +3535,7 @@
           <w14:ligatures w14:val="standardContextual"/>
         </w:rPr>
       </w:pPr>
-      <w:hyperlink w:anchor="_Toc243523928" w:history="1">
+      <w:hyperlink w:anchor="_Toc243645653" w:history="1">
         <w:r>
           <w:rPr>
             <w:rStyle w:val="af"/>
@@ -2998,7 +3580,7 @@
             <w:noProof/>
             <w:webHidden/>
           </w:rPr>
-          <w:instrText xml:space="preserve"> PAGEREF _Toc243523928 \h </w:instrText>
+          <w:instrText xml:space="preserve"> PAGEREF _Toc243645653 \h </w:instrText>
         </w:r>
         <w:r>
           <w:rPr>
@@ -3018,7 +3600,100 @@
             <w:noProof/>
             <w:webHidden/>
           </w:rPr>
-          <w:t>10</w:t>
+          <w:t>12</w:t>
+        </w:r>
+        <w:r>
+          <w:rPr>
+            <w:noProof/>
+            <w:webHidden/>
+          </w:rPr>
+          <w:fldChar w:fldCharType="end"/>
+        </w:r>
+      </w:hyperlink>
+    </w:p>
+    <w:p>
+      <w:pPr>
+        <w:pStyle w:val="30"/>
+        <w:tabs>
+          <w:tab w:val="left" w:pos="1760"/>
+          <w:tab w:val="right" w:leader="underscore" w:pos="9019"/>
+        </w:tabs>
+        <w:ind w:left="880"/>
+        <w:rPr>
+          <w:rFonts w:asciiTheme="minorHAnsi" w:hAnsiTheme="minorHAnsi" w:cstheme="minorBidi"/>
+          <w:noProof/>
+          <w:kern w:val="2"/>
+          <w:szCs w:val="24"/>
+          <w:lang w:val="en-US"/>
+          <w14:ligatures w14:val="standardContextual"/>
+        </w:rPr>
+      </w:pPr>
+      <w:hyperlink w:anchor="_Toc243645654" w:history="1">
+        <w:r>
+          <w:rPr>
+            <w:rStyle w:val="af"/>
+            <w:noProof/>
+          </w:rPr>
+          <w:t>3.3.6</w:t>
+        </w:r>
+        <w:r>
+          <w:rPr>
+            <w:rFonts w:asciiTheme="minorHAnsi" w:hAnsiTheme="minorHAnsi" w:cstheme="minorBidi"/>
+            <w:noProof/>
+            <w:kern w:val="2"/>
+            <w:szCs w:val="24"/>
+            <w:lang w:val="en-US"/>
+            <w14:ligatures w14:val="standardContextual"/>
+          </w:rPr>
+          <w:tab/>
+        </w:r>
+        <w:r>
+          <w:rPr>
+            <w:rStyle w:val="af"/>
+            <w:noProof/>
+          </w:rPr>
+          <w:t>스킬 조합</w:t>
+        </w:r>
+        <w:r>
+          <w:rPr>
+            <w:noProof/>
+            <w:webHidden/>
+          </w:rPr>
+          <w:tab/>
+        </w:r>
+        <w:r>
+          <w:rPr>
+            <w:noProof/>
+            <w:webHidden/>
+          </w:rPr>
+          <w:fldChar w:fldCharType="begin"/>
+        </w:r>
+        <w:r>
+          <w:rPr>
+            <w:noProof/>
+            <w:webHidden/>
+          </w:rPr>
+          <w:instrText xml:space="preserve"> PAGEREF _Toc243645654 \h </w:instrText>
+        </w:r>
+        <w:r>
+          <w:rPr>
+            <w:noProof/>
+            <w:webHidden/>
+          </w:rPr>
+        </w:r>
+        <w:r>
+          <w:rPr>
+            <w:noProof/>
+            <w:webHidden/>
+          </w:rPr>
+          <w:fldChar w:fldCharType="separate"/>
+        </w:r>
+        <w:r>
+          <w:rPr>
+            <w:noProof/>
+            <w:webHidden/>
+          </w:rPr>
+          <w:t>12</w:t>
         </w:r>
         <w:r>
           <w:rPr>
@@ -3046,7 +3721,7 @@
           <w14:ligatures w14:val="standardContextual"/>
         </w:rPr>
       </w:pPr>
-      <w:hyperlink w:anchor="_Toc243523929" w:history="1">
+      <w:hyperlink w:anchor="_Toc243645655" w:history="1">
         <w:r>
           <w:rPr>
             <w:rStyle w:val="af"/>
@@ -3070,7 +3745,7 @@
             <w:rStyle w:val="af"/>
             <w:noProof/>
           </w:rPr>
-          <w:t>스테이지 전개 시스템</w:t>
+          <w:t>패링 및 방어 시스템</w:t>
         </w:r>
         <w:r>
           <w:rPr>
@@ -3091,7 +3766,7 @@
             <w:noProof/>
             <w:webHidden/>
           </w:rPr>
-          <w:instrText xml:space="preserve"> PAGEREF _Toc243523929 \h </w:instrText>
+          <w:instrText xml:space="preserve"> PAGEREF _Toc243645655 \h </w:instrText>
         </w:r>
         <w:r>
           <w:rPr>
@@ -3111,7 +3786,7 @@
             <w:noProof/>
             <w:webHidden/>
           </w:rPr>
-          <w:t>11</w:t>
+          <w:t>13</w:t>
         </w:r>
         <w:r>
           <w:rPr>
@@ -3138,7 +3813,7 @@
           <w14:ligatures w14:val="standardContextual"/>
         </w:rPr>
       </w:pPr>
-      <w:hyperlink w:anchor="_Toc243523930" w:history="1">
+      <w:hyperlink w:anchor="_Toc243645656" w:history="1">
         <w:r>
           <w:rPr>
             <w:rStyle w:val="af"/>
@@ -3183,7 +3858,7 @@
             <w:noProof/>
             <w:webHidden/>
           </w:rPr>
-          <w:instrText xml:space="preserve"> PAGEREF _Toc243523930 \h </w:instrText>
+          <w:instrText xml:space="preserve"> PAGEREF _Toc243645656 \h </w:instrText>
         </w:r>
         <w:r>
           <w:rPr>
@@ -3203,7 +3878,7 @@
             <w:noProof/>
             <w:webHidden/>
           </w:rPr>
-          <w:t>11</w:t>
+          <w:t>13</w:t>
         </w:r>
         <w:r>
           <w:rPr>
@@ -3231,7 +3906,7 @@
           <w14:ligatures w14:val="standardContextual"/>
         </w:rPr>
       </w:pPr>
-      <w:hyperlink w:anchor="_Toc243523931" w:history="1">
+      <w:hyperlink w:anchor="_Toc243645657" w:history="1">
         <w:r>
           <w:rPr>
             <w:rStyle w:val="af"/>
@@ -3276,7 +3951,7 @@
             <w:noProof/>
             <w:webHidden/>
           </w:rPr>
-          <w:instrText xml:space="preserve"> PAGEREF _Toc243523931 \h </w:instrText>
+          <w:instrText xml:space="preserve"> PAGEREF _Toc243645657 \h </w:instrText>
         </w:r>
         <w:r>
           <w:rPr>
@@ -3296,7 +3971,7 @@
             <w:noProof/>
             <w:webHidden/>
           </w:rPr>
-          <w:t>11</w:t>
+          <w:t>13</w:t>
         </w:r>
         <w:r>
           <w:rPr>
@@ -3324,7 +3999,7 @@
           <w14:ligatures w14:val="standardContextual"/>
         </w:rPr>
       </w:pPr>
-      <w:hyperlink w:anchor="_Toc243523932" w:history="1">
+      <w:hyperlink w:anchor="_Toc243645658" w:history="1">
         <w:r>
           <w:rPr>
             <w:rStyle w:val="af"/>
@@ -3369,7 +4044,7 @@
             <w:noProof/>
             <w:webHidden/>
           </w:rPr>
-          <w:instrText xml:space="preserve"> PAGEREF _Toc243523932 \h </w:instrText>
+          <w:instrText xml:space="preserve"> PAGEREF _Toc243645658 \h </w:instrText>
         </w:r>
         <w:r>
           <w:rPr>
@@ -3389,7 +4064,7 @@
             <w:noProof/>
             <w:webHidden/>
           </w:rPr>
-          <w:t>11</w:t>
+          <w:t>13</w:t>
         </w:r>
         <w:r>
           <w:rPr>
@@ -3417,7 +4092,7 @@
           <w14:ligatures w14:val="standardContextual"/>
         </w:rPr>
       </w:pPr>
-      <w:hyperlink w:anchor="_Toc243523933" w:history="1">
+      <w:hyperlink w:anchor="_Toc243645659" w:history="1">
         <w:r>
           <w:rPr>
             <w:rStyle w:val="af"/>
@@ -3462,7 +4137,7 @@
             <w:noProof/>
             <w:webHidden/>
           </w:rPr>
-          <w:instrText xml:space="preserve"> PAGEREF _Toc243523933 \h </w:instrText>
+          <w:instrText xml:space="preserve"> PAGEREF _Toc243645659 \h </w:instrText>
         </w:r>
         <w:r>
           <w:rPr>
@@ -3482,7 +4157,7 @@
             <w:noProof/>
             <w:webHidden/>
           </w:rPr>
-          <w:t>12</w:t>
+          <w:t>14</w:t>
         </w:r>
         <w:r>
           <w:rPr>
@@ -3509,7 +4184,7 @@
           <w14:ligatures w14:val="standardContextual"/>
         </w:rPr>
       </w:pPr>
-      <w:hyperlink w:anchor="_Toc243523934" w:history="1">
+      <w:hyperlink w:anchor="_Toc243645660" w:history="1">
         <w:r>
           <w:rPr>
             <w:rStyle w:val="af"/>
@@ -3554,7 +4229,7 @@
             <w:noProof/>
             <w:webHidden/>
           </w:rPr>
-          <w:instrText xml:space="preserve"> PAGEREF _Toc243523934 \h </w:instrText>
+          <w:instrText xml:space="preserve"> PAGEREF _Toc243645660 \h </w:instrText>
         </w:r>
         <w:r>
           <w:rPr>
@@ -3574,7 +4249,7 @@
             <w:noProof/>
             <w:webHidden/>
           </w:rPr>
-          <w:t>12</w:t>
+          <w:t>14</w:t>
         </w:r>
         <w:r>
           <w:rPr>
@@ -3602,7 +4277,7 @@
           <w14:ligatures w14:val="standardContextual"/>
         </w:rPr>
       </w:pPr>
-      <w:hyperlink w:anchor="_Toc243523935" w:history="1">
+      <w:hyperlink w:anchor="_Toc243645661" w:history="1">
         <w:r>
           <w:rPr>
             <w:rStyle w:val="af"/>
@@ -3647,7 +4322,7 @@
             <w:noProof/>
             <w:webHidden/>
           </w:rPr>
-          <w:instrText xml:space="preserve"> PAGEREF _Toc243523935 \h </w:instrText>
+          <w:instrText xml:space="preserve"> PAGEREF _Toc243645661 \h </w:instrText>
         </w:r>
         <w:r>
           <w:rPr>
@@ -3667,7 +4342,7 @@
             <w:noProof/>
             <w:webHidden/>
           </w:rPr>
-          <w:t>12</w:t>
+          <w:t>14</w:t>
         </w:r>
         <w:r>
           <w:rPr>
@@ -3695,7 +4370,7 @@
           <w14:ligatures w14:val="standardContextual"/>
         </w:rPr>
       </w:pPr>
-      <w:hyperlink w:anchor="_Toc243523936" w:history="1">
+      <w:hyperlink w:anchor="_Toc243645662" w:history="1">
         <w:r>
           <w:rPr>
             <w:rStyle w:val="af"/>
@@ -3740,7 +4415,7 @@
             <w:noProof/>
             <w:webHidden/>
           </w:rPr>
-          <w:instrText xml:space="preserve"> PAGEREF _Toc243523936 \h </w:instrText>
+          <w:instrText xml:space="preserve"> PAGEREF _Toc243645662 \h </w:instrText>
         </w:r>
         <w:r>
           <w:rPr>
@@ -3760,7 +4435,7 @@
             <w:noProof/>
             <w:webHidden/>
           </w:rPr>
-          <w:t>12</w:t>
+          <w:t>14</w:t>
         </w:r>
         <w:r>
           <w:rPr>
@@ -3788,7 +4463,7 @@
           <w14:ligatures w14:val="standardContextual"/>
         </w:rPr>
       </w:pPr>
-      <w:hyperlink w:anchor="_Toc243523937" w:history="1">
+      <w:hyperlink w:anchor="_Toc243645663" w:history="1">
         <w:r>
           <w:rPr>
             <w:rStyle w:val="af"/>
@@ -3833,7 +4508,7 @@
             <w:noProof/>
             <w:webHidden/>
           </w:rPr>
-          <w:instrText xml:space="preserve"> PAGEREF _Toc243523937 \h </w:instrText>
+          <w:instrText xml:space="preserve"> PAGEREF _Toc243645663 \h </w:instrText>
         </w:r>
         <w:r>
           <w:rPr>
@@ -3853,7 +4528,7 @@
             <w:noProof/>
             <w:webHidden/>
           </w:rPr>
-          <w:t>12</w:t>
+          <w:t>14</w:t>
         </w:r>
         <w:r>
           <w:rPr>
@@ -3895,7 +4570,9 @@
           <w:numId w:val="15"/>
         </w:numPr>
       </w:pPr>
-      <w:bookmarkStart w:id="0" w:name="_Toc243523908"/>
+      <w:bookmarkStart w:id="0" w:name="_Ref243642924"/>
+      <w:bookmarkStart w:id="1" w:name="_Ref243642929"/>
+      <w:bookmarkStart w:id="2" w:name="_Toc243645632"/>
       <w:r>
         <w:rPr>
           <w:rFonts w:hint="eastAsia"/>
@@ -3904,72 +4581,106 @@
         <w:t>기획의도</w:t>
       </w:r>
       <w:bookmarkEnd w:id="0"/>
-    </w:p>
-    <w:p>
-      <w:pPr>
-        <w:jc w:val="both"/>
-      </w:pPr>
-      <w:r>
-        <w:rPr>
-          <w:rFonts w:hint="eastAsia"/>
-        </w:rPr>
-        <w:t xml:space="preserve">모바일에서 </w:t>
+      <w:bookmarkEnd w:id="1"/>
+      <w:bookmarkEnd w:id="2"/>
+    </w:p>
+    <w:p>
+      <w:r>
+        <w:rPr>
+          <w:rFonts w:hint="eastAsia"/>
+        </w:rPr>
+        <w:t>모</w:t>
+      </w:r>
+      <w:r>
+        <w:t>바일 탑</w:t>
+      </w:r>
+      <w:r>
+        <w:rPr>
+          <w:rFonts w:hint="eastAsia"/>
+        </w:rPr>
+        <w:t xml:space="preserve"> </w:t>
+      </w:r>
+      <w:r>
+        <w:t xml:space="preserve">다운 뷰 환경에서 조작 피로도는 낮추고 </w:t>
       </w:r>
       <w:proofErr w:type="spellStart"/>
       <w:r>
-        <w:rPr>
-          <w:rFonts w:hint="eastAsia"/>
-        </w:rPr>
-        <w:t>소울류의</w:t>
+        <w:t>소울라이</w:t>
+      </w:r>
+      <w:r>
+        <w:rPr>
+          <w:rFonts w:hint="eastAsia"/>
+        </w:rPr>
+        <w:t>크</w:t>
       </w:r>
       <w:proofErr w:type="spellEnd"/>
       <w:r>
-        <w:rPr>
-          <w:rFonts w:hint="eastAsia"/>
-        </w:rPr>
+        <w:t xml:space="preserve"> 특유의 묵직한 공방과 빌드 구축의 재미를 극대화한 보스 러쉬 액션 </w:t>
+      </w:r>
+      <w:proofErr w:type="spellStart"/>
+      <w:r>
+        <w:t>로그라이</w:t>
+      </w:r>
+      <w:r>
+        <w:rPr>
+          <w:rFonts w:hint="eastAsia"/>
+        </w:rPr>
+        <w:t>트</w:t>
+      </w:r>
+      <w:r>
+        <w:t>를</w:t>
+      </w:r>
+      <w:proofErr w:type="spellEnd"/>
+      <w:r>
+        <w:t xml:space="preserve"> 구현한다. 일반 전투는 자동 추적 탄환으로 쾌적하게 진행하되, 엘리트 및 보스전에서는 탭/홀드 기반의 정밀한 </w:t>
+      </w:r>
+      <w:proofErr w:type="spellStart"/>
+      <w:r>
+        <w:t>패링·가드와</w:t>
+      </w:r>
+      <w:proofErr w:type="spellEnd"/>
+      <w:r>
         <w:t xml:space="preserve"> </w:t>
       </w:r>
       <w:proofErr w:type="spellStart"/>
       <w:r>
-        <w:rPr>
-          <w:rFonts w:hint="eastAsia"/>
-        </w:rPr>
-        <w:t>로그라이크</w:t>
+        <w:t>차징형</w:t>
       </w:r>
       <w:proofErr w:type="spellEnd"/>
       <w:r>
-        <w:rPr>
-          <w:rFonts w:hint="eastAsia"/>
-        </w:rPr>
-        <w:t xml:space="preserve"> 게임을 경험할 수 있게 한다. 강해져야 하는 동기와 스테이지 클리어 욕구는 </w:t>
+        <w:t xml:space="preserve"> 스킬 조작을 요구하여 극한의 손맛을 제공한다. 여기에 사전 </w:t>
       </w:r>
       <w:proofErr w:type="spellStart"/>
       <w:r>
-        <w:rPr>
-          <w:rFonts w:hint="eastAsia"/>
-        </w:rPr>
-        <w:t>이스터에그</w:t>
+        <w:t>룰렛</w:t>
       </w:r>
       <w:proofErr w:type="spellEnd"/>
       <w:r>
-        <w:rPr>
-          <w:rFonts w:hint="eastAsia"/>
-        </w:rPr>
-        <w:t xml:space="preserve"> 형식의 간접 스토리 체험을 제공하는 방식과 유물, 증강 등의 </w:t>
+        <w:t xml:space="preserve">, </w:t>
       </w:r>
       <w:proofErr w:type="spellStart"/>
       <w:r>
-        <w:rPr>
-          <w:rFonts w:hint="eastAsia"/>
-        </w:rPr>
-        <w:t>인게임</w:t>
+        <w:t>패널티를</w:t>
       </w:r>
       <w:proofErr w:type="spellEnd"/>
       <w:r>
-        <w:rPr>
-          <w:rFonts w:hint="eastAsia"/>
-        </w:rPr>
-        <w:t xml:space="preserve"> 성장 요소로 자극하여 재미를 준다.</w:t>
+        <w:t xml:space="preserve"> 동반한 저주 유물, 보스 증강 및 </w:t>
+      </w:r>
+      <w:proofErr w:type="spellStart"/>
+      <w:r>
+        <w:t>Fusion</w:t>
+      </w:r>
+      <w:proofErr w:type="spellEnd"/>
+      <w:r>
+        <w:t xml:space="preserve"> 스킬 조합 등 </w:t>
+      </w:r>
+      <w:proofErr w:type="spellStart"/>
+      <w:r>
+        <w:t>하이리스크</w:t>
+      </w:r>
+      <w:proofErr w:type="spellEnd"/>
+      <w:r>
+        <w:t>-하이리턴 성장 구조와 간접 스토리텔링을 결합해 반복 플레이와 스테이지 클리어 욕구를 강하게 자극한다.</w:t>
       </w:r>
     </w:p>
     <w:p/>
@@ -3981,14 +4692,14 @@
           <w:numId w:val="15"/>
         </w:numPr>
       </w:pPr>
-      <w:bookmarkStart w:id="1" w:name="_Toc243523909"/>
+      <w:bookmarkStart w:id="3" w:name="_Toc243645633"/>
       <w:r>
         <w:rPr>
           <w:rFonts w:hint="eastAsia"/>
         </w:rPr>
         <w:t>게임정보</w:t>
       </w:r>
-      <w:bookmarkEnd w:id="1"/>
+      <w:bookmarkEnd w:id="3"/>
     </w:p>
     <w:p>
       <w:pPr>
@@ -3999,14 +4710,14 @@
         </w:numPr>
         <w:ind w:hanging="566"/>
       </w:pPr>
-      <w:bookmarkStart w:id="2" w:name="_Toc243523910"/>
+      <w:bookmarkStart w:id="4" w:name="_Toc243645634"/>
       <w:r>
         <w:rPr>
           <w:rFonts w:hint="eastAsia"/>
         </w:rPr>
         <w:t>개요</w:t>
       </w:r>
-      <w:bookmarkEnd w:id="2"/>
+      <w:bookmarkEnd w:id="4"/>
     </w:p>
     <w:tbl>
       <w:tblPr>
@@ -4155,23 +4866,13 @@
                 <w:lang w:val="en-US"/>
               </w:rPr>
             </w:pPr>
-            <w:proofErr w:type="spellStart"/>
             <w:r>
               <w:rPr>
                 <w:rFonts w:ascii="맑은 고딕" w:eastAsia="맑은 고딕" w:hAnsi="맑은 고딕" w:cs="굴림"/>
                 <w:color w:val="000000"/>
                 <w:lang w:val="en-US"/>
               </w:rPr>
-              <w:t>좀비소울</w:t>
-            </w:r>
-            <w:proofErr w:type="spellEnd"/>
-            <w:r>
-              <w:rPr>
-                <w:rFonts w:ascii="맑은 고딕" w:eastAsia="맑은 고딕" w:hAnsi="맑은 고딕" w:cs="굴림"/>
-                <w:color w:val="000000"/>
-                <w:lang w:val="en-US"/>
-              </w:rPr>
-              <w:t xml:space="preserve"> </w:t>
+              <w:t xml:space="preserve">좀비소울 </w:t>
             </w:r>
             <w:r>
               <w:rPr>
@@ -4277,7 +4978,7 @@
                 <w:color w:val="000000"/>
                 <w:lang w:val="en-US"/>
               </w:rPr>
-              <w:t>크</w:t>
+              <w:t>트</w:t>
             </w:r>
             <w:proofErr w:type="spellEnd"/>
             <w:r>
@@ -4451,76 +5152,62 @@
           <w:numId w:val="17"/>
         </w:numPr>
       </w:pPr>
-      <w:bookmarkStart w:id="3" w:name="_Ref243352566"/>
-      <w:bookmarkStart w:id="4" w:name="_Ref243352572"/>
-      <w:bookmarkStart w:id="5" w:name="_Ref243352581"/>
-      <w:bookmarkStart w:id="6" w:name="_Toc243523911"/>
+      <w:bookmarkStart w:id="5" w:name="_Ref243352566"/>
+      <w:bookmarkStart w:id="6" w:name="_Ref243352572"/>
+      <w:bookmarkStart w:id="7" w:name="_Ref243352581"/>
+      <w:bookmarkStart w:id="8" w:name="_Toc243645635"/>
       <w:r>
         <w:rPr>
           <w:rFonts w:hint="eastAsia"/>
         </w:rPr>
         <w:t>컨셉</w:t>
       </w:r>
-      <w:bookmarkEnd w:id="3"/>
-      <w:bookmarkEnd w:id="4"/>
       <w:bookmarkEnd w:id="5"/>
       <w:bookmarkEnd w:id="6"/>
-    </w:p>
-    <w:p>
-      <w:r>
-        <w:rPr>
-          <w:rFonts w:hint="eastAsia"/>
-        </w:rPr>
-        <w:t xml:space="preserve">매 판 주어지는 </w:t>
+      <w:bookmarkEnd w:id="7"/>
+      <w:bookmarkEnd w:id="8"/>
+    </w:p>
+    <w:p>
+      <w:r>
+        <w:rPr>
+          <w:rFonts w:hint="eastAsia"/>
+        </w:rPr>
+        <w:t>매 판 주어지는 랜덤한 능력과 플레이어의 조작 역량을 결합하여 스테이지를 클리어한다.</w:t>
+      </w:r>
+    </w:p>
+    <w:p>
+      <w:r>
+        <w:rPr>
+          <w:rFonts w:hint="eastAsia"/>
+        </w:rPr>
+        <w:t xml:space="preserve">좀비 컨셉의 플레이어 캐릭터가 인간형 적(범죄자 / 악인 / CEO ) 과 외계인을 물리쳐 DAN(경험치)를 획득한다. 획득한 </w:t>
       </w:r>
       <w:proofErr w:type="spellStart"/>
       <w:r>
         <w:rPr>
           <w:rFonts w:hint="eastAsia"/>
         </w:rPr>
-        <w:t>랜덤한</w:t>
+        <w:t>DNA는</w:t>
       </w:r>
       <w:proofErr w:type="spellEnd"/>
       <w:r>
         <w:rPr>
           <w:rFonts w:hint="eastAsia"/>
         </w:rPr>
-        <w:t xml:space="preserve"> 능력과 플레이어의 조작 역량을 결합하여 스테이지를 클리어한다.</w:t>
-      </w:r>
-    </w:p>
-    <w:p>
-      <w:r>
-        <w:rPr>
-          <w:rFonts w:hint="eastAsia"/>
-        </w:rPr>
-        <w:t xml:space="preserve">좀비 컨셉의 플레이어 캐릭터가 인간형 적(범죄자 / 악인 / CEO ) 과 외계인을 물리쳐 DAN(경험치)를 획득한다. 획득한 </w:t>
+        <w:t xml:space="preserve"> </w:t>
       </w:r>
       <w:proofErr w:type="spellStart"/>
       <w:r>
         <w:rPr>
           <w:rFonts w:hint="eastAsia"/>
         </w:rPr>
-        <w:t>DNA는</w:t>
+        <w:t>인게임</w:t>
       </w:r>
       <w:proofErr w:type="spellEnd"/>
       <w:r>
         <w:rPr>
           <w:rFonts w:hint="eastAsia"/>
         </w:rPr>
-        <w:t xml:space="preserve"> </w:t>
-      </w:r>
-      <w:proofErr w:type="spellStart"/>
-      <w:r>
-        <w:rPr>
-          <w:rFonts w:hint="eastAsia"/>
-        </w:rPr>
-        <w:t>인게임</w:t>
-      </w:r>
-      <w:proofErr w:type="spellEnd"/>
-      <w:r>
-        <w:rPr>
-          <w:rFonts w:hint="eastAsia"/>
-        </w:rPr>
         <w:t xml:space="preserve"> 내의 성장 요소로 작용하여 스킬과 </w:t>
       </w:r>
     </w:p>
@@ -4530,21 +5217,7 @@
         <w:rPr>
           <w:rFonts w:hint="eastAsia"/>
         </w:rPr>
-        <w:t xml:space="preserve">저주 유물과 리스크 유물을 도입하여 강력한 이점과 동시에 </w:t>
-      </w:r>
-      <w:proofErr w:type="spellStart"/>
-      <w:r>
-        <w:rPr>
-          <w:rFonts w:hint="eastAsia"/>
-        </w:rPr>
-        <w:t>패널티를</w:t>
-      </w:r>
-      <w:proofErr w:type="spellEnd"/>
-      <w:r>
-        <w:rPr>
-          <w:rFonts w:hint="eastAsia"/>
-        </w:rPr>
-        <w:t xml:space="preserve"> 부과.</w:t>
+        <w:t>저주 유물과 리스크 유물을 도입하여 강력한 이점과 동시에 패널티를 부과.</w:t>
       </w:r>
     </w:p>
     <w:p/>
@@ -4556,14 +5229,14 @@
           <w:numId w:val="15"/>
         </w:numPr>
       </w:pPr>
-      <w:bookmarkStart w:id="7" w:name="_Toc243523912"/>
+      <w:bookmarkStart w:id="9" w:name="_Toc243645636"/>
       <w:r>
         <w:rPr>
           <w:rFonts w:hint="eastAsia"/>
         </w:rPr>
         <w:t>개발 환경 및 규칙</w:t>
       </w:r>
-      <w:bookmarkEnd w:id="7"/>
+      <w:bookmarkEnd w:id="9"/>
     </w:p>
     <w:p>
       <w:pPr>
@@ -4594,7 +5267,39 @@
         <w:rPr>
           <w:rFonts w:hint="eastAsia"/>
         </w:rPr>
-        <w:t>카멜 표기법 사용</w:t>
+        <w:t xml:space="preserve">클래스 명, 메서드 명 </w:t>
+      </w:r>
+      <w:r>
+        <w:rPr>
+          <w:rFonts w:hint="eastAsia"/>
+        </w:rPr>
+        <w:t xml:space="preserve"> =&gt; 파스칼</w:t>
+      </w:r>
+      <w:r>
+        <w:rPr>
+          <w:rFonts w:hint="eastAsia"/>
+        </w:rPr>
+        <w:t xml:space="preserve"> 표기법 사용</w:t>
+      </w:r>
+      <w:r>
+        <w:rPr>
+          <w:rFonts w:hint="eastAsia"/>
+        </w:rPr>
+        <w:t xml:space="preserve"> (</w:t>
+      </w:r>
+      <w:proofErr w:type="spellStart"/>
+      <w:r>
+        <w:rPr>
+          <w:rFonts w:hint="eastAsia"/>
+        </w:rPr>
+        <w:t>ex:PlayContoroller</w:t>
+      </w:r>
+      <w:proofErr w:type="spellEnd"/>
+      <w:r>
+        <w:rPr>
+          <w:rFonts w:hint="eastAsia"/>
+        </w:rPr>
+        <w:t>)</w:t>
       </w:r>
     </w:p>
     <w:p>
@@ -4606,6 +5311,26 @@
         </w:numPr>
         <w:ind w:leftChars="0"/>
       </w:pPr>
+      <w:r>
+        <w:rPr>
+          <w:rFonts w:hint="eastAsia"/>
+        </w:rPr>
+        <w:t>변수 명 =&gt; 카멜 표기법 (</w:t>
+      </w:r>
+      <w:proofErr w:type="spellStart"/>
+      <w:r>
+        <w:rPr>
+          <w:rFonts w:hint="eastAsia"/>
+        </w:rPr>
+        <w:t>ex:moveSpeed</w:t>
+      </w:r>
+      <w:proofErr w:type="spellEnd"/>
+      <w:r>
+        <w:rPr>
+          <w:rFonts w:hint="eastAsia"/>
+        </w:rPr>
+        <w:t xml:space="preserve">) </w:t>
+      </w:r>
     </w:p>
     <w:p>
       <w:pPr>
@@ -4621,11 +5346,18 @@
           <w:numId w:val="15"/>
         </w:numPr>
       </w:pPr>
+      <w:bookmarkStart w:id="10" w:name="_Toc243645637"/>
       <w:r>
         <w:t>최종 점수 산정 방식</w:t>
       </w:r>
-    </w:p>
-    <w:p>
+      <w:bookmarkEnd w:id="10"/>
+    </w:p>
+    <w:p>
+      <w:pPr>
+        <w:rPr>
+          <w:rFonts w:hint="eastAsia"/>
+        </w:rPr>
+      </w:pPr>
       <w:r>
         <w:rPr>
           <w:rFonts w:hint="eastAsia"/>
@@ -4633,7 +5365,6 @@
         <w:t>최종 점수 = (기본 획득 점수 + 클리어 보너스) * 난이도 배율</w:t>
       </w:r>
     </w:p>
-    <w:p/>
     <w:p>
       <w:r>
         <w:rPr>
@@ -4648,18 +5379,6 @@
           <w:rFonts w:hint="eastAsia"/>
         </w:rPr>
         <w:t>클리어 보너스 = ( 1080 - 실제 플레이 타임 (초) ) * 10 // 테스트 후 확정</w:t>
-      </w:r>
-    </w:p>
-    <w:p>
-      <w:pPr>
-        <w:rPr>
-          <w:color w:val="000000"/>
-          <w:sz w:val="28"/>
-          <w:szCs w:val="28"/>
-        </w:rPr>
-      </w:pPr>
-      <w:r>
-        <w:br w:type="page"/>
       </w:r>
     </w:p>
     <w:p>
@@ -4670,7 +5389,7 @@
           <w:numId w:val="15"/>
         </w:numPr>
       </w:pPr>
-      <w:bookmarkStart w:id="8" w:name="_Toc243523913"/>
+      <w:bookmarkStart w:id="11" w:name="_Toc243645638"/>
       <w:r>
         <w:rPr>
           <w:rFonts w:hint="eastAsia"/>
@@ -4678,7 +5397,7 @@
         <w:lastRenderedPageBreak/>
         <w:t>게임 플로우</w:t>
       </w:r>
-      <w:bookmarkEnd w:id="8"/>
+      <w:bookmarkEnd w:id="11"/>
     </w:p>
     <w:p>
       <w:pPr>
@@ -4688,16 +5407,16 @@
           <w:numId w:val="15"/>
         </w:numPr>
       </w:pPr>
-      <w:bookmarkStart w:id="9" w:name="_Ref243352619"/>
-      <w:bookmarkStart w:id="10" w:name="_Toc243523914"/>
+      <w:bookmarkStart w:id="12" w:name="_Ref243352619"/>
+      <w:bookmarkStart w:id="13" w:name="_Toc243645639"/>
       <w:r>
         <w:rPr>
           <w:rFonts w:hint="eastAsia"/>
         </w:rPr>
         <w:t>플로우 차트</w:t>
       </w:r>
-      <w:bookmarkEnd w:id="9"/>
-      <w:bookmarkEnd w:id="10"/>
+      <w:bookmarkEnd w:id="12"/>
+      <w:bookmarkEnd w:id="13"/>
     </w:p>
     <w:p>
       <w:r>
@@ -4760,49 +5479,21 @@
           <w:numId w:val="15"/>
         </w:numPr>
       </w:pPr>
-      <w:bookmarkStart w:id="11" w:name="_Toc243523915"/>
+      <w:bookmarkStart w:id="14" w:name="_Toc243645640"/>
       <w:r>
         <w:rPr>
           <w:rFonts w:hint="eastAsia"/>
         </w:rPr>
         <w:t>핵심 게임 루프</w:t>
       </w:r>
-      <w:bookmarkEnd w:id="11"/>
-    </w:p>
-    <w:p>
-      <w:r>
-        <w:rPr>
-          <w:rFonts w:hint="eastAsia"/>
-        </w:rPr>
-        <w:t xml:space="preserve">게임 시작 =&gt; 사전 </w:t>
-      </w:r>
-      <w:proofErr w:type="spellStart"/>
-      <w:r>
-        <w:rPr>
-          <w:rFonts w:hint="eastAsia"/>
-        </w:rPr>
-        <w:t>룰렛</w:t>
-      </w:r>
-      <w:proofErr w:type="spellEnd"/>
-      <w:r>
-        <w:rPr>
-          <w:rFonts w:hint="eastAsia"/>
-        </w:rPr>
-        <w:t xml:space="preserve"> =&gt; 스테이지 전투 =&gt; 엘리트 몬스터 등장 =&gt; 유물 획득 =&gt;  </w:t>
-      </w:r>
-      <w:proofErr w:type="spellStart"/>
-      <w:r>
-        <w:rPr>
-          <w:rFonts w:hint="eastAsia"/>
-        </w:rPr>
-        <w:t>n분</w:t>
-      </w:r>
-      <w:proofErr w:type="spellEnd"/>
-      <w:r>
-        <w:rPr>
-          <w:rFonts w:hint="eastAsia"/>
-        </w:rPr>
-        <w:t xml:space="preserve"> 간격의 보스 등장 =&gt; 증강 획득 =&gt; 최종 보스 클리어 =&gt; 다음 스테이지</w:t>
+      <w:bookmarkEnd w:id="14"/>
+    </w:p>
+    <w:p>
+      <w:r>
+        <w:rPr>
+          <w:rFonts w:hint="eastAsia"/>
+        </w:rPr>
+        <w:t>게임 시작 =&gt; 사전 룰렛 =&gt; 스테이지 전투 =&gt; 엘리트 몬스터 등장 =&gt; 유물 획득 =&gt;  n분 간격의 보스 등장 =&gt; 증강 획득 =&gt; 최종 보스 클리어 =&gt; 다음 스테이지</w:t>
       </w:r>
     </w:p>
     <w:p>
@@ -4825,7 +5516,7 @@
           <w:numId w:val="15"/>
         </w:numPr>
       </w:pPr>
-      <w:bookmarkStart w:id="12" w:name="_Toc243523916"/>
+      <w:bookmarkStart w:id="15" w:name="_Toc243645641"/>
       <w:r>
         <w:rPr>
           <w:rFonts w:hint="eastAsia"/>
@@ -4833,7 +5524,7 @@
         <w:lastRenderedPageBreak/>
         <w:t>핵심 시스템</w:t>
       </w:r>
-      <w:bookmarkEnd w:id="12"/>
+      <w:bookmarkEnd w:id="15"/>
     </w:p>
     <w:p>
       <w:pPr>
@@ -4843,22 +5534,14 @@
           <w:numId w:val="15"/>
         </w:numPr>
       </w:pPr>
-      <w:bookmarkStart w:id="13" w:name="_Toc243523917"/>
-      <w:proofErr w:type="spellStart"/>
-      <w:r>
-        <w:rPr>
-          <w:rFonts w:hint="eastAsia"/>
-        </w:rPr>
-        <w:t>룰렛</w:t>
-      </w:r>
-      <w:proofErr w:type="spellEnd"/>
-      <w:r>
-        <w:rPr>
-          <w:rFonts w:hint="eastAsia"/>
-        </w:rPr>
-        <w:t xml:space="preserve"> 및 선택지 시스템</w:t>
-      </w:r>
-      <w:bookmarkEnd w:id="13"/>
+      <w:bookmarkStart w:id="16" w:name="_Toc243645642"/>
+      <w:r>
+        <w:rPr>
+          <w:rFonts w:hint="eastAsia"/>
+        </w:rPr>
+        <w:t>룰렛 및 선택지 시스템</w:t>
+      </w:r>
+      <w:bookmarkEnd w:id="16"/>
     </w:p>
     <w:p>
       <w:pPr>
@@ -4868,22 +5551,14 @@
           <w:numId w:val="15"/>
         </w:numPr>
       </w:pPr>
-      <w:bookmarkStart w:id="14" w:name="_Toc243523918"/>
-      <w:r>
-        <w:rPr>
-          <w:rFonts w:hint="eastAsia"/>
-        </w:rPr>
-        <w:t xml:space="preserve">사전 </w:t>
-      </w:r>
-      <w:proofErr w:type="spellStart"/>
-      <w:r>
-        <w:rPr>
-          <w:rFonts w:hint="eastAsia"/>
-        </w:rPr>
-        <w:t>룰렛</w:t>
-      </w:r>
-      <w:bookmarkEnd w:id="14"/>
-      <w:proofErr w:type="spellEnd"/>
+      <w:bookmarkStart w:id="17" w:name="_Toc243645643"/>
+      <w:r>
+        <w:rPr>
+          <w:rFonts w:hint="eastAsia"/>
+        </w:rPr>
+        <w:t>사전 룰렛</w:t>
+      </w:r>
+      <w:bookmarkEnd w:id="17"/>
     </w:p>
     <w:p>
       <w:r>
@@ -4892,6 +5567,13 @@
         </w:rPr>
         <w:t>게임 시작 전 초기 능력을 무작위로 획득하여 매 판 새로운 플레이 경험 제공한다.</w:t>
       </w:r>
+    </w:p>
+    <w:p>
+      <w:pPr>
+        <w:rPr>
+          <w:rFonts w:hint="eastAsia"/>
+        </w:rPr>
+      </w:pPr>
     </w:p>
     <w:p>
       <w:pPr>
@@ -4901,14 +5583,14 @@
           <w:numId w:val="15"/>
         </w:numPr>
       </w:pPr>
-      <w:bookmarkStart w:id="15" w:name="_Toc243523919"/>
+      <w:bookmarkStart w:id="18" w:name="_Toc243645644"/>
       <w:r>
         <w:rPr>
           <w:rFonts w:hint="eastAsia"/>
         </w:rPr>
         <w:t>클리어 보상 선택지</w:t>
       </w:r>
-      <w:bookmarkEnd w:id="15"/>
+      <w:bookmarkEnd w:id="18"/>
     </w:p>
     <w:p>
       <w:r>
@@ -4923,6 +5605,13 @@
       <w:r>
         <w:t>.</w:t>
       </w:r>
+    </w:p>
+    <w:p>
+      <w:pPr>
+        <w:rPr>
+          <w:rFonts w:hint="eastAsia"/>
+        </w:rPr>
+      </w:pPr>
     </w:p>
     <w:p>
       <w:pPr>
@@ -4932,7 +5621,7 @@
           <w:numId w:val="15"/>
         </w:numPr>
       </w:pPr>
-      <w:bookmarkStart w:id="16" w:name="_Toc243523920"/>
+      <w:bookmarkStart w:id="19" w:name="_Toc243645645"/>
       <w:r>
         <w:rPr>
           <w:rFonts w:hint="eastAsia"/>
@@ -4953,7 +5642,7 @@
         </w:rPr>
         <w:t xml:space="preserve"> 증강 시스템</w:t>
       </w:r>
-      <w:bookmarkEnd w:id="16"/>
+      <w:bookmarkEnd w:id="19"/>
     </w:p>
     <w:p>
       <w:pPr>
@@ -4963,31 +5652,15 @@
           <w:numId w:val="15"/>
         </w:numPr>
       </w:pPr>
-      <w:bookmarkStart w:id="17" w:name="_Toc243523921"/>
+      <w:bookmarkStart w:id="20" w:name="_Toc243645646"/>
       <w:r>
         <w:t>저주/리스크 유물</w:t>
       </w:r>
-      <w:bookmarkEnd w:id="17"/>
-    </w:p>
-    <w:p>
-      <w:r>
-        <w:t xml:space="preserve">엘리트 몬스터 처치 시 획득하며, 강력한 이점과 동시에 치명적인 </w:t>
-      </w:r>
-      <w:proofErr w:type="spellStart"/>
-      <w:r>
-        <w:t>패널티를</w:t>
-      </w:r>
-      <w:proofErr w:type="spellEnd"/>
-      <w:r>
-        <w:t xml:space="preserve"> 부과하는 </w:t>
-      </w:r>
-      <w:proofErr w:type="spellStart"/>
-      <w:r>
-        <w:t>하이리스크</w:t>
-      </w:r>
-      <w:proofErr w:type="spellEnd"/>
-      <w:r>
-        <w:t xml:space="preserve"> 하이리턴 요소</w:t>
+      <w:bookmarkEnd w:id="20"/>
+    </w:p>
+    <w:p>
+      <w:r>
+        <w:t>엘리트 몬스터 처치 시 획득하며, 강력한 이점과 동시에 치명적인 패널티를 부과하는 하이리스크 하이리턴 요소</w:t>
       </w:r>
       <w:r>
         <w:rPr>
@@ -5005,31 +5678,18 @@
           <w:numId w:val="15"/>
         </w:numPr>
       </w:pPr>
-      <w:bookmarkStart w:id="18" w:name="_Toc243523922"/>
+      <w:bookmarkStart w:id="21" w:name="_Toc243645647"/>
       <w:r>
         <w:rPr>
           <w:rFonts w:hint="eastAsia"/>
         </w:rPr>
         <w:t>보스 증강</w:t>
       </w:r>
-      <w:bookmarkEnd w:id="18"/>
-    </w:p>
-    <w:p>
-      <w:proofErr w:type="spellStart"/>
-      <w:r>
-        <w:t>n분</w:t>
-      </w:r>
-      <w:proofErr w:type="spellEnd"/>
-      <w:r>
-        <w:t xml:space="preserve"> 간격으로 등장하는 보스를 처치할 경우 플레이어의 </w:t>
-      </w:r>
-      <w:proofErr w:type="spellStart"/>
-      <w:r>
-        <w:t>스탯을</w:t>
-      </w:r>
-      <w:proofErr w:type="spellEnd"/>
-      <w:r>
-        <w:t xml:space="preserve"> 크게 향상시키는 증강</w:t>
+      <w:bookmarkEnd w:id="21"/>
+    </w:p>
+    <w:p>
+      <w:r>
+        <w:t>n분 간격으로 등장하는 보스를 처치할 경우 플레이어의 스탯을 크게 향상시키는 증강</w:t>
       </w:r>
       <w:r>
         <w:rPr>
@@ -5061,16 +5721,16 @@
           <w:numId w:val="15"/>
         </w:numPr>
       </w:pPr>
-      <w:bookmarkStart w:id="19" w:name="_Ref243352888"/>
-      <w:bookmarkStart w:id="20" w:name="_Toc243523923"/>
+      <w:bookmarkStart w:id="22" w:name="_Ref243352888"/>
+      <w:bookmarkStart w:id="23" w:name="_Toc243645648"/>
       <w:r>
         <w:rPr>
           <w:rFonts w:hint="eastAsia"/>
         </w:rPr>
         <w:t>공격 및 스킬 시스템</w:t>
       </w:r>
-      <w:bookmarkEnd w:id="19"/>
-      <w:bookmarkEnd w:id="20"/>
+      <w:bookmarkEnd w:id="22"/>
+      <w:bookmarkEnd w:id="23"/>
     </w:p>
     <w:p/>
     <w:p>
@@ -5722,7 +6382,6 @@
                 <w:lang w:val="en-US"/>
               </w:rPr>
             </w:pPr>
-            <w:proofErr w:type="spellStart"/>
             <w:r>
               <w:rPr>
                 <w:rFonts w:ascii="맑은 고딕" w:eastAsia="맑은 고딕" w:hAnsi="맑은 고딕" w:cs="굴림"/>
@@ -5733,7 +6392,6 @@
               </w:rPr>
               <w:t>Fusion</w:t>
             </w:r>
-            <w:proofErr w:type="spellEnd"/>
           </w:p>
         </w:tc>
         <w:tc>
@@ -5791,14 +6449,14 @@
           <w:numId w:val="15"/>
         </w:numPr>
       </w:pPr>
-      <w:bookmarkStart w:id="21" w:name="_Toc243523924"/>
+      <w:bookmarkStart w:id="24" w:name="_Toc243645649"/>
       <w:r>
         <w:rPr>
           <w:rFonts w:hint="eastAsia"/>
         </w:rPr>
         <w:t>탄환</w:t>
       </w:r>
-      <w:bookmarkEnd w:id="21"/>
+      <w:bookmarkEnd w:id="24"/>
     </w:p>
     <w:p>
       <w:r>
@@ -5891,88 +6549,68 @@
           <w:numId w:val="15"/>
         </w:numPr>
       </w:pPr>
-      <w:bookmarkStart w:id="22" w:name="_Toc243523925"/>
+      <w:bookmarkStart w:id="25" w:name="_Ref243612709"/>
+      <w:bookmarkStart w:id="26" w:name="_Ref243612712"/>
+      <w:bookmarkStart w:id="27" w:name="_Toc243645650"/>
+      <w:r>
+        <w:rPr>
+          <w:rFonts w:hint="eastAsia"/>
+        </w:rPr>
+        <w:t>약공격 스킬</w:t>
+      </w:r>
+      <w:bookmarkEnd w:id="25"/>
+      <w:bookmarkEnd w:id="26"/>
+      <w:bookmarkEnd w:id="27"/>
+    </w:p>
+    <w:p>
+      <w:pPr>
+        <w:rPr>
+          <w:noProof/>
+        </w:rPr>
+      </w:pPr>
+      <w:r>
+        <w:rPr>
+          <w:rFonts w:hint="eastAsia"/>
+        </w:rPr>
+        <w:t>엘리</w:t>
+      </w:r>
+      <w:r>
+        <w:rPr>
+          <w:rFonts w:hint="eastAsia"/>
+        </w:rPr>
+        <w:t>트</w:t>
+      </w:r>
+      <w:r>
+        <w:rPr>
+          <w:rFonts w:hint="eastAsia"/>
+        </w:rPr>
+        <w:t>와 보스</w:t>
+      </w:r>
+      <w:r>
+        <w:rPr>
+          <w:rFonts w:hint="eastAsia"/>
+        </w:rPr>
+        <w:t xml:space="preserve"> 몬스터</w:t>
+      </w:r>
+      <w:r>
+        <w:rPr>
+          <w:rFonts w:hint="eastAsia"/>
+        </w:rPr>
+        <w:t xml:space="preserve">를 상대하기 위한 주요 수단으로 </w:t>
+      </w:r>
       <w:proofErr w:type="spellStart"/>
       <w:r>
         <w:rPr>
           <w:rFonts w:hint="eastAsia"/>
         </w:rPr>
-        <w:t>약공격</w:t>
+        <w:t>설정한다.이동</w:t>
       </w:r>
       <w:proofErr w:type="spellEnd"/>
       <w:r>
         <w:rPr>
           <w:rFonts w:hint="eastAsia"/>
         </w:rPr>
-        <w:t xml:space="preserve"> 스킬</w:t>
-      </w:r>
-      <w:bookmarkEnd w:id="22"/>
-    </w:p>
-    <w:p>
-      <w:pPr>
-        <w:rPr>
-          <w:noProof/>
-        </w:rPr>
-      </w:pPr>
-      <w:r>
-        <w:rPr>
-          <w:rFonts w:hint="eastAsia"/>
-        </w:rPr>
-        <w:t>엘리</w:t>
-      </w:r>
-      <w:r>
-        <w:rPr>
-          <w:rFonts w:hint="eastAsia"/>
-        </w:rPr>
-        <w:t>트</w:t>
-      </w:r>
-      <w:r>
-        <w:rPr>
-          <w:rFonts w:hint="eastAsia"/>
-        </w:rPr>
-        <w:t>와 보스</w:t>
-      </w:r>
-      <w:r>
-        <w:rPr>
-          <w:rFonts w:hint="eastAsia"/>
-        </w:rPr>
-        <w:t xml:space="preserve"> 몬스터</w:t>
-      </w:r>
-      <w:r>
-        <w:rPr>
-          <w:rFonts w:hint="eastAsia"/>
-        </w:rPr>
-        <w:t xml:space="preserve">를 상대하기 위한 주요 수단으로 </w:t>
-      </w:r>
-      <w:proofErr w:type="spellStart"/>
-      <w:proofErr w:type="gramStart"/>
-      <w:r>
-        <w:rPr>
-          <w:rFonts w:hint="eastAsia"/>
-        </w:rPr>
-        <w:t>설정한다.이동</w:t>
-      </w:r>
-      <w:proofErr w:type="spellEnd"/>
-      <w:proofErr w:type="gramEnd"/>
-      <w:r>
-        <w:rPr>
-          <w:rFonts w:hint="eastAsia"/>
-        </w:rPr>
-        <w:t xml:space="preserve"> 중 적을 공격하여 즉시 </w:t>
-      </w:r>
-      <w:proofErr w:type="spellStart"/>
-      <w:r>
-        <w:rPr>
-          <w:rFonts w:hint="eastAsia"/>
-        </w:rPr>
-        <w:t>시전되는</w:t>
-      </w:r>
-      <w:proofErr w:type="spellEnd"/>
-      <w:r>
-        <w:rPr>
-          <w:rFonts w:hint="eastAsia"/>
-        </w:rPr>
-        <w:t xml:space="preserve"> 공격이</w:t>
+        <w:t xml:space="preserve"> 중 적을 공격하여 즉시 시전되는 공격이</w:t>
       </w:r>
       <w:r>
         <w:rPr>
@@ -5984,73 +6622,16 @@
         <w:rPr>
           <w:rFonts w:hint="eastAsia"/>
         </w:rPr>
+        <w:t xml:space="preserve"> 약공격 버튼을 눌러서 사용 가능하다.</w:t>
+      </w:r>
+      <w:r>
+        <w:rPr>
+          <w:rFonts w:hint="eastAsia"/>
+        </w:rPr>
         <w:t xml:space="preserve"> </w:t>
       </w:r>
-      <w:proofErr w:type="spellStart"/>
-      <w:r>
-        <w:rPr>
-          <w:rFonts w:hint="eastAsia"/>
-        </w:rPr>
-        <w:t>약공격</w:t>
-      </w:r>
-      <w:proofErr w:type="spellEnd"/>
-      <w:r>
-        <w:rPr>
-          <w:rFonts w:hint="eastAsia"/>
-        </w:rPr>
-        <w:t xml:space="preserve"> 버튼을 눌러서 사용 가능하다.</w:t>
-      </w:r>
-      <w:r>
-        <w:rPr>
-          <w:rFonts w:hint="eastAsia"/>
-        </w:rPr>
-        <w:t xml:space="preserve"> 모든 </w:t>
-      </w:r>
-      <w:proofErr w:type="spellStart"/>
-      <w:r>
-        <w:rPr>
-          <w:rFonts w:hint="eastAsia"/>
-        </w:rPr>
-        <w:t>약공격</w:t>
-      </w:r>
-      <w:proofErr w:type="spellEnd"/>
-      <w:r>
-        <w:rPr>
-          <w:rFonts w:hint="eastAsia"/>
-        </w:rPr>
-        <w:t xml:space="preserve"> 스킬은</w:t>
-      </w:r>
-      <w:r>
-        <w:rPr>
-          <w:rFonts w:hint="eastAsia"/>
-        </w:rPr>
-        <w:t xml:space="preserve"> </w:t>
-      </w:r>
-      <w:r>
-        <w:rPr>
-          <w:rFonts w:hint="eastAsia"/>
-        </w:rPr>
-        <w:t>시전 대기 시간 (</w:t>
-      </w:r>
-      <w:proofErr w:type="spellStart"/>
-      <w:r>
-        <w:rPr>
-          <w:rFonts w:hint="eastAsia"/>
-        </w:rPr>
-        <w:t>쿨다운</w:t>
-      </w:r>
-      <w:proofErr w:type="spellEnd"/>
-      <w:r>
-        <w:rPr>
-          <w:rFonts w:hint="eastAsia"/>
-        </w:rPr>
-        <w:t>)을 2초 이내로 설정한다.</w:t>
-      </w:r>
-      <w:r>
-        <w:rPr>
-          <w:rFonts w:hint="eastAsia"/>
-        </w:rPr>
-        <w:t xml:space="preserve"> </w:t>
+      <w:r>
+        <w:t>애니메이션으로 공격의 딜레이를 준다.</w:t>
       </w:r>
       <w:r>
         <w:rPr>
@@ -6110,72 +6691,38 @@
           <w:bCs/>
         </w:rPr>
       </w:pPr>
-      <w:proofErr w:type="spellStart"/>
       <w:r>
         <w:rPr>
           <w:rFonts w:hint="eastAsia"/>
           <w:b/>
           <w:bCs/>
         </w:rPr>
-        <w:t>약공격</w:t>
-      </w:r>
-      <w:proofErr w:type="spellEnd"/>
-      <w:r>
-        <w:rPr>
-          <w:rFonts w:hint="eastAsia"/>
+        <w:t>약공격 버튼</w:t>
+      </w:r>
+    </w:p>
+    <w:p>
+      <w:r>
+        <w:rPr>
+          <w:rFonts w:hint="eastAsia"/>
+        </w:rPr>
+        <w:t xml:space="preserve">버튼을 누르면 지니고 있는 약공격 스킬이 사용된다. </w:t>
+      </w:r>
+    </w:p>
+    <w:p/>
+    <w:p>
+      <w:pPr>
+        <w:rPr>
           <w:b/>
           <w:bCs/>
         </w:rPr>
-        <w:t xml:space="preserve"> 버튼</w:t>
-      </w:r>
-    </w:p>
-    <w:p>
-      <w:r>
-        <w:rPr>
-          <w:rFonts w:hint="eastAsia"/>
-        </w:rPr>
-        <w:t xml:space="preserve">버튼을 누르면 지니고 있는 </w:t>
-      </w:r>
-      <w:proofErr w:type="spellStart"/>
-      <w:r>
-        <w:rPr>
-          <w:rFonts w:hint="eastAsia"/>
-        </w:rPr>
-        <w:t>약공격</w:t>
-      </w:r>
-      <w:proofErr w:type="spellEnd"/>
-      <w:r>
-        <w:rPr>
-          <w:rFonts w:hint="eastAsia"/>
-        </w:rPr>
-        <w:t xml:space="preserve"> 스킬이 사용된다. </w:t>
-      </w:r>
-    </w:p>
-    <w:p/>
-    <w:p>
-      <w:pPr>
-        <w:rPr>
+      </w:pPr>
+      <w:r>
+        <w:rPr>
+          <w:rFonts w:hint="eastAsia"/>
           <w:b/>
           <w:bCs/>
         </w:rPr>
-      </w:pPr>
-      <w:proofErr w:type="spellStart"/>
-      <w:r>
-        <w:rPr>
-          <w:rFonts w:hint="eastAsia"/>
-          <w:b/>
-          <w:bCs/>
-        </w:rPr>
-        <w:t>약공격</w:t>
-      </w:r>
-      <w:proofErr w:type="spellEnd"/>
-      <w:r>
-        <w:rPr>
-          <w:rFonts w:hint="eastAsia"/>
-          <w:b/>
-          <w:bCs/>
-        </w:rPr>
-        <w:t xml:space="preserve"> </w:t>
+        <w:t xml:space="preserve">약공격 </w:t>
       </w:r>
     </w:p>
     <w:p>
@@ -6207,22 +6754,14 @@
           <w:numId w:val="15"/>
         </w:numPr>
       </w:pPr>
-      <w:bookmarkStart w:id="23" w:name="_Toc243523926"/>
-      <w:proofErr w:type="spellStart"/>
-      <w:r>
-        <w:rPr>
-          <w:rFonts w:hint="eastAsia"/>
-        </w:rPr>
-        <w:t>강공격</w:t>
-      </w:r>
-      <w:proofErr w:type="spellEnd"/>
-      <w:r>
-        <w:rPr>
-          <w:rFonts w:hint="eastAsia"/>
-        </w:rPr>
-        <w:t xml:space="preserve"> 스킬</w:t>
-      </w:r>
-      <w:bookmarkEnd w:id="23"/>
+      <w:bookmarkStart w:id="28" w:name="_Toc243645651"/>
+      <w:r>
+        <w:rPr>
+          <w:rFonts w:hint="eastAsia"/>
+        </w:rPr>
+        <w:t>강공격 스킬</w:t>
+      </w:r>
+      <w:bookmarkEnd w:id="28"/>
     </w:p>
     <w:p>
       <w:r>
@@ -6231,47 +6770,11 @@
         </w:rPr>
         <w:t xml:space="preserve">보스 몬스터를 주력으로 상대하기 위한 수단으로 설정한다. </w:t>
       </w:r>
-      <w:proofErr w:type="spellStart"/>
-      <w:r>
-        <w:rPr>
-          <w:rFonts w:hint="eastAsia"/>
-        </w:rPr>
-        <w:t>강공격</w:t>
-      </w:r>
-      <w:proofErr w:type="spellEnd"/>
-      <w:r>
-        <w:rPr>
-          <w:rFonts w:hint="eastAsia"/>
-        </w:rPr>
-        <w:t xml:space="preserve"> 버튼을 누르면 사용 가능하며 플레이어에게 </w:t>
-      </w:r>
-      <w:proofErr w:type="spellStart"/>
-      <w:r>
-        <w:rPr>
-          <w:rFonts w:hint="eastAsia"/>
-        </w:rPr>
-        <w:t>차징</w:t>
-      </w:r>
-      <w:proofErr w:type="spellEnd"/>
-      <w:r>
-        <w:rPr>
-          <w:rFonts w:hint="eastAsia"/>
-        </w:rPr>
-        <w:t xml:space="preserve"> 혹은 시전시간이 요구된다. </w:t>
-      </w:r>
-      <w:proofErr w:type="spellStart"/>
-      <w:r>
-        <w:rPr>
-          <w:rFonts w:hint="eastAsia"/>
-        </w:rPr>
-        <w:t>시전시간은</w:t>
-      </w:r>
-      <w:proofErr w:type="spellEnd"/>
-      <w:r>
-        <w:rPr>
-          <w:rFonts w:hint="eastAsia"/>
-        </w:rPr>
-        <w:t xml:space="preserve"> 1초 미만으로 설정한다.</w:t>
+      <w:r>
+        <w:rPr>
+          <w:rFonts w:hint="eastAsia"/>
+        </w:rPr>
+        <w:t>강공격 버튼을 누르면 사용 가능하며 플레이어에게 차징 혹은 시전시간이 요구된다. 시전시간은 1초 미만으로 설정한다.</w:t>
       </w:r>
     </w:p>
     <w:p>
@@ -6353,21 +6856,7 @@
         <w:rPr>
           <w:rFonts w:hint="eastAsia"/>
         </w:rPr>
-        <w:t xml:space="preserve"> 이펙트가 길어지거나 </w:t>
-      </w:r>
-      <w:proofErr w:type="spellStart"/>
-      <w:r>
-        <w:rPr>
-          <w:rFonts w:hint="eastAsia"/>
-        </w:rPr>
-        <w:t>차징</w:t>
-      </w:r>
-      <w:proofErr w:type="spellEnd"/>
-      <w:r>
-        <w:rPr>
-          <w:rFonts w:hint="eastAsia"/>
-        </w:rPr>
-        <w:t xml:space="preserve"> 범위가 넓어지는 등의 가시화 이펙트가 존재한다.</w:t>
+        <w:t xml:space="preserve"> 이펙트가 길어지거나 차징 범위가 넓어지는 등의 가시화 이펙트가 존재한다.</w:t>
       </w:r>
     </w:p>
     <w:p>
@@ -6430,51 +6919,39 @@
           <w:bCs/>
         </w:rPr>
       </w:pPr>
-      <w:proofErr w:type="spellStart"/>
       <w:r>
         <w:rPr>
           <w:rFonts w:hint="eastAsia"/>
           <w:b/>
           <w:bCs/>
         </w:rPr>
-        <w:t>강공격</w:t>
-      </w:r>
-      <w:proofErr w:type="spellEnd"/>
-      <w:r>
-        <w:rPr>
-          <w:rFonts w:hint="eastAsia"/>
+        <w:t>강공격 버튼</w:t>
+      </w:r>
+    </w:p>
+    <w:p>
+      <w:r>
+        <w:rPr>
+          <w:rFonts w:hint="eastAsia"/>
+        </w:rPr>
+        <w:t xml:space="preserve">버튼을 누르고 있으면 강공격의 사용이 가능하다. </w:t>
+      </w:r>
+    </w:p>
+    <w:p/>
+    <w:p>
+      <w:pPr>
+        <w:rPr>
           <w:b/>
           <w:bCs/>
         </w:rPr>
-        <w:t xml:space="preserve"> 버튼</w:t>
-      </w:r>
-    </w:p>
-    <w:p>
-      <w:r>
-        <w:rPr>
-          <w:rFonts w:hint="eastAsia"/>
-        </w:rPr>
-        <w:t xml:space="preserve">버튼을 누르고 있으면 강공격의 사용이 가능하다. </w:t>
-      </w:r>
-    </w:p>
-    <w:p/>
-    <w:p>
-      <w:pPr>
-        <w:rPr>
+      </w:pPr>
+      <w:r>
+        <w:rPr>
+          <w:rFonts w:hint="eastAsia"/>
           <w:b/>
           <w:bCs/>
         </w:rPr>
-      </w:pPr>
-      <w:proofErr w:type="spellStart"/>
-      <w:r>
-        <w:rPr>
-          <w:rFonts w:hint="eastAsia"/>
-          <w:b/>
-          <w:bCs/>
-        </w:rPr>
         <w:t>강공격</w:t>
       </w:r>
-      <w:proofErr w:type="spellEnd"/>
     </w:p>
     <w:p>
       <w:r>
@@ -6510,14 +6987,14 @@
           <w:numId w:val="15"/>
         </w:numPr>
       </w:pPr>
-      <w:bookmarkStart w:id="24" w:name="_Toc243523927"/>
+      <w:bookmarkStart w:id="29" w:name="_Toc243645652"/>
       <w:r>
         <w:rPr>
           <w:rFonts w:hint="eastAsia"/>
         </w:rPr>
         <w:t>보조 전략 스킬</w:t>
       </w:r>
-      <w:bookmarkEnd w:id="24"/>
+      <w:bookmarkEnd w:id="29"/>
     </w:p>
     <w:p>
       <w:r>
@@ -6607,21 +7084,7 @@
         <w:rPr>
           <w:rFonts w:hint="eastAsia"/>
         </w:rPr>
-        <w:t xml:space="preserve">튼을 누르면 즉발로 사용된다. </w:t>
-      </w:r>
-      <w:proofErr w:type="spellStart"/>
-      <w:r>
-        <w:rPr>
-          <w:rFonts w:hint="eastAsia"/>
-        </w:rPr>
-        <w:t>쿨타임은</w:t>
-      </w:r>
-      <w:proofErr w:type="spellEnd"/>
-      <w:r>
-        <w:rPr>
-          <w:rFonts w:hint="eastAsia"/>
-        </w:rPr>
-        <w:t xml:space="preserve"> 6초에서 10초 사이로 제한한다.</w:t>
+        <w:t>튼을 누르면 즉발로 사용된다. 쿨타임은 6초에서 10초 사이로 제한한다.</w:t>
       </w:r>
     </w:p>
     <w:p/>
@@ -6642,19 +7105,11 @@
       </w:r>
     </w:p>
     <w:p>
-      <w:proofErr w:type="spellStart"/>
-      <w:r>
-        <w:rPr>
-          <w:rFonts w:hint="eastAsia"/>
-        </w:rPr>
-        <w:t>스탯의</w:t>
-      </w:r>
-      <w:proofErr w:type="spellEnd"/>
-      <w:r>
-        <w:rPr>
-          <w:rFonts w:hint="eastAsia"/>
-        </w:rPr>
-        <w:t xml:space="preserve"> 강화, 회복, 일시 무적 등이 사용된다. 모든 전략 스킬의 종류는 추후 별도의 표 혹은 테이블로 정리한다.</w:t>
+      <w:r>
+        <w:rPr>
+          <w:rFonts w:hint="eastAsia"/>
+        </w:rPr>
+        <w:t>스탯의 강화, 회복, 일시 무적 등이 사용된다. 모든 전략 스킬의 종류는 추후 별도의 표 혹은 테이블로 정리한다.</w:t>
       </w:r>
     </w:p>
     <w:p/>
@@ -6666,19 +7121,21 @@
           <w:ilvl w:val="2"/>
           <w:numId w:val="15"/>
         </w:numPr>
-      </w:pPr>
-      <w:bookmarkStart w:id="25" w:name="_Ref243523898"/>
-      <w:bookmarkStart w:id="26" w:name="_Toc243523928"/>
+        <w:rPr>
+          <w:rFonts w:hint="eastAsia"/>
+        </w:rPr>
+      </w:pPr>
+      <w:bookmarkStart w:id="30" w:name="_Ref243523898"/>
+      <w:bookmarkStart w:id="31" w:name="_Toc243645653"/>
       <w:r>
         <w:rPr>
           <w:rFonts w:hint="eastAsia"/>
         </w:rPr>
         <w:t>속성 시스템</w:t>
       </w:r>
-      <w:bookmarkEnd w:id="25"/>
-      <w:bookmarkEnd w:id="26"/>
-    </w:p>
-    <w:p/>
+      <w:bookmarkEnd w:id="30"/>
+      <w:bookmarkEnd w:id="31"/>
+    </w:p>
     <w:p>
       <w:r>
         <w:rPr>
@@ -6786,50 +7243,24 @@
           <w:numId w:val="15"/>
         </w:numPr>
       </w:pPr>
+      <w:bookmarkStart w:id="32" w:name="_Toc243645654"/>
       <w:r>
         <w:rPr>
           <w:rFonts w:hint="eastAsia"/>
         </w:rPr>
         <w:t>스킬 조합</w:t>
       </w:r>
-    </w:p>
-    <w:p>
-      <w:r>
-        <w:rPr>
-          <w:rFonts w:hint="eastAsia"/>
-        </w:rPr>
-        <w:lastRenderedPageBreak/>
-        <w:t xml:space="preserve">두가지의 스킬을 조합하여 </w:t>
-      </w:r>
-      <w:proofErr w:type="spellStart"/>
-      <w:r>
-        <w:rPr>
-          <w:rFonts w:hint="eastAsia"/>
-        </w:rPr>
-        <w:t>Fusion</w:t>
-      </w:r>
-      <w:proofErr w:type="spellEnd"/>
-      <w:r>
-        <w:rPr>
-          <w:rFonts w:hint="eastAsia"/>
-        </w:rPr>
-        <w:t xml:space="preserve">  등급으로 만들 수 있다.</w:t>
-      </w:r>
-    </w:p>
-    <w:p>
-      <w:r>
-        <w:br w:type="page"/>
+      <w:bookmarkEnd w:id="32"/>
+    </w:p>
+    <w:p>
+      <w:r>
+        <w:rPr>
+          <w:rFonts w:hint="eastAsia"/>
+        </w:rPr>
+        <w:t>두가지의 스킬을 조합하여 Fusion 등급으로 만들 수 있다.</w:t>
       </w:r>
     </w:p>
     <w:p/>
-    <w:p/>
-    <w:p>
-      <w:pPr>
-        <w:rPr>
-          <w:lang w:eastAsia="ko"/>
-        </w:rPr>
-      </w:pPr>
-    </w:p>
     <w:p>
       <w:pPr>
         <w:pStyle w:val="2"/>
@@ -6838,24 +7269,70 @@
           <w:numId w:val="15"/>
         </w:numPr>
       </w:pPr>
-      <w:bookmarkStart w:id="27" w:name="_Toc243523929"/>
-      <w:r>
-        <w:rPr>
-          <w:rFonts w:hint="eastAsia"/>
-        </w:rPr>
-        <w:t>스테이지 전개 시스템</w:t>
-      </w:r>
-      <w:bookmarkEnd w:id="27"/>
-    </w:p>
-    <w:p>
-      <w:r>
-        <w:t>엘리트 몬스터와 보스가 순차적으로 등장하는 웨이브 형태의 전투를 진행하며, 최종 보스 클리어 시 다음 스테이지로 직행하는 구조</w:t>
-      </w:r>
-      <w:r>
-        <w:rPr>
-          <w:rFonts w:hint="eastAsia"/>
-        </w:rPr>
-        <w:t>이다.</w:t>
+      <w:bookmarkStart w:id="33" w:name="_Toc243645655"/>
+      <w:r>
+        <w:rPr>
+          <w:rFonts w:hint="eastAsia"/>
+        </w:rPr>
+        <w:t>패링 및 방어 시스템</w:t>
+      </w:r>
+      <w:bookmarkEnd w:id="33"/>
+    </w:p>
+    <w:p>
+      <w:r>
+        <w:rPr>
+          <w:rFonts w:hint="eastAsia"/>
+        </w:rPr>
+        <w:t xml:space="preserve">보스의 공격을 막거나 튕겨내는 시스템이다. 단순 회피/공격 반복에서 벗어나, 적의 공격 타이밍에 맞춘 정밀 방어/반격 플레이를 통해 전투 몰입감과 손맛을 극대화한다. </w:t>
+      </w:r>
+      <w:r>
+        <w:rPr>
+          <w:rFonts w:hint="eastAsia"/>
+        </w:rPr>
+        <w:t xml:space="preserve">패링 및 방어 시스템은 플레이어와 </w:t>
+      </w:r>
+      <w:proofErr w:type="spellStart"/>
+      <w:r>
+        <w:rPr>
+          <w:rFonts w:hint="eastAsia"/>
+        </w:rPr>
+        <w:t>에너미</w:t>
+      </w:r>
+      <w:proofErr w:type="spellEnd"/>
+      <w:r>
+        <w:rPr>
+          <w:rFonts w:hint="eastAsia"/>
+        </w:rPr>
+        <w:t xml:space="preserve"> 모두 사용할 수 있는 공통 </w:t>
+      </w:r>
+      <w:proofErr w:type="spellStart"/>
+      <w:r>
+        <w:rPr>
+          <w:rFonts w:hint="eastAsia"/>
+        </w:rPr>
+        <w:t>구조이다</w:t>
+      </w:r>
+      <w:proofErr w:type="spellEnd"/>
+      <w:r>
+        <w:rPr>
+          <w:rFonts w:hint="eastAsia"/>
+        </w:rPr>
+        <w:t xml:space="preserve">. </w:t>
+      </w:r>
+      <w:r>
+        <w:rPr>
+          <w:rFonts w:hint="eastAsia"/>
+        </w:rPr>
+        <w:t xml:space="preserve">상세한 내용은 </w:t>
+      </w:r>
+      <w:r>
+        <w:t>Zomso_Parrying_기획서.docx</w:t>
+      </w:r>
+      <w:r>
+        <w:rPr>
+          <w:rFonts w:hint="eastAsia"/>
+        </w:rPr>
+        <w:t>에서 다룬다.</w:t>
       </w:r>
     </w:p>
     <w:p/>
@@ -6867,7 +7344,7 @@
           <w:numId w:val="15"/>
         </w:numPr>
       </w:pPr>
-      <w:bookmarkStart w:id="28" w:name="_Toc243523930"/>
+      <w:bookmarkStart w:id="34" w:name="_Toc243645656"/>
       <w:r>
         <w:rPr>
           <w:rFonts w:hint="eastAsia"/>
@@ -6880,7 +7357,7 @@
         </w:rPr>
         <w:t>요소</w:t>
       </w:r>
-      <w:bookmarkEnd w:id="28"/>
+      <w:bookmarkEnd w:id="34"/>
     </w:p>
     <w:p>
       <w:pPr>
@@ -6890,59 +7367,29 @@
           <w:numId w:val="15"/>
         </w:numPr>
       </w:pPr>
-      <w:bookmarkStart w:id="29" w:name="_Toc243523931"/>
+      <w:bookmarkStart w:id="35" w:name="_Toc243645657"/>
       <w:r>
         <w:rPr>
           <w:rFonts w:hint="eastAsia"/>
         </w:rPr>
         <w:t>플레이어</w:t>
       </w:r>
-      <w:bookmarkEnd w:id="29"/>
-    </w:p>
-    <w:p>
-      <w:r>
-        <w:rPr>
-          <w:rFonts w:hint="eastAsia"/>
-        </w:rPr>
-        <w:t xml:space="preserve">조작 및 </w:t>
-      </w:r>
-      <w:proofErr w:type="gramStart"/>
-      <w:r>
-        <w:rPr>
-          <w:rFonts w:hint="eastAsia"/>
-        </w:rPr>
-        <w:t>생존 :</w:t>
-      </w:r>
-      <w:proofErr w:type="gramEnd"/>
-      <w:r>
-        <w:rPr>
-          <w:rFonts w:hint="eastAsia"/>
-        </w:rPr>
-        <w:t xml:space="preserve"> 기본 이동, </w:t>
-      </w:r>
-      <w:proofErr w:type="spellStart"/>
-      <w:r>
-        <w:rPr>
-          <w:rFonts w:hint="eastAsia"/>
-        </w:rPr>
-        <w:t>회피기</w:t>
-      </w:r>
-      <w:proofErr w:type="spellEnd"/>
-    </w:p>
-    <w:p>
-      <w:proofErr w:type="gramStart"/>
-      <w:r>
-        <w:rPr>
-          <w:rFonts w:hint="eastAsia"/>
-        </w:rPr>
-        <w:t>전투 :</w:t>
-      </w:r>
-      <w:proofErr w:type="gramEnd"/>
-      <w:r>
-        <w:rPr>
-          <w:rFonts w:hint="eastAsia"/>
-        </w:rPr>
-        <w:t xml:space="preserve"> 무기 1종을 활용한 자동 공격, 3개의 액티브 스킬</w:t>
+      <w:bookmarkEnd w:id="35"/>
+    </w:p>
+    <w:p>
+      <w:r>
+        <w:rPr>
+          <w:rFonts w:hint="eastAsia"/>
+        </w:rPr>
+        <w:t>조작 및 생존 : 기본 이동, 회피기</w:t>
+      </w:r>
+    </w:p>
+    <w:p>
+      <w:r>
+        <w:rPr>
+          <w:rFonts w:hint="eastAsia"/>
+        </w:rPr>
+        <w:t>전투 : 무기 1종을 활용한 자동 공격, 3개의 액티브 스킬</w:t>
       </w:r>
     </w:p>
     <w:p/>
@@ -6954,45 +7401,31 @@
           <w:numId w:val="15"/>
         </w:numPr>
       </w:pPr>
-      <w:bookmarkStart w:id="30" w:name="_Toc243523932"/>
+      <w:bookmarkStart w:id="36" w:name="_Ref243612752"/>
+      <w:bookmarkStart w:id="37" w:name="_Toc243645658"/>
       <w:r>
         <w:rPr>
           <w:rFonts w:hint="eastAsia"/>
         </w:rPr>
         <w:t>몬스터</w:t>
       </w:r>
-      <w:bookmarkEnd w:id="30"/>
-    </w:p>
-    <w:p>
-      <w:proofErr w:type="gramStart"/>
-      <w:r>
-        <w:rPr>
-          <w:rFonts w:hint="eastAsia"/>
-        </w:rPr>
-        <w:t>일반 :</w:t>
-      </w:r>
-      <w:proofErr w:type="gramEnd"/>
-      <w:r>
-        <w:rPr>
-          <w:rFonts w:hint="eastAsia"/>
-        </w:rPr>
-        <w:t xml:space="preserve"> 플레이어 추적, 충돌 데미지, 투사체 공격</w:t>
-      </w:r>
-    </w:p>
-    <w:p>
-      <w:proofErr w:type="gramStart"/>
-      <w:r>
-        <w:rPr>
-          <w:rFonts w:hint="eastAsia"/>
-        </w:rPr>
-        <w:t>엘리트 :</w:t>
-      </w:r>
-      <w:proofErr w:type="gramEnd"/>
-      <w:r>
-        <w:rPr>
-          <w:rFonts w:hint="eastAsia"/>
-        </w:rPr>
-        <w:t xml:space="preserve"> 처치 시 특수 보상 제공 (유물)</w:t>
+      <w:bookmarkEnd w:id="36"/>
+      <w:bookmarkEnd w:id="37"/>
+    </w:p>
+    <w:p>
+      <w:r>
+        <w:rPr>
+          <w:rFonts w:hint="eastAsia"/>
+        </w:rPr>
+        <w:t>일반 : 플레이어 추적, 충돌 데미지, 투사체 공격</w:t>
+      </w:r>
+    </w:p>
+    <w:p>
+      <w:r>
+        <w:rPr>
+          <w:rFonts w:hint="eastAsia"/>
+        </w:rPr>
+        <w:t>엘리트 : 처치 시 특수 보상 제공 (유물)</w:t>
       </w:r>
     </w:p>
     <w:p>
@@ -7011,13 +7444,18 @@
         </w:rPr>
         <w:t>.</w:t>
       </w:r>
-    </w:p>
-    <w:p>
-      <w:pPr>
+      <w:r>
+        <w:rPr>
+          <w:rFonts w:hint="eastAsia"/>
+        </w:rPr>
+        <w:t xml:space="preserve"> </w:t>
+      </w:r>
+      <w:r>
         <w:rPr>
           <w:lang w:eastAsia="ko"/>
         </w:rPr>
-      </w:pPr>
+        <w:t>(실제 테스트 후 가시성 확인 필요)</w:t>
+      </w:r>
     </w:p>
     <w:p>
       <w:r>
@@ -7071,7 +7509,6 @@
         </w:drawing>
       </w:r>
     </w:p>
-    <w:p/>
     <w:p>
       <w:pPr>
         <w:rPr>
@@ -7093,14 +7530,7 @@
         <w:rPr>
           <w:rFonts w:hint="eastAsia"/>
         </w:rPr>
-        <w:t xml:space="preserve">몬스터의 </w:t>
-      </w:r>
-      <w:proofErr w:type="spellStart"/>
-      <w:r>
-        <w:rPr>
-          <w:rFonts w:hint="eastAsia"/>
-        </w:rPr>
-        <w:t>H</w:t>
+        <w:t>몬스터의 H</w:t>
       </w:r>
       <w:r>
         <w:t>p</w:t>
@@ -7109,16 +7539,10 @@
         <w:rPr>
           <w:rFonts w:hint="eastAsia"/>
         </w:rPr>
-        <w:t>bar가</w:t>
-      </w:r>
-      <w:proofErr w:type="spellEnd"/>
-      <w:r>
-        <w:rPr>
-          <w:rFonts w:hint="eastAsia"/>
-        </w:rPr>
-        <w:t xml:space="preserve"> 보이지 않는다.</w:t>
-      </w:r>
-    </w:p>
+        <w:t>bar가 보이지 않는다.</w:t>
+      </w:r>
+    </w:p>
+    <w:p/>
     <w:p/>
     <w:p>
       <w:r>
@@ -7193,49 +7617,7 @@
         <w:rPr>
           <w:rFonts w:hint="eastAsia"/>
         </w:rPr>
-        <w:t xml:space="preserve">피격으로 인해 </w:t>
-      </w:r>
-      <w:proofErr w:type="spellStart"/>
-      <w:r>
-        <w:rPr>
-          <w:rFonts w:hint="eastAsia"/>
-        </w:rPr>
-        <w:t>Hp가</w:t>
-      </w:r>
-      <w:proofErr w:type="spellEnd"/>
-      <w:r>
-        <w:rPr>
-          <w:rFonts w:hint="eastAsia"/>
-        </w:rPr>
-        <w:t xml:space="preserve"> 감소하였을 </w:t>
-      </w:r>
-      <w:proofErr w:type="gramStart"/>
-      <w:r>
-        <w:rPr>
-          <w:rFonts w:hint="eastAsia"/>
-        </w:rPr>
-        <w:t xml:space="preserve">때,  </w:t>
-      </w:r>
-      <w:proofErr w:type="spellStart"/>
-      <w:r>
-        <w:rPr>
-          <w:rFonts w:hint="eastAsia"/>
-        </w:rPr>
-        <w:t>Hpbar</w:t>
-      </w:r>
-      <w:proofErr w:type="gramEnd"/>
-      <w:r>
-        <w:rPr>
-          <w:rFonts w:hint="eastAsia"/>
-        </w:rPr>
-        <w:t>가</w:t>
-      </w:r>
-      <w:proofErr w:type="spellEnd"/>
-      <w:r>
-        <w:rPr>
-          <w:rFonts w:hint="eastAsia"/>
-        </w:rPr>
-        <w:t xml:space="preserve"> 가시화되며 감소된 만큼 표기해준다.</w:t>
+        <w:t>피격으로 인해 Hp가 감소하였을 때,  Hpbar가 가시화되며 감소된 만큼 표기해준다.</w:t>
       </w:r>
     </w:p>
     <w:p/>
@@ -7247,7 +7629,8 @@
           <w:numId w:val="15"/>
         </w:numPr>
       </w:pPr>
-      <w:bookmarkStart w:id="31" w:name="_Toc243523933"/>
+      <w:bookmarkStart w:id="38" w:name="_Ref243612776"/>
+      <w:bookmarkStart w:id="39" w:name="_Toc243645659"/>
       <w:r>
         <w:rPr>
           <w:rFonts w:hint="eastAsia"/>
@@ -7255,31 +7638,117 @@
         <w:lastRenderedPageBreak/>
         <w:t>보스</w:t>
       </w:r>
-      <w:bookmarkEnd w:id="31"/>
-    </w:p>
-    <w:p>
-      <w:r>
-        <w:rPr>
-          <w:rFonts w:hint="eastAsia"/>
-        </w:rPr>
-        <w:t xml:space="preserve">전투의 핵심을 담당하는 6종 이상의 </w:t>
-      </w:r>
-      <w:proofErr w:type="spellStart"/>
-      <w:r>
-        <w:rPr>
-          <w:rFonts w:hint="eastAsia"/>
-        </w:rPr>
-        <w:t>기믹형</w:t>
-      </w:r>
-      <w:proofErr w:type="spellEnd"/>
-      <w:r>
-        <w:rPr>
-          <w:rFonts w:hint="eastAsia"/>
-        </w:rPr>
-        <w:t xml:space="preserve"> 보스 몬스터</w:t>
-      </w:r>
-    </w:p>
-    <w:p/>
+      <w:bookmarkEnd w:id="38"/>
+      <w:bookmarkEnd w:id="39"/>
+    </w:p>
+    <w:p>
+      <w:r>
+        <w:rPr>
+          <w:rFonts w:hint="eastAsia"/>
+        </w:rPr>
+        <w:t>전투의 핵심을 담당하는 6종 이상의 기믹형 보스 몬스터</w:t>
+      </w:r>
+    </w:p>
+    <w:p>
+      <w:r>
+        <w:rPr>
+          <w:rFonts w:hint="eastAsia"/>
+          <w:sz w:val="20"/>
+          <w:szCs w:val="20"/>
+        </w:rPr>
+        <w:t>(</w:t>
+      </w:r>
+      <w:r>
+        <w:rPr>
+          <w:sz w:val="20"/>
+          <w:szCs w:val="20"/>
+        </w:rPr>
+        <w:t>그로기 타임 필요 // 보스 강공격 타이밍에 일정 데미지를 가하면 그로기</w:t>
+      </w:r>
+      <w:r>
+        <w:rPr>
+          <w:rFonts w:hint="eastAsia"/>
+          <w:sz w:val="20"/>
+          <w:szCs w:val="20"/>
+        </w:rPr>
+        <w:t>)</w:t>
+      </w:r>
+      <w:r>
+        <w:br/>
+      </w:r>
+      <w:r>
+        <w:rPr>
+          <w:noProof/>
+          <w:color w:val="512DA8"/>
+          <w:sz w:val="28"/>
+          <w:szCs w:val="28"/>
+        </w:rPr>
+        <w:drawing>
+          <wp:inline distT="0" distB="0" distL="0" distR="0" wp14:anchorId="1FCB25C6" wp14:editId="4E7FED9E">
+            <wp:extent cx="5733415" cy="3223260"/>
+            <wp:effectExtent l="0" t="0" r="635" b="0"/>
+            <wp:docPr id="2056742759" name="그림 1"/>
+            <wp:cNvGraphicFramePr>
+              <a:graphicFrameLocks xmlns:a="http://schemas.openxmlformats.org/drawingml/2006/main" noChangeAspect="1"/>
+            </wp:cNvGraphicFramePr>
+            <a:graphic xmlns:a="http://schemas.openxmlformats.org/drawingml/2006/main">
+              <a:graphicData uri="http://schemas.openxmlformats.org/drawingml/2006/picture">
+                <pic:pic xmlns:pic="http://schemas.openxmlformats.org/drawingml/2006/picture">
+                  <pic:nvPicPr>
+                    <pic:cNvPr id="0" name="Picture 1"/>
+                    <pic:cNvPicPr>
+                      <a:picLocks noChangeAspect="1" noChangeArrowheads="1"/>
+                    </pic:cNvPicPr>
+                  </pic:nvPicPr>
+                  <pic:blipFill>
+                    <a:blip r:embed="rId17" cstate="print">
+                      <a:extLst>
+                        <a:ext uri="{28A0092B-C50C-407E-A947-70E740481C1C}">
+                          <a14:useLocalDpi xmlns:a14="http://schemas.microsoft.com/office/drawing/2010/main" val="0"/>
+                        </a:ext>
+                      </a:extLst>
+                    </a:blip>
+                    <a:srcRect/>
+                    <a:stretch>
+                      <a:fillRect/>
+                    </a:stretch>
+                  </pic:blipFill>
+                  <pic:spPr bwMode="auto">
+                    <a:xfrm>
+                      <a:off x="0" y="0"/>
+                      <a:ext cx="5733415" cy="3223260"/>
+                    </a:xfrm>
+                    <a:prstGeom prst="rect">
+                      <a:avLst/>
+                    </a:prstGeom>
+                    <a:noFill/>
+                    <a:ln>
+                      <a:noFill/>
+                    </a:ln>
+                  </pic:spPr>
+                </pic:pic>
+              </a:graphicData>
+            </a:graphic>
+          </wp:inline>
+        </w:drawing>
+      </w:r>
+    </w:p>
+    <w:p>
+      <w:pPr>
+        <w:rPr>
+          <w:sz w:val="18"/>
+          <w:szCs w:val="18"/>
+        </w:rPr>
+      </w:pPr>
+      <w:r>
+        <w:rPr>
+          <w:rFonts w:hint="eastAsia"/>
+          <w:sz w:val="18"/>
+          <w:szCs w:val="18"/>
+        </w:rPr>
+        <w:t>*이해를 돕기 위한 레퍼런스 사진</w:t>
+      </w:r>
+    </w:p>
     <w:p>
       <w:pPr>
         <w:pStyle w:val="1"/>
@@ -7288,14 +7757,14 @@
           <w:numId w:val="15"/>
         </w:numPr>
       </w:pPr>
-      <w:bookmarkStart w:id="32" w:name="_Toc243523934"/>
+      <w:bookmarkStart w:id="40" w:name="_Toc243645660"/>
       <w:r>
         <w:rPr>
           <w:rFonts w:hint="eastAsia"/>
         </w:rPr>
         <w:t>레벨 디자인</w:t>
       </w:r>
-      <w:bookmarkEnd w:id="32"/>
+      <w:bookmarkEnd w:id="40"/>
     </w:p>
     <w:p>
       <w:pPr>
@@ -7305,14 +7774,14 @@
           <w:numId w:val="15"/>
         </w:numPr>
       </w:pPr>
-      <w:bookmarkStart w:id="33" w:name="_Toc243523935"/>
+      <w:bookmarkStart w:id="41" w:name="_Toc243645661"/>
       <w:r>
         <w:rPr>
           <w:rFonts w:hint="eastAsia"/>
         </w:rPr>
         <w:t>맵</w:t>
       </w:r>
-      <w:bookmarkEnd w:id="33"/>
+      <w:bookmarkEnd w:id="41"/>
     </w:p>
     <w:p>
       <w:r>
@@ -7338,16 +7807,14 @@
           <w:numId w:val="15"/>
         </w:numPr>
       </w:pPr>
-      <w:bookmarkStart w:id="34" w:name="_Toc243523936"/>
-      <w:proofErr w:type="spellStart"/>
+      <w:bookmarkStart w:id="42" w:name="_Toc243645662"/>
       <w:r>
         <w:rPr>
           <w:rFonts w:hint="eastAsia"/>
         </w:rPr>
         <w:t>풀링</w:t>
       </w:r>
-      <w:bookmarkEnd w:id="34"/>
-      <w:proofErr w:type="spellEnd"/>
+      <w:bookmarkEnd w:id="42"/>
     </w:p>
     <w:p>
       <w:pPr>
@@ -7357,28 +7824,15 @@
           <w:numId w:val="15"/>
         </w:numPr>
       </w:pPr>
-      <w:bookmarkStart w:id="35" w:name="_Toc243523937"/>
-      <w:r>
-        <w:t xml:space="preserve">오브젝트 </w:t>
-      </w:r>
-      <w:proofErr w:type="spellStart"/>
-      <w:r>
-        <w:t>풀링</w:t>
-      </w:r>
-      <w:bookmarkEnd w:id="35"/>
-      <w:proofErr w:type="spellEnd"/>
-    </w:p>
-    <w:p>
-      <w:r>
-        <w:t xml:space="preserve">안드로이드 모바일 환경의 최적화를 위해 메모리 </w:t>
-      </w:r>
-      <w:proofErr w:type="spellStart"/>
-      <w:r>
-        <w:t>풀링</w:t>
-      </w:r>
-      <w:proofErr w:type="spellEnd"/>
-      <w:r>
-        <w:t xml:space="preserve"> 시스템 구축</w:t>
+      <w:bookmarkStart w:id="43" w:name="_Toc243645663"/>
+      <w:r>
+        <w:t>오브젝트 풀링</w:t>
+      </w:r>
+      <w:bookmarkEnd w:id="43"/>
+    </w:p>
+    <w:p>
+      <w:r>
+        <w:t>안드로이드 모바일 환경의 최적화를 위해 메모리 풀링 시스템 구축</w:t>
       </w:r>
       <w:r>
         <w:rPr>
@@ -7389,44 +7843,22 @@
     </w:p>
     <w:p>
       <w:r>
-        <w:t xml:space="preserve">몬스터의 특성에 따라 기본 생성, 특정 위치 고정형 생성, 시간에 따른 웨이브 </w:t>
-      </w:r>
-      <w:proofErr w:type="spellStart"/>
-      <w:r>
-        <w:t>스폰</w:t>
-      </w:r>
-      <w:r>
-        <w:rPr>
-          <w:rFonts w:hint="eastAsia"/>
-        </w:rPr>
-        <w:t>을</w:t>
-      </w:r>
-      <w:proofErr w:type="spellEnd"/>
-      <w:r>
-        <w:rPr>
-          <w:rFonts w:hint="eastAsia"/>
-        </w:rPr>
-        <w:t xml:space="preserve"> 적용한다.</w:t>
-      </w:r>
-    </w:p>
-    <w:p/>
-    <w:p/>
-    <w:p>
-      <w:pPr>
-        <w:rPr>
-          <w:color w:val="000000"/>
-          <w:sz w:val="28"/>
-          <w:szCs w:val="28"/>
-        </w:rPr>
-      </w:pPr>
+        <w:t>몬스터의 특성에 따라 기본 생성, 특정 위치 고정형 생성, 시간에 따른 웨이브 스폰</w:t>
+      </w:r>
+      <w:r>
+        <w:rPr>
+          <w:rFonts w:hint="eastAsia"/>
+        </w:rPr>
+        <w:t>을 적용한다.</w:t>
+      </w:r>
     </w:p>
     <w:sectPr>
-      <w:headerReference w:type="even" r:id="rId17"/>
-      <w:headerReference w:type="default" r:id="rId18"/>
-      <w:footerReference w:type="even" r:id="rId19"/>
-      <w:footerReference w:type="default" r:id="rId20"/>
-      <w:headerReference w:type="first" r:id="rId21"/>
-      <w:footerReference w:type="first" r:id="rId22"/>
+      <w:headerReference w:type="even" r:id="rId18"/>
+      <w:headerReference w:type="default" r:id="rId19"/>
+      <w:footerReference w:type="even" r:id="rId20"/>
+      <w:footerReference w:type="default" r:id="rId21"/>
+      <w:headerReference w:type="first" r:id="rId22"/>
+      <w:footerReference w:type="first" r:id="rId23"/>
       <w:pgSz w:w="11909" w:h="16834"/>
       <w:pgMar w:top="1440" w:right="1440" w:bottom="1440" w:left="1440" w:header="567" w:footer="720" w:gutter="0"/>
       <w:pgNumType w:start="1"/>
@@ -7437,7 +7869,7 @@
 </file>
 
 <file path=word/endnotes.xml><?xml version="1.0" encoding="utf-8"?>
-<w:endnotes xmlns:wpc="http://schemas.microsoft.com/office/word/2010/wordprocessingCanvas" xmlns:cx="http://schemas.microsoft.com/office/drawing/2014/chartex" xmlns:cx1="http://schemas.microsoft.com/office/drawing/2015/9/8/chartex" xmlns:cx2="http://schemas.microsoft.com/office/drawing/2015/10/21/chartex" xmlns:cx3="http://schemas.microsoft.com/office/drawing/2016/5/9/chartex" xmlns:cx4="http://schemas.microsoft.com/office/drawing/2016/5/10/chartex" xmlns:cx5="http://schemas.microsoft.com/office/drawing/2016/5/11/chartex" xmlns:cx6="http://schemas.microsoft.com/office/drawing/2016/5/12/chartex" xmlns:cx7="http://schemas.microsoft.com/office/drawing/2016/5/13/chartex" xmlns:cx8="http://schemas.microsoft.com/office/drawing/2016/5/14/chartex" xmlns:mc="http://schemas.openxmlformats.org/markup-compatibility/2006" xmlns:aink="http://schemas.microsoft.com/office/drawing/2016/ink" xmlns:am3d="http://schemas.microsoft.com/office/drawing/2017/model3d" xmlns:o="urn:schemas-microsoft-com:office:office" xmlns:oel="http://schemas.microsoft.com/office/2019/extlst" xmlns:r="http://schemas.openxmlformats.org/officeDocument/2006/relationships" xmlns:m="http://schemas.openxmlformats.org/officeDocument/2006/math" xmlns:v="urn:schemas-microsoft-com:vml" xmlns:wp14="http://schemas.microsoft.com/office/word/2010/wordprocessingDrawing" xmlns:wp="http://schemas.openxmlformats.org/drawingml/2006/wordprocessingDrawing" xmlns:w10="urn:schemas-microsoft-com:office:word" xmlns:w="http://schemas.openxmlformats.org/wordprocessingml/2006/main" xmlns:w14="http://schemas.microsoft.com/office/word/2010/wordml" xmlns:w15="http://schemas.microsoft.com/office/word/2012/wordml" xmlns:w16cei="http://schemas.microsoft.com/office/word/2026/wordml/cei" xmlns:w16cex="http://schemas.microsoft.com/office/word/2018/wordml/cex" xmlns:w16cid="http://schemas.microsoft.com/office/word/2016/wordml/cid" xmlns:w16="http://schemas.microsoft.com/office/word/2018/wordml" xmlns:w16du="http://schemas.microsoft.com/office/word/2023/wordml/word16du" xmlns:w16sdtdh="http://schemas.microsoft.com/office/word/2020/wordml/sdtdatahash" xmlns:w16sdtfl="http://schemas.microsoft.com/office/word/2024/wordml/sdtformatlock" xmlns:w16se="http://schemas.microsoft.com/office/word/2015/wordml/symex" xmlns:wpg="http://schemas.microsoft.com/office/word/2010/wordprocessingGroup" xmlns:wpi="http://schemas.microsoft.com/office/word/2010/wordprocessingInk" xmlns:wne="http://schemas.microsoft.com/office/word/2006/wordml" xmlns:wps="http://schemas.microsoft.com/office/word/2010/wordprocessingShape" mc:Ignorable="w14 w15 w16se w16cid w16 w16cex w16sdtdh w16sdtfl w16du wp14">
+<w:endnotes xmlns:wpc="http://schemas.microsoft.com/office/word/2010/wordprocessingCanvas" xmlns:cx="http://schemas.microsoft.com/office/drawing/2014/chartex" xmlns:cx1="http://schemas.microsoft.com/office/drawing/2015/9/8/chartex" xmlns:cx2="http://schemas.microsoft.com/office/drawing/2015/10/21/chartex" xmlns:cx3="http://schemas.microsoft.com/office/drawing/2016/5/9/chartex" xmlns:cx4="http://schemas.microsoft.com/office/drawing/2016/5/10/chartex" xmlns:cx5="http://schemas.microsoft.com/office/drawing/2016/5/11/chartex" xmlns:cx6="http://schemas.microsoft.com/office/drawing/2016/5/12/chartex" xmlns:cx7="http://schemas.microsoft.com/office/drawing/2016/5/13/chartex" xmlns:cx8="http://schemas.microsoft.com/office/drawing/2016/5/14/chartex" xmlns:mc="http://schemas.openxmlformats.org/markup-compatibility/2006" xmlns:aink="http://schemas.microsoft.com/office/drawing/2016/ink" xmlns:am3d="http://schemas.microsoft.com/office/drawing/2017/model3d" xmlns:o="urn:schemas-microsoft-com:office:office" xmlns:oel="http://schemas.microsoft.com/office/2019/extlst" xmlns:r="http://schemas.openxmlformats.org/officeDocument/2006/relationships" xmlns:m="http://schemas.openxmlformats.org/officeDocument/2006/math" xmlns:v="urn:schemas-microsoft-com:vml" xmlns:wp14="http://schemas.microsoft.com/office/word/2010/wordprocessingDrawing" xmlns:wp="http://schemas.openxmlformats.org/drawingml/2006/wordprocessingDrawing" xmlns:w10="urn:schemas-microsoft-com:office:word" xmlns:w="http://schemas.openxmlformats.org/wordprocessingml/2006/main" xmlns:w14="http://schemas.microsoft.com/office/word/2010/wordml" xmlns:w15="http://schemas.microsoft.com/office/word/2012/wordml" xmlns:w16cex="http://schemas.microsoft.com/office/word/2018/wordml/cex" xmlns:w16cid="http://schemas.microsoft.com/office/word/2016/wordml/cid" xmlns:w16="http://schemas.microsoft.com/office/word/2018/wordml" xmlns:w16du="http://schemas.microsoft.com/office/word/2023/wordml/word16du" xmlns:w16sdtdh="http://schemas.microsoft.com/office/word/2020/wordml/sdtdatahash" xmlns:w16sdtfl="http://schemas.microsoft.com/office/word/2024/wordml/sdtformatlock" xmlns:w16se="http://schemas.microsoft.com/office/word/2015/wordml/symex" xmlns:wpg="http://schemas.microsoft.com/office/word/2010/wordprocessingGroup" xmlns:wpi="http://schemas.microsoft.com/office/word/2010/wordprocessingInk" xmlns:wne="http://schemas.microsoft.com/office/word/2006/wordml" xmlns:wps="http://schemas.microsoft.com/office/word/2010/wordprocessingShape" mc:Ignorable="w14 w15 w16se w16cid w16 w16cex w16sdtdh w16sdtfl w16du wp14">
   <w:endnote w:type="separator" w:id="-1">
     <w:p>
       <w:pPr>
@@ -7462,7 +7894,7 @@
 </file>
 
 <file path=word/footer1.xml><?xml version="1.0" encoding="utf-8"?>
-<w:ftr xmlns:wpc="http://schemas.microsoft.com/office/word/2010/wordprocessingCanvas" xmlns:cx="http://schemas.microsoft.com/office/drawing/2014/chartex" xmlns:cx1="http://schemas.microsoft.com/office/drawing/2015/9/8/chartex" xmlns:cx2="http://schemas.microsoft.com/office/drawing/2015/10/21/chartex" xmlns:cx3="http://schemas.microsoft.com/office/drawing/2016/5/9/chartex" xmlns:cx4="http://schemas.microsoft.com/office/drawing/2016/5/10/chartex" xmlns:cx5="http://schemas.microsoft.com/office/drawing/2016/5/11/chartex" xmlns:cx6="http://schemas.microsoft.com/office/drawing/2016/5/12/chartex" xmlns:cx7="http://schemas.microsoft.com/office/drawing/2016/5/13/chartex" xmlns:cx8="http://schemas.microsoft.com/office/drawing/2016/5/14/chartex" xmlns:mc="http://schemas.openxmlformats.org/markup-compatibility/2006" xmlns:aink="http://schemas.microsoft.com/office/drawing/2016/ink" xmlns:am3d="http://schemas.microsoft.com/office/drawing/2017/model3d" xmlns:o="urn:schemas-microsoft-com:office:office" xmlns:oel="http://schemas.microsoft.com/office/2019/extlst" xmlns:r="http://schemas.openxmlformats.org/officeDocument/2006/relationships" xmlns:m="http://schemas.openxmlformats.org/officeDocument/2006/math" xmlns:v="urn:schemas-microsoft-com:vml" xmlns:wp14="http://schemas.microsoft.com/office/word/2010/wordprocessingDrawing" xmlns:wp="http://schemas.openxmlformats.org/drawingml/2006/wordprocessingDrawing" xmlns:w10="urn:schemas-microsoft-com:office:word" xmlns:w="http://schemas.openxmlformats.org/wordprocessingml/2006/main" xmlns:w14="http://schemas.microsoft.com/office/word/2010/wordml" xmlns:w15="http://schemas.microsoft.com/office/word/2012/wordml" xmlns:w16cei="http://schemas.microsoft.com/office/word/2026/wordml/cei" xmlns:w16cex="http://schemas.microsoft.com/office/word/2018/wordml/cex" xmlns:w16cid="http://schemas.microsoft.com/office/word/2016/wordml/cid" xmlns:w16="http://schemas.microsoft.com/office/word/2018/wordml" xmlns:w16du="http://schemas.microsoft.com/office/word/2023/wordml/word16du" xmlns:w16sdtdh="http://schemas.microsoft.com/office/word/2020/wordml/sdtdatahash" xmlns:w16sdtfl="http://schemas.microsoft.com/office/word/2024/wordml/sdtformatlock" xmlns:w16se="http://schemas.microsoft.com/office/word/2015/wordml/symex" xmlns:wpg="http://schemas.microsoft.com/office/word/2010/wordprocessingGroup" xmlns:wpi="http://schemas.microsoft.com/office/word/2010/wordprocessingInk" xmlns:wne="http://schemas.microsoft.com/office/word/2006/wordml" xmlns:wps="http://schemas.microsoft.com/office/word/2010/wordprocessingShape" mc:Ignorable="w14 w15 w16se w16cid w16 w16cex w16sdtdh w16sdtfl w16du wp14">
+<w:ftr xmlns:wpc="http://schemas.microsoft.com/office/word/2010/wordprocessingCanvas" xmlns:cx="http://schemas.microsoft.com/office/drawing/2014/chartex" xmlns:cx1="http://schemas.microsoft.com/office/drawing/2015/9/8/chartex" xmlns:cx2="http://schemas.microsoft.com/office/drawing/2015/10/21/chartex" xmlns:cx3="http://schemas.microsoft.com/office/drawing/2016/5/9/chartex" xmlns:cx4="http://schemas.microsoft.com/office/drawing/2016/5/10/chartex" xmlns:cx5="http://schemas.microsoft.com/office/drawing/2016/5/11/chartex" xmlns:cx6="http://schemas.microsoft.com/office/drawing/2016/5/12/chartex" xmlns:cx7="http://schemas.microsoft.com/office/drawing/2016/5/13/chartex" xmlns:cx8="http://schemas.microsoft.com/office/drawing/2016/5/14/chartex" xmlns:mc="http://schemas.openxmlformats.org/markup-compatibility/2006" xmlns:aink="http://schemas.microsoft.com/office/drawing/2016/ink" xmlns:am3d="http://schemas.microsoft.com/office/drawing/2017/model3d" xmlns:o="urn:schemas-microsoft-com:office:office" xmlns:oel="http://schemas.microsoft.com/office/2019/extlst" xmlns:r="http://schemas.openxmlformats.org/officeDocument/2006/relationships" xmlns:m="http://schemas.openxmlformats.org/officeDocument/2006/math" xmlns:v="urn:schemas-microsoft-com:vml" xmlns:wp14="http://schemas.microsoft.com/office/word/2010/wordprocessingDrawing" xmlns:wp="http://schemas.openxmlformats.org/drawingml/2006/wordprocessingDrawing" xmlns:w10="urn:schemas-microsoft-com:office:word" xmlns:w="http://schemas.openxmlformats.org/wordprocessingml/2006/main" xmlns:w14="http://schemas.microsoft.com/office/word/2010/wordml" xmlns:w15="http://schemas.microsoft.com/office/word/2012/wordml" xmlns:w16cex="http://schemas.microsoft.com/office/word/2018/wordml/cex" xmlns:w16cid="http://schemas.microsoft.com/office/word/2016/wordml/cid" xmlns:w16="http://schemas.microsoft.com/office/word/2018/wordml" xmlns:w16du="http://schemas.microsoft.com/office/word/2023/wordml/word16du" xmlns:w16sdtdh="http://schemas.microsoft.com/office/word/2020/wordml/sdtdatahash" xmlns:w16sdtfl="http://schemas.microsoft.com/office/word/2024/wordml/sdtformatlock" xmlns:w16se="http://schemas.microsoft.com/office/word/2015/wordml/symex" xmlns:wpg="http://schemas.microsoft.com/office/word/2010/wordprocessingGroup" xmlns:wpi="http://schemas.microsoft.com/office/word/2010/wordprocessingInk" xmlns:wne="http://schemas.microsoft.com/office/word/2006/wordml" xmlns:wps="http://schemas.microsoft.com/office/word/2010/wordprocessingShape" mc:Ignorable="w14 w15 w16se w16cid w16 w16cex w16sdtdh w16sdtfl w16du wp14">
   <w:p>
     <w:pPr>
       <w:pBdr>
@@ -7485,7 +7917,7 @@
 </file>
 
 <file path=word/footer2.xml><?xml version="1.0" encoding="utf-8"?>
-<w:ftr xmlns:wpc="http://schemas.microsoft.com/office/word/2010/wordprocessingCanvas" xmlns:cx="http://schemas.microsoft.com/office/drawing/2014/chartex" xmlns:cx1="http://schemas.microsoft.com/office/drawing/2015/9/8/chartex" xmlns:cx2="http://schemas.microsoft.com/office/drawing/2015/10/21/chartex" xmlns:cx3="http://schemas.microsoft.com/office/drawing/2016/5/9/chartex" xmlns:cx4="http://schemas.microsoft.com/office/drawing/2016/5/10/chartex" xmlns:cx5="http://schemas.microsoft.com/office/drawing/2016/5/11/chartex" xmlns:cx6="http://schemas.microsoft.com/office/drawing/2016/5/12/chartex" xmlns:cx7="http://schemas.microsoft.com/office/drawing/2016/5/13/chartex" xmlns:cx8="http://schemas.microsoft.com/office/drawing/2016/5/14/chartex" xmlns:mc="http://schemas.openxmlformats.org/markup-compatibility/2006" xmlns:aink="http://schemas.microsoft.com/office/drawing/2016/ink" xmlns:am3d="http://schemas.microsoft.com/office/drawing/2017/model3d" xmlns:o="urn:schemas-microsoft-com:office:office" xmlns:oel="http://schemas.microsoft.com/office/2019/extlst" xmlns:r="http://schemas.openxmlformats.org/officeDocument/2006/relationships" xmlns:m="http://schemas.openxmlformats.org/officeDocument/2006/math" xmlns:v="urn:schemas-microsoft-com:vml" xmlns:wp14="http://schemas.microsoft.com/office/word/2010/wordprocessingDrawing" xmlns:wp="http://schemas.openxmlformats.org/drawingml/2006/wordprocessingDrawing" xmlns:w10="urn:schemas-microsoft-com:office:word" xmlns:w="http://schemas.openxmlformats.org/wordprocessingml/2006/main" xmlns:w14="http://schemas.microsoft.com/office/word/2010/wordml" xmlns:w15="http://schemas.microsoft.com/office/word/2012/wordml" xmlns:w16cei="http://schemas.microsoft.com/office/word/2026/wordml/cei" xmlns:w16cex="http://schemas.microsoft.com/office/word/2018/wordml/cex" xmlns:w16cid="http://schemas.microsoft.com/office/word/2016/wordml/cid" xmlns:w16="http://schemas.microsoft.com/office/word/2018/wordml" xmlns:w16du="http://schemas.microsoft.com/office/word/2023/wordml/word16du" xmlns:w16sdtdh="http://schemas.microsoft.com/office/word/2020/wordml/sdtdatahash" xmlns:w16sdtfl="http://schemas.microsoft.com/office/word/2024/wordml/sdtformatlock" xmlns:w16se="http://schemas.microsoft.com/office/word/2015/wordml/symex" xmlns:wpg="http://schemas.microsoft.com/office/word/2010/wordprocessingGroup" xmlns:wpi="http://schemas.microsoft.com/office/word/2010/wordprocessingInk" xmlns:wne="http://schemas.microsoft.com/office/word/2006/wordml" xmlns:wps="http://schemas.microsoft.com/office/word/2010/wordprocessingShape" mc:Ignorable="w14 w15 w16se w16cid w16 w16cex w16sdtdh w16sdtfl w16du wp14">
+<w:ftr xmlns:wpc="http://schemas.microsoft.com/office/word/2010/wordprocessingCanvas" xmlns:cx="http://schemas.microsoft.com/office/drawing/2014/chartex" xmlns:cx1="http://schemas.microsoft.com/office/drawing/2015/9/8/chartex" xmlns:cx2="http://schemas.microsoft.com/office/drawing/2015/10/21/chartex" xmlns:cx3="http://schemas.microsoft.com/office/drawing/2016/5/9/chartex" xmlns:cx4="http://schemas.microsoft.com/office/drawing/2016/5/10/chartex" xmlns:cx5="http://schemas.microsoft.com/office/drawing/2016/5/11/chartex" xmlns:cx6="http://schemas.microsoft.com/office/drawing/2016/5/12/chartex" xmlns:cx7="http://schemas.microsoft.com/office/drawing/2016/5/13/chartex" xmlns:cx8="http://schemas.microsoft.com/office/drawing/2016/5/14/chartex" xmlns:mc="http://schemas.openxmlformats.org/markup-compatibility/2006" xmlns:aink="http://schemas.microsoft.com/office/drawing/2016/ink" xmlns:am3d="http://schemas.microsoft.com/office/drawing/2017/model3d" xmlns:o="urn:schemas-microsoft-com:office:office" xmlns:oel="http://schemas.microsoft.com/office/2019/extlst" xmlns:r="http://schemas.openxmlformats.org/officeDocument/2006/relationships" xmlns:m="http://schemas.openxmlformats.org/officeDocument/2006/math" xmlns:v="urn:schemas-microsoft-com:vml" xmlns:wp14="http://schemas.microsoft.com/office/word/2010/wordprocessingDrawing" xmlns:wp="http://schemas.openxmlformats.org/drawingml/2006/wordprocessingDrawing" xmlns:w10="urn:schemas-microsoft-com:office:word" xmlns:w="http://schemas.openxmlformats.org/wordprocessingml/2006/main" xmlns:w14="http://schemas.microsoft.com/office/word/2010/wordml" xmlns:w15="http://schemas.microsoft.com/office/word/2012/wordml" xmlns:w16cex="http://schemas.microsoft.com/office/word/2018/wordml/cex" xmlns:w16cid="http://schemas.microsoft.com/office/word/2016/wordml/cid" xmlns:w16="http://schemas.microsoft.com/office/word/2018/wordml" xmlns:w16du="http://schemas.microsoft.com/office/word/2023/wordml/word16du" xmlns:w16sdtdh="http://schemas.microsoft.com/office/word/2020/wordml/sdtdatahash" xmlns:w16sdtfl="http://schemas.microsoft.com/office/word/2024/wordml/sdtformatlock" xmlns:w16se="http://schemas.microsoft.com/office/word/2015/wordml/symex" xmlns:wpg="http://schemas.microsoft.com/office/word/2010/wordprocessingGroup" xmlns:wpi="http://schemas.microsoft.com/office/word/2010/wordprocessingInk" xmlns:wne="http://schemas.microsoft.com/office/word/2006/wordml" xmlns:wps="http://schemas.microsoft.com/office/word/2010/wordprocessingShape" mc:Ignorable="w14 w15 w16se w16cid w16 w16cex w16sdtdh w16sdtfl w16du wp14">
   <w:p>
     <w:pPr>
       <w:pBdr>
@@ -7632,7 +8064,7 @@
 </file>
 
 <file path=word/footer3.xml><?xml version="1.0" encoding="utf-8"?>
-<w:ftr xmlns:wpc="http://schemas.microsoft.com/office/word/2010/wordprocessingCanvas" xmlns:cx="http://schemas.microsoft.com/office/drawing/2014/chartex" xmlns:cx1="http://schemas.microsoft.com/office/drawing/2015/9/8/chartex" xmlns:cx2="http://schemas.microsoft.com/office/drawing/2015/10/21/chartex" xmlns:cx3="http://schemas.microsoft.com/office/drawing/2016/5/9/chartex" xmlns:cx4="http://schemas.microsoft.com/office/drawing/2016/5/10/chartex" xmlns:cx5="http://schemas.microsoft.com/office/drawing/2016/5/11/chartex" xmlns:cx6="http://schemas.microsoft.com/office/drawing/2016/5/12/chartex" xmlns:cx7="http://schemas.microsoft.com/office/drawing/2016/5/13/chartex" xmlns:cx8="http://schemas.microsoft.com/office/drawing/2016/5/14/chartex" xmlns:mc="http://schemas.openxmlformats.org/markup-compatibility/2006" xmlns:aink="http://schemas.microsoft.com/office/drawing/2016/ink" xmlns:am3d="http://schemas.microsoft.com/office/drawing/2017/model3d" xmlns:o="urn:schemas-microsoft-com:office:office" xmlns:oel="http://schemas.microsoft.com/office/2019/extlst" xmlns:r="http://schemas.openxmlformats.org/officeDocument/2006/relationships" xmlns:m="http://schemas.openxmlformats.org/officeDocument/2006/math" xmlns:v="urn:schemas-microsoft-com:vml" xmlns:wp14="http://schemas.microsoft.com/office/word/2010/wordprocessingDrawing" xmlns:wp="http://schemas.openxmlformats.org/drawingml/2006/wordprocessingDrawing" xmlns:w10="urn:schemas-microsoft-com:office:word" xmlns:w="http://schemas.openxmlformats.org/wordprocessingml/2006/main" xmlns:w14="http://schemas.microsoft.com/office/word/2010/wordml" xmlns:w15="http://schemas.microsoft.com/office/word/2012/wordml" xmlns:w16cei="http://schemas.microsoft.com/office/word/2026/wordml/cei" xmlns:w16cex="http://schemas.microsoft.com/office/word/2018/wordml/cex" xmlns:w16cid="http://schemas.microsoft.com/office/word/2016/wordml/cid" xmlns:w16="http://schemas.microsoft.com/office/word/2018/wordml" xmlns:w16du="http://schemas.microsoft.com/office/word/2023/wordml/word16du" xmlns:w16sdtdh="http://schemas.microsoft.com/office/word/2020/wordml/sdtdatahash" xmlns:w16sdtfl="http://schemas.microsoft.com/office/word/2024/wordml/sdtformatlock" xmlns:w16se="http://schemas.microsoft.com/office/word/2015/wordml/symex" xmlns:wpg="http://schemas.microsoft.com/office/word/2010/wordprocessingGroup" xmlns:wpi="http://schemas.microsoft.com/office/word/2010/wordprocessingInk" xmlns:wne="http://schemas.microsoft.com/office/word/2006/wordml" xmlns:wps="http://schemas.microsoft.com/office/word/2010/wordprocessingShape" mc:Ignorable="w14 w15 w16se w16cid w16 w16cex w16sdtdh w16sdtfl w16du wp14">
+<w:ftr xmlns:wpc="http://schemas.microsoft.com/office/word/2010/wordprocessingCanvas" xmlns:cx="http://schemas.microsoft.com/office/drawing/2014/chartex" xmlns:cx1="http://schemas.microsoft.com/office/drawing/2015/9/8/chartex" xmlns:cx2="http://schemas.microsoft.com/office/drawing/2015/10/21/chartex" xmlns:cx3="http://schemas.microsoft.com/office/drawing/2016/5/9/chartex" xmlns:cx4="http://schemas.microsoft.com/office/drawing/2016/5/10/chartex" xmlns:cx5="http://schemas.microsoft.com/office/drawing/2016/5/11/chartex" xmlns:cx6="http://schemas.microsoft.com/office/drawing/2016/5/12/chartex" xmlns:cx7="http://schemas.microsoft.com/office/drawing/2016/5/13/chartex" xmlns:cx8="http://schemas.microsoft.com/office/drawing/2016/5/14/chartex" xmlns:mc="http://schemas.openxmlformats.org/markup-compatibility/2006" xmlns:aink="http://schemas.microsoft.com/office/drawing/2016/ink" xmlns:am3d="http://schemas.microsoft.com/office/drawing/2017/model3d" xmlns:o="urn:schemas-microsoft-com:office:office" xmlns:oel="http://schemas.microsoft.com/office/2019/extlst" xmlns:r="http://schemas.openxmlformats.org/officeDocument/2006/relationships" xmlns:m="http://schemas.openxmlformats.org/officeDocument/2006/math" xmlns:v="urn:schemas-microsoft-com:vml" xmlns:wp14="http://schemas.microsoft.com/office/word/2010/wordprocessingDrawing" xmlns:wp="http://schemas.openxmlformats.org/drawingml/2006/wordprocessingDrawing" xmlns:w10="urn:schemas-microsoft-com:office:word" xmlns:w="http://schemas.openxmlformats.org/wordprocessingml/2006/main" xmlns:w14="http://schemas.microsoft.com/office/word/2010/wordml" xmlns:w15="http://schemas.microsoft.com/office/word/2012/wordml" xmlns:w16cex="http://schemas.microsoft.com/office/word/2018/wordml/cex" xmlns:w16cid="http://schemas.microsoft.com/office/word/2016/wordml/cid" xmlns:w16="http://schemas.microsoft.com/office/word/2018/wordml" xmlns:w16du="http://schemas.microsoft.com/office/word/2023/wordml/word16du" xmlns:w16sdtdh="http://schemas.microsoft.com/office/word/2020/wordml/sdtdatahash" xmlns:w16sdtfl="http://schemas.microsoft.com/office/word/2024/wordml/sdtformatlock" xmlns:w16se="http://schemas.microsoft.com/office/word/2015/wordml/symex" xmlns:wpg="http://schemas.microsoft.com/office/word/2010/wordprocessingGroup" xmlns:wpi="http://schemas.microsoft.com/office/word/2010/wordprocessingInk" xmlns:wne="http://schemas.microsoft.com/office/word/2006/wordml" xmlns:wps="http://schemas.microsoft.com/office/word/2010/wordprocessingShape" mc:Ignorable="w14 w15 w16se w16cid w16 w16cex w16sdtdh w16sdtfl w16du wp14">
   <w:p>
     <w:pPr>
       <w:pBdr>
@@ -7655,7 +8087,7 @@
 </file>
 
 <file path=word/footnotes.xml><?xml version="1.0" encoding="utf-8"?>
-<w:footnotes xmlns:wpc="http://schemas.microsoft.com/office/word/2010/wordprocessingCanvas" xmlns:cx="http://schemas.microsoft.com/office/drawing/2014/chartex" xmlns:cx1="http://schemas.microsoft.com/office/drawing/2015/9/8/chartex" xmlns:cx2="http://schemas.microsoft.com/office/drawing/2015/10/21/chartex" xmlns:cx3="http://schemas.microsoft.com/office/drawing/2016/5/9/chartex" xmlns:cx4="http://schemas.microsoft.com/office/drawing/2016/5/10/chartex" xmlns:cx5="http://schemas.microsoft.com/office/drawing/2016/5/11/chartex" xmlns:cx6="http://schemas.microsoft.com/office/drawing/2016/5/12/chartex" xmlns:cx7="http://schemas.microsoft.com/office/drawing/2016/5/13/chartex" xmlns:cx8="http://schemas.microsoft.com/office/drawing/2016/5/14/chartex" xmlns:mc="http://schemas.openxmlformats.org/markup-compatibility/2006" xmlns:aink="http://schemas.microsoft.com/office/drawing/2016/ink" xmlns:am3d="http://schemas.microsoft.com/office/drawing/2017/model3d" xmlns:o="urn:schemas-microsoft-com:office:office" xmlns:oel="http://schemas.microsoft.com/office/2019/extlst" xmlns:r="http://schemas.openxmlformats.org/officeDocument/2006/relationships" xmlns:m="http://schemas.openxmlformats.org/officeDocument/2006/math" xmlns:v="urn:schemas-microsoft-com:vml" xmlns:wp14="http://schemas.microsoft.com/office/word/2010/wordprocessingDrawing" xmlns:wp="http://schemas.openxmlformats.org/drawingml/2006/wordprocessingDrawing" xmlns:w10="urn:schemas-microsoft-com:office:word" xmlns:w="http://schemas.openxmlformats.org/wordprocessingml/2006/main" xmlns:w14="http://schemas.microsoft.com/office/word/2010/wordml" xmlns:w15="http://schemas.microsoft.com/office/word/2012/wordml" xmlns:w16cei="http://schemas.microsoft.com/office/word/2026/wordml/cei" xmlns:w16cex="http://schemas.microsoft.com/office/word/2018/wordml/cex" xmlns:w16cid="http://schemas.microsoft.com/office/word/2016/wordml/cid" xmlns:w16="http://schemas.microsoft.com/office/word/2018/wordml" xmlns:w16du="http://schemas.microsoft.com/office/word/2023/wordml/word16du" xmlns:w16sdtdh="http://schemas.microsoft.com/office/word/2020/wordml/sdtdatahash" xmlns:w16sdtfl="http://schemas.microsoft.com/office/word/2024/wordml/sdtformatlock" xmlns:w16se="http://schemas.microsoft.com/office/word/2015/wordml/symex" xmlns:wpg="http://schemas.microsoft.com/office/word/2010/wordprocessingGroup" xmlns:wpi="http://schemas.microsoft.com/office/word/2010/wordprocessingInk" xmlns:wne="http://schemas.microsoft.com/office/word/2006/wordml" xmlns:wps="http://schemas.microsoft.com/office/word/2010/wordprocessingShape" mc:Ignorable="w14 w15 w16se w16cid w16 w16cex w16sdtdh w16sdtfl w16du wp14">
+<w:footnotes xmlns:wpc="http://schemas.microsoft.com/office/word/2010/wordprocessingCanvas" xmlns:cx="http://schemas.microsoft.com/office/drawing/2014/chartex" xmlns:cx1="http://schemas.microsoft.com/office/drawing/2015/9/8/chartex" xmlns:cx2="http://schemas.microsoft.com/office/drawing/2015/10/21/chartex" xmlns:cx3="http://schemas.microsoft.com/office/drawing/2016/5/9/chartex" xmlns:cx4="http://schemas.microsoft.com/office/drawing/2016/5/10/chartex" xmlns:cx5="http://schemas.microsoft.com/office/drawing/2016/5/11/chartex" xmlns:cx6="http://schemas.microsoft.com/office/drawing/2016/5/12/chartex" xmlns:cx7="http://schemas.microsoft.com/office/drawing/2016/5/13/chartex" xmlns:cx8="http://schemas.microsoft.com/office/drawing/2016/5/14/chartex" xmlns:mc="http://schemas.openxmlformats.org/markup-compatibility/2006" xmlns:aink="http://schemas.microsoft.com/office/drawing/2016/ink" xmlns:am3d="http://schemas.microsoft.com/office/drawing/2017/model3d" xmlns:o="urn:schemas-microsoft-com:office:office" xmlns:oel="http://schemas.microsoft.com/office/2019/extlst" xmlns:r="http://schemas.openxmlformats.org/officeDocument/2006/relationships" xmlns:m="http://schemas.openxmlformats.org/officeDocument/2006/math" xmlns:v="urn:schemas-microsoft-com:vml" xmlns:wp14="http://schemas.microsoft.com/office/word/2010/wordprocessingDrawing" xmlns:wp="http://schemas.openxmlformats.org/drawingml/2006/wordprocessingDrawing" xmlns:w10="urn:schemas-microsoft-com:office:word" xmlns:w="http://schemas.openxmlformats.org/wordprocessingml/2006/main" xmlns:w14="http://schemas.microsoft.com/office/word/2010/wordml" xmlns:w15="http://schemas.microsoft.com/office/word/2012/wordml" xmlns:w16cex="http://schemas.microsoft.com/office/word/2018/wordml/cex" xmlns:w16cid="http://schemas.microsoft.com/office/word/2016/wordml/cid" xmlns:w16="http://schemas.microsoft.com/office/word/2018/wordml" xmlns:w16du="http://schemas.microsoft.com/office/word/2023/wordml/word16du" xmlns:w16sdtdh="http://schemas.microsoft.com/office/word/2020/wordml/sdtdatahash" xmlns:w16sdtfl="http://schemas.microsoft.com/office/word/2024/wordml/sdtformatlock" xmlns:w16se="http://schemas.microsoft.com/office/word/2015/wordml/symex" xmlns:wpg="http://schemas.microsoft.com/office/word/2010/wordprocessingGroup" xmlns:wpi="http://schemas.microsoft.com/office/word/2010/wordprocessingInk" xmlns:wne="http://schemas.microsoft.com/office/word/2006/wordml" xmlns:wps="http://schemas.microsoft.com/office/word/2010/wordprocessingShape" mc:Ignorable="w14 w15 w16se w16cid w16 w16cex w16sdtdh w16sdtfl w16du wp14">
   <w:footnote w:type="separator" w:id="-1">
     <w:p>
       <w:pPr>
@@ -7680,7 +8112,7 @@
 </file>
 
 <file path=word/header1.xml><?xml version="1.0" encoding="utf-8"?>
-<w:hdr xmlns:wpc="http://schemas.microsoft.com/office/word/2010/wordprocessingCanvas" xmlns:cx="http://schemas.microsoft.com/office/drawing/2014/chartex" xmlns:cx1="http://schemas.microsoft.com/office/drawing/2015/9/8/chartex" xmlns:cx2="http://schemas.microsoft.com/office/drawing/2015/10/21/chartex" xmlns:cx3="http://schemas.microsoft.com/office/drawing/2016/5/9/chartex" xmlns:cx4="http://schemas.microsoft.com/office/drawing/2016/5/10/chartex" xmlns:cx5="http://schemas.microsoft.com/office/drawing/2016/5/11/chartex" xmlns:cx6="http://schemas.microsoft.com/office/drawing/2016/5/12/chartex" xmlns:cx7="http://schemas.microsoft.com/office/drawing/2016/5/13/chartex" xmlns:cx8="http://schemas.microsoft.com/office/drawing/2016/5/14/chartex" xmlns:mc="http://schemas.openxmlformats.org/markup-compatibility/2006" xmlns:aink="http://schemas.microsoft.com/office/drawing/2016/ink" xmlns:am3d="http://schemas.microsoft.com/office/drawing/2017/model3d" xmlns:o="urn:schemas-microsoft-com:office:office" xmlns:oel="http://schemas.microsoft.com/office/2019/extlst" xmlns:r="http://schemas.openxmlformats.org/officeDocument/2006/relationships" xmlns:m="http://schemas.openxmlformats.org/officeDocument/2006/math" xmlns:v="urn:schemas-microsoft-com:vml" xmlns:wp14="http://schemas.microsoft.com/office/word/2010/wordprocessingDrawing" xmlns:wp="http://schemas.openxmlformats.org/drawingml/2006/wordprocessingDrawing" xmlns:w10="urn:schemas-microsoft-com:office:word" xmlns:w="http://schemas.openxmlformats.org/wordprocessingml/2006/main" xmlns:w14="http://schemas.microsoft.com/office/word/2010/wordml" xmlns:w15="http://schemas.microsoft.com/office/word/2012/wordml" xmlns:w16cei="http://schemas.microsoft.com/office/word/2026/wordml/cei" xmlns:w16cex="http://schemas.microsoft.com/office/word/2018/wordml/cex" xmlns:w16cid="http://schemas.microsoft.com/office/word/2016/wordml/cid" xmlns:w16="http://schemas.microsoft.com/office/word/2018/wordml" xmlns:w16du="http://schemas.microsoft.com/office/word/2023/wordml/word16du" xmlns:w16sdtdh="http://schemas.microsoft.com/office/word/2020/wordml/sdtdatahash" xmlns:w16sdtfl="http://schemas.microsoft.com/office/word/2024/wordml/sdtformatlock" xmlns:w16se="http://schemas.microsoft.com/office/word/2015/wordml/symex" xmlns:wpg="http://schemas.microsoft.com/office/word/2010/wordprocessingGroup" xmlns:wpi="http://schemas.microsoft.com/office/word/2010/wordprocessingInk" xmlns:wne="http://schemas.microsoft.com/office/word/2006/wordml" xmlns:wps="http://schemas.microsoft.com/office/word/2010/wordprocessingShape" mc:Ignorable="w14 w15 w16se w16cid w16 w16cex w16sdtdh w16sdtfl w16du wp14">
+<w:hdr xmlns:wpc="http://schemas.microsoft.com/office/word/2010/wordprocessingCanvas" xmlns:cx="http://schemas.microsoft.com/office/drawing/2014/chartex" xmlns:cx1="http://schemas.microsoft.com/office/drawing/2015/9/8/chartex" xmlns:cx2="http://schemas.microsoft.com/office/drawing/2015/10/21/chartex" xmlns:cx3="http://schemas.microsoft.com/office/drawing/2016/5/9/chartex" xmlns:cx4="http://schemas.microsoft.com/office/drawing/2016/5/10/chartex" xmlns:cx5="http://schemas.microsoft.com/office/drawing/2016/5/11/chartex" xmlns:cx6="http://schemas.microsoft.com/office/drawing/2016/5/12/chartex" xmlns:cx7="http://schemas.microsoft.com/office/drawing/2016/5/13/chartex" xmlns:cx8="http://schemas.microsoft.com/office/drawing/2016/5/14/chartex" xmlns:mc="http://schemas.openxmlformats.org/markup-compatibility/2006" xmlns:aink="http://schemas.microsoft.com/office/drawing/2016/ink" xmlns:am3d="http://schemas.microsoft.com/office/drawing/2017/model3d" xmlns:o="urn:schemas-microsoft-com:office:office" xmlns:oel="http://schemas.microsoft.com/office/2019/extlst" xmlns:r="http://schemas.openxmlformats.org/officeDocument/2006/relationships" xmlns:m="http://schemas.openxmlformats.org/officeDocument/2006/math" xmlns:v="urn:schemas-microsoft-com:vml" xmlns:wp14="http://schemas.microsoft.com/office/word/2010/wordprocessingDrawing" xmlns:wp="http://schemas.openxmlformats.org/drawingml/2006/wordprocessingDrawing" xmlns:w10="urn:schemas-microsoft-com:office:word" xmlns:w="http://schemas.openxmlformats.org/wordprocessingml/2006/main" xmlns:w14="http://schemas.microsoft.com/office/word/2010/wordml" xmlns:w15="http://schemas.microsoft.com/office/word/2012/wordml" xmlns:w16cex="http://schemas.microsoft.com/office/word/2018/wordml/cex" xmlns:w16cid="http://schemas.microsoft.com/office/word/2016/wordml/cid" xmlns:w16="http://schemas.microsoft.com/office/word/2018/wordml" xmlns:w16du="http://schemas.microsoft.com/office/word/2023/wordml/word16du" xmlns:w16sdtdh="http://schemas.microsoft.com/office/word/2020/wordml/sdtdatahash" xmlns:w16sdtfl="http://schemas.microsoft.com/office/word/2024/wordml/sdtformatlock" xmlns:w16se="http://schemas.microsoft.com/office/word/2015/wordml/symex" xmlns:wpg="http://schemas.microsoft.com/office/word/2010/wordprocessingGroup" xmlns:wpi="http://schemas.microsoft.com/office/word/2010/wordprocessingInk" xmlns:wne="http://schemas.microsoft.com/office/word/2006/wordml" xmlns:wps="http://schemas.microsoft.com/office/word/2010/wordprocessingShape" mc:Ignorable="w14 w15 w16se w16cid w16 w16cex w16sdtdh w16sdtfl w16du wp14">
   <w:p>
     <w:pPr>
       <w:pBdr>
@@ -7703,7 +8135,7 @@
 </file>
 
 <file path=word/header2.xml><?xml version="1.0" encoding="utf-8"?>
-<w:hdr xmlns:wpc="http://schemas.microsoft.com/office/word/2010/wordprocessingCanvas" xmlns:cx="http://schemas.microsoft.com/office/drawing/2014/chartex" xmlns:cx1="http://schemas.microsoft.com/office/drawing/2015/9/8/chartex" xmlns:cx2="http://schemas.microsoft.com/office/drawing/2015/10/21/chartex" xmlns:cx3="http://schemas.microsoft.com/office/drawing/2016/5/9/chartex" xmlns:cx4="http://schemas.microsoft.com/office/drawing/2016/5/10/chartex" xmlns:cx5="http://schemas.microsoft.com/office/drawing/2016/5/11/chartex" xmlns:cx6="http://schemas.microsoft.com/office/drawing/2016/5/12/chartex" xmlns:cx7="http://schemas.microsoft.com/office/drawing/2016/5/13/chartex" xmlns:cx8="http://schemas.microsoft.com/office/drawing/2016/5/14/chartex" xmlns:mc="http://schemas.openxmlformats.org/markup-compatibility/2006" xmlns:aink="http://schemas.microsoft.com/office/drawing/2016/ink" xmlns:am3d="http://schemas.microsoft.com/office/drawing/2017/model3d" xmlns:o="urn:schemas-microsoft-com:office:office" xmlns:oel="http://schemas.microsoft.com/office/2019/extlst" xmlns:r="http://schemas.openxmlformats.org/officeDocument/2006/relationships" xmlns:m="http://schemas.openxmlformats.org/officeDocument/2006/math" xmlns:v="urn:schemas-microsoft-com:vml" xmlns:wp14="http://schemas.microsoft.com/office/word/2010/wordprocessingDrawing" xmlns:wp="http://schemas.openxmlformats.org/drawingml/2006/wordprocessingDrawing" xmlns:w10="urn:schemas-microsoft-com:office:word" xmlns:w="http://schemas.openxmlformats.org/wordprocessingml/2006/main" xmlns:w14="http://schemas.microsoft.com/office/word/2010/wordml" xmlns:w15="http://schemas.microsoft.com/office/word/2012/wordml" xmlns:w16cei="http://schemas.microsoft.com/office/word/2026/wordml/cei" xmlns:w16cex="http://schemas.microsoft.com/office/word/2018/wordml/cex" xmlns:w16cid="http://schemas.microsoft.com/office/word/2016/wordml/cid" xmlns:w16="http://schemas.microsoft.com/office/word/2018/wordml" xmlns:w16du="http://schemas.microsoft.com/office/word/2023/wordml/word16du" xmlns:w16sdtdh="http://schemas.microsoft.com/office/word/2020/wordml/sdtdatahash" xmlns:w16sdtfl="http://schemas.microsoft.com/office/word/2024/wordml/sdtformatlock" xmlns:w16se="http://schemas.microsoft.com/office/word/2015/wordml/symex" xmlns:wpg="http://schemas.microsoft.com/office/word/2010/wordprocessingGroup" xmlns:wpi="http://schemas.microsoft.com/office/word/2010/wordprocessingInk" xmlns:wne="http://schemas.microsoft.com/office/word/2006/wordml" xmlns:wps="http://schemas.microsoft.com/office/word/2010/wordprocessingShape" mc:Ignorable="w14 w15 w16se w16cid w16 w16cex w16sdtdh w16sdtfl w16du wp14">
+<w:hdr xmlns:wpc="http://schemas.microsoft.com/office/word/2010/wordprocessingCanvas" xmlns:cx="http://schemas.microsoft.com/office/drawing/2014/chartex" xmlns:cx1="http://schemas.microsoft.com/office/drawing/2015/9/8/chartex" xmlns:cx2="http://schemas.microsoft.com/office/drawing/2015/10/21/chartex" xmlns:cx3="http://schemas.microsoft.com/office/drawing/2016/5/9/chartex" xmlns:cx4="http://schemas.microsoft.com/office/drawing/2016/5/10/chartex" xmlns:cx5="http://schemas.microsoft.com/office/drawing/2016/5/11/chartex" xmlns:cx6="http://schemas.microsoft.com/office/drawing/2016/5/12/chartex" xmlns:cx7="http://schemas.microsoft.com/office/drawing/2016/5/13/chartex" xmlns:cx8="http://schemas.microsoft.com/office/drawing/2016/5/14/chartex" xmlns:mc="http://schemas.openxmlformats.org/markup-compatibility/2006" xmlns:aink="http://schemas.microsoft.com/office/drawing/2016/ink" xmlns:am3d="http://schemas.microsoft.com/office/drawing/2017/model3d" xmlns:o="urn:schemas-microsoft-com:office:office" xmlns:oel="http://schemas.microsoft.com/office/2019/extlst" xmlns:r="http://schemas.openxmlformats.org/officeDocument/2006/relationships" xmlns:m="http://schemas.openxmlformats.org/officeDocument/2006/math" xmlns:v="urn:schemas-microsoft-com:vml" xmlns:wp14="http://schemas.microsoft.com/office/word/2010/wordprocessingDrawing" xmlns:wp="http://schemas.openxmlformats.org/drawingml/2006/wordprocessingDrawing" xmlns:w10="urn:schemas-microsoft-com:office:word" xmlns:w="http://schemas.openxmlformats.org/wordprocessingml/2006/main" xmlns:w14="http://schemas.microsoft.com/office/word/2010/wordml" xmlns:w15="http://schemas.microsoft.com/office/word/2012/wordml" xmlns:w16cex="http://schemas.microsoft.com/office/word/2018/wordml/cex" xmlns:w16cid="http://schemas.microsoft.com/office/word/2016/wordml/cid" xmlns:w16="http://schemas.microsoft.com/office/word/2018/wordml" xmlns:w16du="http://schemas.microsoft.com/office/word/2023/wordml/word16du" xmlns:w16sdtdh="http://schemas.microsoft.com/office/word/2020/wordml/sdtdatahash" xmlns:w16sdtfl="http://schemas.microsoft.com/office/word/2024/wordml/sdtformatlock" xmlns:w16se="http://schemas.microsoft.com/office/word/2015/wordml/symex" xmlns:wpg="http://schemas.microsoft.com/office/word/2010/wordprocessingGroup" xmlns:wpi="http://schemas.microsoft.com/office/word/2010/wordprocessingInk" xmlns:wne="http://schemas.microsoft.com/office/word/2006/wordml" xmlns:wps="http://schemas.microsoft.com/office/word/2010/wordprocessingShape" mc:Ignorable="w14 w15 w16se w16cid w16 w16cex w16sdtdh w16sdtfl w16du wp14">
   <w:p>
     <w:pPr>
       <w:pBdr>
@@ -7740,7 +8172,7 @@
 </file>
 
 <file path=word/header3.xml><?xml version="1.0" encoding="utf-8"?>
-<w:hdr xmlns:wpc="http://schemas.microsoft.com/office/word/2010/wordprocessingCanvas" xmlns:cx="http://schemas.microsoft.com/office/drawing/2014/chartex" xmlns:cx1="http://schemas.microsoft.com/office/drawing/2015/9/8/chartex" xmlns:cx2="http://schemas.microsoft.com/office/drawing/2015/10/21/chartex" xmlns:cx3="http://schemas.microsoft.com/office/drawing/2016/5/9/chartex" xmlns:cx4="http://schemas.microsoft.com/office/drawing/2016/5/10/chartex" xmlns:cx5="http://schemas.microsoft.com/office/drawing/2016/5/11/chartex" xmlns:cx6="http://schemas.microsoft.com/office/drawing/2016/5/12/chartex" xmlns:cx7="http://schemas.microsoft.com/office/drawing/2016/5/13/chartex" xmlns:cx8="http://schemas.microsoft.com/office/drawing/2016/5/14/chartex" xmlns:mc="http://schemas.openxmlformats.org/markup-compatibility/2006" xmlns:aink="http://schemas.microsoft.com/office/drawing/2016/ink" xmlns:am3d="http://schemas.microsoft.com/office/drawing/2017/model3d" xmlns:o="urn:schemas-microsoft-com:office:office" xmlns:oel="http://schemas.microsoft.com/office/2019/extlst" xmlns:r="http://schemas.openxmlformats.org/officeDocument/2006/relationships" xmlns:m="http://schemas.openxmlformats.org/officeDocument/2006/math" xmlns:v="urn:schemas-microsoft-com:vml" xmlns:wp14="http://schemas.microsoft.com/office/word/2010/wordprocessingDrawing" xmlns:wp="http://schemas.openxmlformats.org/drawingml/2006/wordprocessingDrawing" xmlns:w10="urn:schemas-microsoft-com:office:word" xmlns:w="http://schemas.openxmlformats.org/wordprocessingml/2006/main" xmlns:w14="http://schemas.microsoft.com/office/word/2010/wordml" xmlns:w15="http://schemas.microsoft.com/office/word/2012/wordml" xmlns:w16cei="http://schemas.microsoft.com/office/word/2026/wordml/cei" xmlns:w16cex="http://schemas.microsoft.com/office/word/2018/wordml/cex" xmlns:w16cid="http://schemas.microsoft.com/office/word/2016/wordml/cid" xmlns:w16="http://schemas.microsoft.com/office/word/2018/wordml" xmlns:w16du="http://schemas.microsoft.com/office/word/2023/wordml/word16du" xmlns:w16sdtdh="http://schemas.microsoft.com/office/word/2020/wordml/sdtdatahash" xmlns:w16sdtfl="http://schemas.microsoft.com/office/word/2024/wordml/sdtformatlock" xmlns:w16se="http://schemas.microsoft.com/office/word/2015/wordml/symex" xmlns:wpg="http://schemas.microsoft.com/office/word/2010/wordprocessingGroup" xmlns:wpi="http://schemas.microsoft.com/office/word/2010/wordprocessingInk" xmlns:wne="http://schemas.microsoft.com/office/word/2006/wordml" xmlns:wps="http://schemas.microsoft.com/office/word/2010/wordprocessingShape" mc:Ignorable="w14 w15 w16se w16cid w16 w16cex w16sdtdh w16sdtfl w16du wp14">
+<w:hdr xmlns:wpc="http://schemas.microsoft.com/office/word/2010/wordprocessingCanvas" xmlns:cx="http://schemas.microsoft.com/office/drawing/2014/chartex" xmlns:cx1="http://schemas.microsoft.com/office/drawing/2015/9/8/chartex" xmlns:cx2="http://schemas.microsoft.com/office/drawing/2015/10/21/chartex" xmlns:cx3="http://schemas.microsoft.com/office/drawing/2016/5/9/chartex" xmlns:cx4="http://schemas.microsoft.com/office/drawing/2016/5/10/chartex" xmlns:cx5="http://schemas.microsoft.com/office/drawing/2016/5/11/chartex" xmlns:cx6="http://schemas.microsoft.com/office/drawing/2016/5/12/chartex" xmlns:cx7="http://schemas.microsoft.com/office/drawing/2016/5/13/chartex" xmlns:cx8="http://schemas.microsoft.com/office/drawing/2016/5/14/chartex" xmlns:mc="http://schemas.openxmlformats.org/markup-compatibility/2006" xmlns:aink="http://schemas.microsoft.com/office/drawing/2016/ink" xmlns:am3d="http://schemas.microsoft.com/office/drawing/2017/model3d" xmlns:o="urn:schemas-microsoft-com:office:office" xmlns:oel="http://schemas.microsoft.com/office/2019/extlst" xmlns:r="http://schemas.openxmlformats.org/officeDocument/2006/relationships" xmlns:m="http://schemas.openxmlformats.org/officeDocument/2006/math" xmlns:v="urn:schemas-microsoft-com:vml" xmlns:wp14="http://schemas.microsoft.com/office/word/2010/wordprocessingDrawing" xmlns:wp="http://schemas.openxmlformats.org/drawingml/2006/wordprocessingDrawing" xmlns:w10="urn:schemas-microsoft-com:office:word" xmlns:w="http://schemas.openxmlformats.org/wordprocessingml/2006/main" xmlns:w14="http://schemas.microsoft.com/office/word/2010/wordml" xmlns:w15="http://schemas.microsoft.com/office/word/2012/wordml" xmlns:w16cex="http://schemas.microsoft.com/office/word/2018/wordml/cex" xmlns:w16cid="http://schemas.microsoft.com/office/word/2016/wordml/cid" xmlns:w16="http://schemas.microsoft.com/office/word/2018/wordml" xmlns:w16du="http://schemas.microsoft.com/office/word/2023/wordml/word16du" xmlns:w16sdtdh="http://schemas.microsoft.com/office/word/2020/wordml/sdtdatahash" xmlns:w16sdtfl="http://schemas.microsoft.com/office/word/2024/wordml/sdtformatlock" xmlns:w16se="http://schemas.microsoft.com/office/word/2015/wordml/symex" xmlns:wpg="http://schemas.microsoft.com/office/word/2010/wordprocessingGroup" xmlns:wpi="http://schemas.microsoft.com/office/word/2010/wordprocessingInk" xmlns:wne="http://schemas.microsoft.com/office/word/2006/wordml" xmlns:wps="http://schemas.microsoft.com/office/word/2010/wordprocessingShape" mc:Ignorable="w14 w15 w16se w16cid w16 w16cex w16sdtdh w16sdtfl w16du wp14">
   <w:p>
     <w:pPr>
       <w:pBdr>
@@ -7763,7 +8195,7 @@
 </file>
 
 <file path=word/numbering.xml><?xml version="1.0" encoding="utf-8"?>
-<w:numbering xmlns:wpc="http://schemas.microsoft.com/office/word/2010/wordprocessingCanvas" xmlns:cx="http://schemas.microsoft.com/office/drawing/2014/chartex" xmlns:cx1="http://schemas.microsoft.com/office/drawing/2015/9/8/chartex" xmlns:cx2="http://schemas.microsoft.com/office/drawing/2015/10/21/chartex" xmlns:cx3="http://schemas.microsoft.com/office/drawing/2016/5/9/chartex" xmlns:cx4="http://schemas.microsoft.com/office/drawing/2016/5/10/chartex" xmlns:cx5="http://schemas.microsoft.com/office/drawing/2016/5/11/chartex" xmlns:cx6="http://schemas.microsoft.com/office/drawing/2016/5/12/chartex" xmlns:cx7="http://schemas.microsoft.com/office/drawing/2016/5/13/chartex" xmlns:cx8="http://schemas.microsoft.com/office/drawing/2016/5/14/chartex" xmlns:mc="http://schemas.openxmlformats.org/markup-compatibility/2006" xmlns:aink="http://schemas.microsoft.com/office/drawing/2016/ink" xmlns:am3d="http://schemas.microsoft.com/office/drawing/2017/model3d" xmlns:o="urn:schemas-microsoft-com:office:office" xmlns:oel="http://schemas.microsoft.com/office/2019/extlst" xmlns:r="http://schemas.openxmlformats.org/officeDocument/2006/relationships" xmlns:m="http://schemas.openxmlformats.org/officeDocument/2006/math" xmlns:v="urn:schemas-microsoft-com:vml" xmlns:wp14="http://schemas.microsoft.com/office/word/2010/wordprocessingDrawing" xmlns:wp="http://schemas.openxmlformats.org/drawingml/2006/wordprocessingDrawing" xmlns:w10="urn:schemas-microsoft-com:office:word" xmlns:w="http://schemas.openxmlformats.org/wordprocessingml/2006/main" xmlns:w14="http://schemas.microsoft.com/office/word/2010/wordml" xmlns:w15="http://schemas.microsoft.com/office/word/2012/wordml" xmlns:w16cei="http://schemas.microsoft.com/office/word/2026/wordml/cei" xmlns:w16cex="http://schemas.microsoft.com/office/word/2018/wordml/cex" xmlns:w16cid="http://schemas.microsoft.com/office/word/2016/wordml/cid" xmlns:w16="http://schemas.microsoft.com/office/word/2018/wordml" xmlns:w16du="http://schemas.microsoft.com/office/word/2023/wordml/word16du" xmlns:w16sdtdh="http://schemas.microsoft.com/office/word/2020/wordml/sdtdatahash" xmlns:w16sdtfl="http://schemas.microsoft.com/office/word/2024/wordml/sdtformatlock" xmlns:w16se="http://schemas.microsoft.com/office/word/2015/wordml/symex" xmlns:wpg="http://schemas.microsoft.com/office/word/2010/wordprocessingGroup" xmlns:wpi="http://schemas.microsoft.com/office/word/2010/wordprocessingInk" xmlns:wne="http://schemas.microsoft.com/office/word/2006/wordml" xmlns:wps="http://schemas.microsoft.com/office/word/2010/wordprocessingShape" mc:Ignorable="w14 w15 w16se w16cid w16 w16cex w16sdtdh w16sdtfl w16du wp14">
+<w:numbering xmlns:wpc="http://schemas.microsoft.com/office/word/2010/wordprocessingCanvas" xmlns:cx="http://schemas.microsoft.com/office/drawing/2014/chartex" xmlns:cx1="http://schemas.microsoft.com/office/drawing/2015/9/8/chartex" xmlns:cx2="http://schemas.microsoft.com/office/drawing/2015/10/21/chartex" xmlns:cx3="http://schemas.microsoft.com/office/drawing/2016/5/9/chartex" xmlns:cx4="http://schemas.microsoft.com/office/drawing/2016/5/10/chartex" xmlns:cx5="http://schemas.microsoft.com/office/drawing/2016/5/11/chartex" xmlns:cx6="http://schemas.microsoft.com/office/drawing/2016/5/12/chartex" xmlns:cx7="http://schemas.microsoft.com/office/drawing/2016/5/13/chartex" xmlns:cx8="http://schemas.microsoft.com/office/drawing/2016/5/14/chartex" xmlns:mc="http://schemas.openxmlformats.org/markup-compatibility/2006" xmlns:aink="http://schemas.microsoft.com/office/drawing/2016/ink" xmlns:am3d="http://schemas.microsoft.com/office/drawing/2017/model3d" xmlns:o="urn:schemas-microsoft-com:office:office" xmlns:oel="http://schemas.microsoft.com/office/2019/extlst" xmlns:r="http://schemas.openxmlformats.org/officeDocument/2006/relationships" xmlns:m="http://schemas.openxmlformats.org/officeDocument/2006/math" xmlns:v="urn:schemas-microsoft-com:vml" xmlns:wp14="http://schemas.microsoft.com/office/word/2010/wordprocessingDrawing" xmlns:wp="http://schemas.openxmlformats.org/drawingml/2006/wordprocessingDrawing" xmlns:w10="urn:schemas-microsoft-com:office:word" xmlns:w="http://schemas.openxmlformats.org/wordprocessingml/2006/main" xmlns:w14="http://schemas.microsoft.com/office/word/2010/wordml" xmlns:w15="http://schemas.microsoft.com/office/word/2012/wordml" xmlns:w16cex="http://schemas.microsoft.com/office/word/2018/wordml/cex" xmlns:w16cid="http://schemas.microsoft.com/office/word/2016/wordml/cid" xmlns:w16="http://schemas.microsoft.com/office/word/2018/wordml" xmlns:w16du="http://schemas.microsoft.com/office/word/2023/wordml/word16du" xmlns:w16sdtdh="http://schemas.microsoft.com/office/word/2020/wordml/sdtdatahash" xmlns:w16sdtfl="http://schemas.microsoft.com/office/word/2024/wordml/sdtformatlock" xmlns:w16se="http://schemas.microsoft.com/office/word/2015/wordml/symex" xmlns:wpg="http://schemas.microsoft.com/office/word/2010/wordprocessingGroup" xmlns:wpi="http://schemas.microsoft.com/office/word/2010/wordprocessingInk" xmlns:wne="http://schemas.microsoft.com/office/word/2006/wordml" xmlns:wps="http://schemas.microsoft.com/office/word/2010/wordprocessingShape" mc:Ignorable="w14 w15 w16se w16cid w16 w16cex w16sdtdh w16sdtfl w16du wp14">
   <w:abstractNum w:abstractNumId="0" w15:restartNumberingAfterBreak="0">
     <w:nsid w:val="03F215B7"/>
     <w:multiLevelType w:val="multilevel"/>
@@ -11464,28 +11896,28 @@
 </file>
 
 <file path=customXml/item1.xml><?xml version="1.0" encoding="utf-8"?>
-<b:Sources xmlns:b="http://schemas.openxmlformats.org/officeDocument/2006/bibliography" xmlns="http://schemas.openxmlformats.org/officeDocument/2006/bibliography" SelectedStyle="\APASixthEditionOfficeOnline.xsl" StyleName="APA" Version="6"/>
-</file>
-
-<file path=customXml/item2.xml><?xml version="1.0" encoding="utf-8"?>
 <go:gDocsCustomXmlDataStorage xmlns:go="http://customooxmlschemas.google.com/" xmlns:r="http://schemas.openxmlformats.org/officeDocument/2006/relationships" uri="GoogleDocsCustomDataVersion2">
   <go:docsCustomData xmlns:go="http://customooxmlschemas.google.com/" roundtripDataSignature="AMtx7micRMcumK0WNl2WwJGgDlCf2P0pZg==">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</go:docsCustomData>
 </go:gDocsCustomXmlDataStorage>
 </file>
 
-<file path=customXml/itemProps1.xml><?xml version="1.0" encoding="utf-8"?>
-<ds:datastoreItem xmlns:ds="http://schemas.openxmlformats.org/officeDocument/2006/customXml" ds:itemID="{9319AD63-CBA6-497F-A07B-DAFEC8FA0A37}">
-  <ds:schemaRefs>
-    <ds:schemaRef ds:uri="http://schemas.openxmlformats.org/officeDocument/2006/bibliography"/>
-  </ds:schemaRefs>
-</ds:datastoreItem>
+<file path=customXml/item2.xml><?xml version="1.0" encoding="utf-8"?>
+<b:Sources xmlns:b="http://schemas.openxmlformats.org/officeDocument/2006/bibliography" xmlns="http://schemas.openxmlformats.org/officeDocument/2006/bibliography" SelectedStyle="\APASixthEditionOfficeOnline.xsl" StyleName="APA" Version="6"/>
 </file>
 
-<file path=customXml/itemProps2.xml><?xml version="1.0" encoding="utf-8"?>
+<file path=customXml/itemProps1.xml><?xml version="1.0" encoding="utf-8"?>
 <ds:datastoreItem xmlns:ds="http://schemas.openxmlformats.org/officeDocument/2006/customXml" ds:itemID="{11111111-1234-1234-1234-123412341234}">
   <ds:schemaRefs>
     <ds:schemaRef ds:uri="http://customooxmlschemas.google.com/"/>
     <ds:schemaRef ds:uri="http://schemas.openxmlformats.org/officeDocument/2006/relationships"/>
   </ds:schemaRefs>
 </ds:datastoreItem>
+</file>
+
+<file path=customXml/itemProps2.xml><?xml version="1.0" encoding="utf-8"?>
+<ds:datastoreItem xmlns:ds="http://schemas.openxmlformats.org/officeDocument/2006/customXml" ds:itemID="{9319AD63-CBA6-497F-A07B-DAFEC8FA0A37}">
+  <ds:schemaRefs>
+    <ds:schemaRef ds:uri="http://schemas.openxmlformats.org/officeDocument/2006/bibliography"/>
+  </ds:schemaRefs>
+</ds:datastoreItem>
 </file>
</xml_diff>